<commit_message>
Correct dedup (Latin names in Chinese records, short titles, T6): 2,555 -> 2,550 unique; redraw calibration set; update guide, protocol and amendment draft
Co-Authored-By: Claude Sonnet 5.5 <noreply@anthropic.com>
Claude-Session: https://claude.ai/code/session_01FRD7etKqYN8v2bbXeeLMRW
</commit_message>
<xml_diff>
--- a/Screening guide - title and abstract (draft).docx
+++ b/Screening guide - title and abstract (draft).docx
@@ -89,13 +89,13 @@
           <w:b/>
           <w:bCs/>
         </w:rPr>
-        <w:t xml:space="preserve">2,555 条</w:t>
-      </w:r>
-      <w:r>
-        <w:rPr>
-          <w:rFonts w:ascii="Calibri" w:cs="Calibri" w:eastAsia="Microsoft YaHei" w:hAnsi="Calibri"/>
-        </w:rPr>
-        <w:t xml:space="preserve">，UTF-8，每条有唯一编号 WS0001–WS2555；备注（N1）里写着它来自哪些数据库。</w:t>
+        <w:t xml:space="preserve">2,550 条</w:t>
+      </w:r>
+      <w:r>
+        <w:rPr>
+          <w:rFonts w:ascii="Calibri" w:cs="Calibri" w:eastAsia="Microsoft YaHei" w:hAnsi="Calibri"/>
+        </w:rPr>
+        <w:t xml:space="preserve">，UTF-8，每条有唯一编号 WS0001–WS2550；备注（N1）里写着它来自哪些数据库。</w:t>
       </w:r>
     </w:p>
     <w:p>
@@ -111,7 +111,7 @@
         <w:rPr>
           <w:rFonts w:ascii="Calibri" w:cs="Calibri" w:eastAsia="Microsoft YaHei" w:hAnsi="Calibri"/>
         </w:rPr>
-        <w:t xml:space="preserve">其中 633 条没有摘要，721 条是中文记录；类型：期刊文章 2,437、专利 50、通用类型 21、书籍章节 20、会议 14、学位论文 10、报纸 3。年份 1880s–2026，近四十年约 2,000 条。</w:t>
+        <w:t xml:space="preserve">其中 628 条没有摘要，716 条是中文记录；类型：期刊文章 2,432、专利 50、通用类型 21、书籍章节 20、会议 14、学位论文 10、报纸 3。年份 1880s–2026，1990 年以来约 1,980 条。</w:t>
       </w:r>
     </w:p>
     <w:p>
@@ -141,7 +141,7 @@
         <w:rPr>
           <w:rFonts w:ascii="Calibri" w:cs="Calibri" w:eastAsia="Microsoft YaHei" w:hAnsi="Calibri"/>
         </w:rPr>
-        <w:t xml:space="preserve">）：标题或摘要含游走脾类词的约 1,497 条，含脾扭转类词的约 595 条，含儿童类词的约 1,150 条；含脾种植约 119、副脾约 245、妊娠约 102、动物或兽医约 251 条。</w:t>
+        <w:t xml:space="preserve">）：标题或摘要含游走脾类词的约 1,494 条，含脾扭转类词的约 594 条，含儿童类词的约 1,148 条；含脾种植约 119、副脾约 245、妊娠约 102、动物或兽医约 251 条。</w:t>
       </w:r>
     </w:p>
     <w:p>
@@ -238,7 +238,7 @@
         <w:rPr>
           <w:rFonts w:ascii="Calibri" w:cs="Calibri" w:eastAsia="Microsoft YaHei" w:hAnsi="Calibri"/>
         </w:rPr>
-        <w:t xml:space="preserve">（从 2,555 条中简单随机抽取 50 条，随机种子 20261004，编号清单见 </w:t>
+        <w:t xml:space="preserve">（从 2,550 条中简单随机抽取 50 条，随机种子 20261004，编号清单见 </w:t>
       </w:r>
       <w:r>
         <w:rPr>
@@ -317,7 +317,7 @@
         <w:rPr>
           <w:rFonts w:ascii="Calibri" w:cs="Calibri" w:eastAsia="Microsoft YaHei" w:hAnsi="Calibri"/>
         </w:rPr>
-        <w:t xml:space="preserve">校准结束后，再把全部 2,555 条导入正式项目。校准用的这 50 条在正式筛选里照样重筛一遍。</w:t>
+        <w:t xml:space="preserve">校准结束后，再把全部 2,550 条导入正式项目。校准用的这 50 条在正式筛选里照样重筛一遍。</w:t>
       </w:r>
     </w:p>
     <w:p>
@@ -2516,7 +2516,7 @@
                 <w:sz w:val="20"/>
                 <w:szCs w:val="20"/>
               </w:rPr>
-              <w:t xml:space="preserve">没有摘要（633 条）</w:t>
+              <w:t xml:space="preserve">没有摘要（628 条）</w:t>
             </w:r>
           </w:p>
         </w:tc>
@@ -3983,7 +3983,7 @@
         <w:rPr>
           <w:rFonts w:ascii="Calibri" w:cs="Calibri" w:eastAsia="Microsoft YaHei" w:hAnsi="Calibri"/>
         </w:rPr>
-        <w:t xml:space="preserve">导入 Rayyan 的记录数：2,555。</w:t>
+        <w:t xml:space="preserve">导入 Rayyan 的记录数：2,550。</w:t>
       </w:r>
     </w:p>
     <w:p>
@@ -4111,7 +4111,7 @@
         <w:rPr>
           <w:rFonts w:ascii="Calibri" w:cs="Calibri" w:eastAsia="Microsoft YaHei" w:hAnsi="Calibri"/>
         </w:rPr>
-        <w:t xml:space="preserve">与第一轮去重的衔接：4,906 条识别，去重后 2,555 条（EndNote 核对待做）。</w:t>
+        <w:t xml:space="preserve">与第一轮去重的衔接：4,906 条识别，去重后 2,550 条（EndNote 核对待做）。</w:t>
       </w:r>
     </w:p>
     <w:p>
@@ -4139,7 +4139,7 @@
         <w:rPr>
           <w:rFonts w:ascii="Calibri" w:cs="Calibri" w:eastAsia="Microsoft YaHei" w:hAnsi="Calibri"/>
         </w:rPr>
-        <w:t xml:space="preserve">脚本去重看不到的重复（比如中文记录与无 DOI 的英文记录）会留在 2,555 条里，请在筛选时发现就标为重复。</w:t>
+        <w:t xml:space="preserve">脚本去重看不到的重复（比如中文记录与无 DOI 的英文记录）会留在 2,550 条里，请在筛选时发现就标为重复。</w:t>
       </w:r>
     </w:p>
     <w:p>

</xml_diff>

<commit_message>
EndNote check passed; add tier T7 (author-name variants): 2,550 -> 2,548 unique; redraw calibration set; update guide, protocol, amendment draft
Co-Authored-By: Claude Sonnet 5.5 <noreply@anthropic.com>
Claude-Session: https://claude.ai/code/session_01FRD7etKqYN8v2bbXeeLMRW
</commit_message>
<xml_diff>
--- a/Screening guide - title and abstract (draft).docx
+++ b/Screening guide - title and abstract (draft).docx
@@ -89,13 +89,13 @@
           <w:b/>
           <w:bCs/>
         </w:rPr>
-        <w:t xml:space="preserve">2,550 条</w:t>
-      </w:r>
-      <w:r>
-        <w:rPr>
-          <w:rFonts w:ascii="Calibri" w:cs="Calibri" w:eastAsia="Microsoft YaHei" w:hAnsi="Calibri"/>
-        </w:rPr>
-        <w:t xml:space="preserve">，UTF-8，每条有唯一编号 WS0001–WS2550；备注（N1）里写着它来自哪些数据库。</w:t>
+        <w:t xml:space="preserve">2,548 条</w:t>
+      </w:r>
+      <w:r>
+        <w:rPr>
+          <w:rFonts w:ascii="Calibri" w:cs="Calibri" w:eastAsia="Microsoft YaHei" w:hAnsi="Calibri"/>
+        </w:rPr>
+        <w:t xml:space="preserve">，UTF-8，每条有唯一编号 WS0001–WS2548；备注（N1）里写着它来自哪些数据库。</w:t>
       </w:r>
     </w:p>
     <w:p>
@@ -111,7 +111,7 @@
         <w:rPr>
           <w:rFonts w:ascii="Calibri" w:cs="Calibri" w:eastAsia="Microsoft YaHei" w:hAnsi="Calibri"/>
         </w:rPr>
-        <w:t xml:space="preserve">其中 628 条没有摘要，716 条是中文记录；类型：期刊文章 2,432、专利 50、通用类型 21、书籍章节 20、会议 14、学位论文 10、报纸 3。年份 1880s–2026，1990 年以来约 1,980 条。</w:t>
+        <w:t xml:space="preserve">其中 628 条没有摘要，716 条是中文记录；类型：期刊文章 2,430、专利 50、通用类型 21、书籍章节 20、会议 14、学位论文 10、报纸 3。年份 1880s–2026，1990 年以来约 1,980 条。</w:t>
       </w:r>
     </w:p>
     <w:p>
@@ -141,7 +141,7 @@
         <w:rPr>
           <w:rFonts w:ascii="Calibri" w:cs="Calibri" w:eastAsia="Microsoft YaHei" w:hAnsi="Calibri"/>
         </w:rPr>
-        <w:t xml:space="preserve">）：标题或摘要含游走脾类词的约 1,494 条，含脾扭转类词的约 594 条，含儿童类词的约 1,148 条；含脾种植约 119、副脾约 245、妊娠约 102、动物或兽医约 251 条。</w:t>
+        <w:t xml:space="preserve">）：标题或摘要含游走脾类词的约 1,493 条，含脾扭转类词的约 592 条，含儿童类词的约 1,147 条；含脾种植约 119、副脾约 245、妊娠约 102、动物或兽医约 251 条。</w:t>
       </w:r>
     </w:p>
     <w:p>
@@ -238,7 +238,7 @@
         <w:rPr>
           <w:rFonts w:ascii="Calibri" w:cs="Calibri" w:eastAsia="Microsoft YaHei" w:hAnsi="Calibri"/>
         </w:rPr>
-        <w:t xml:space="preserve">（从 2,550 条中简单随机抽取 50 条，随机种子 20261004，编号清单见 </w:t>
+        <w:t xml:space="preserve">（从 2,548 条中简单随机抽取 50 条，随机种子 20261004，编号清单见 </w:t>
       </w:r>
       <w:r>
         <w:rPr>
@@ -317,7 +317,7 @@
         <w:rPr>
           <w:rFonts w:ascii="Calibri" w:cs="Calibri" w:eastAsia="Microsoft YaHei" w:hAnsi="Calibri"/>
         </w:rPr>
-        <w:t xml:space="preserve">校准结束后，再把全部 2,550 条导入正式项目。校准用的这 50 条在正式筛选里照样重筛一遍。</w:t>
+        <w:t xml:space="preserve">校准结束后，再把全部 2,548 条导入正式项目。校准用的这 50 条在正式筛选里照样重筛一遍。</w:t>
       </w:r>
     </w:p>
     <w:p>
@@ -3983,7 +3983,7 @@
         <w:rPr>
           <w:rFonts w:ascii="Calibri" w:cs="Calibri" w:eastAsia="Microsoft YaHei" w:hAnsi="Calibri"/>
         </w:rPr>
-        <w:t xml:space="preserve">导入 Rayyan 的记录数：2,550。</w:t>
+        <w:t xml:space="preserve">导入 Rayyan 的记录数：2,548。</w:t>
       </w:r>
     </w:p>
     <w:p>
@@ -4111,7 +4111,7 @@
         <w:rPr>
           <w:rFonts w:ascii="Calibri" w:cs="Calibri" w:eastAsia="Microsoft YaHei" w:hAnsi="Calibri"/>
         </w:rPr>
-        <w:t xml:space="preserve">与第一轮去重的衔接：4,906 条识别，去重后 2,550 条（EndNote 核对待做）。</w:t>
+        <w:t xml:space="preserve">与第一轮去重的衔接：4,906 条识别，去重后 2,548 条（EndNote 核对待做）。</w:t>
       </w:r>
     </w:p>
     <w:p>
@@ -4139,7 +4139,7 @@
         <w:rPr>
           <w:rFonts w:ascii="Calibri" w:cs="Calibri" w:eastAsia="Microsoft YaHei" w:hAnsi="Calibri"/>
         </w:rPr>
-        <w:t xml:space="preserve">脚本去重看不到的重复（比如中文记录与无 DOI 的英文记录）会留在 2,550 条里，请在筛选时发现就标为重复。</w:t>
+        <w:t xml:space="preserve">脚本去重看不到的重复（比如中文记录与无 DOI 的英文记录）会留在 2,548 条里，请在筛选时发现就标为重复。</w:t>
       </w:r>
     </w:p>
     <w:p>

</xml_diff>

<commit_message>
Screening guide: Rayyan labels and exclusion reasons are created on the fly; give exact names
Co-Authored-By: Claude Sonnet 5.5 <noreply@anthropic.com>
Claude-Session: https://claude.ai/code/session_01FRD7etKqYN8v2bbXeeLMRW
</commit_message>
<xml_diff>
--- a/Screening guide - title and abstract (draft).docx
+++ b/Screening guide - title and abstract (draft).docx
@@ -437,7 +437,49 @@
         <w:rPr>
           <w:rFonts w:ascii="Calibri" w:cs="Calibri" w:eastAsia="Microsoft YaHei" w:hAnsi="Calibri"/>
         </w:rPr>
-        <w:t xml:space="preserve">之一（在 Rayyan 里先建好这些标签，两人用同一套）。</w:t>
+        <w:t xml:space="preserve">之一。Rayyan 没有预先设置的步骤：排除理由和标签都是在筛选时、打开一条记录后点决定栏里的 </w:t>
+      </w:r>
+      <w:r>
+        <w:rPr>
+          <w:rFonts w:ascii="Calibri" w:cs="Calibri" w:eastAsia="Microsoft YaHei" w:hAnsi="Calibri"/>
+          <w:b/>
+          <w:bCs/>
+        </w:rPr>
+        <w:t xml:space="preserve">Reason</w:t>
+      </w:r>
+      <w:r>
+        <w:rPr>
+          <w:rFonts w:ascii="Calibri" w:cs="Calibri" w:eastAsia="Microsoft YaHei" w:hAnsi="Calibri"/>
+        </w:rPr>
+        <w:t xml:space="preserve"> 或 </w:t>
+      </w:r>
+      <w:r>
+        <w:rPr>
+          <w:rFonts w:ascii="Calibri" w:cs="Calibri" w:eastAsia="Microsoft YaHei" w:hAnsi="Calibri"/>
+          <w:b/>
+          <w:bCs/>
+        </w:rPr>
+        <w:t xml:space="preserve">Label</w:t>
+      </w:r>
+      <w:r>
+        <w:rPr>
+          <w:rFonts w:ascii="Calibri" w:cs="Calibri" w:eastAsia="Microsoft YaHei" w:hAnsi="Calibri"/>
+        </w:rPr>
+        <w:t xml:space="preserve">，输入名称并应用，之后就保存在项目的列表里。</w:t>
+      </w:r>
+      <w:r>
+        <w:rPr>
+          <w:rFonts w:ascii="Calibri" w:cs="Calibri" w:eastAsia="Microsoft YaHei" w:hAnsi="Calibri"/>
+          <w:b/>
+          <w:bCs/>
+        </w:rPr>
+        <w:t xml:space="preserve">第一个创建的人按下面的名称一字不差地输入，另一位从列表里选，不要自己再打一遍</w:t>
+      </w:r>
+      <w:r>
+        <w:rPr>
+          <w:rFonts w:ascii="Calibri" w:cs="Calibri" w:eastAsia="Microsoft YaHei" w:hAnsi="Calibri"/>
+        </w:rPr>
+        <w:t xml:space="preserve">（据 Rayyan 帮助中心搜索结果的说明；帮助页本身在我们的环境里打不开，细节以校准时的实际界面为准）。</w:t>
       </w:r>
     </w:p>
     <w:p>
@@ -453,7 +495,7 @@
         <w:rPr>
           <w:rFonts w:ascii="Calibri" w:cs="Calibri" w:eastAsia="Microsoft YaHei" w:hAnsi="Calibri"/>
         </w:rPr>
-        <w:t xml:space="preserve">建议额外建两个标签：</w:t>
+        <w:t xml:space="preserve">建议额外使用两个标签：</w:t>
       </w:r>
     </w:p>
     <w:p>
@@ -2853,7 +2895,7 @@
         <w:rPr>
           <w:rFonts w:ascii="Calibri" w:cs="Calibri" w:eastAsia="Microsoft YaHei" w:hAnsi="Calibri"/>
         </w:rPr>
-        <w:t xml:space="preserve">5. 固定排除理由（Rayyan 里建好，两人统一使用）</w:t>
+        <w:t xml:space="preserve">5. 固定排除理由（两人统一使用，名称一字不差）</w:t>
       </w:r>
     </w:p>
     <w:tbl>
@@ -3504,6 +3546,194 @@
       <w:r>
         <w:rPr>
           <w:rFonts w:ascii="Calibri" w:cs="Calibri" w:eastAsia="Microsoft YaHei" w:hAnsi="Calibri"/>
+          <w:b/>
+          <w:bCs/>
+        </w:rPr>
+        <w:t xml:space="preserve">在 Rayyan 里输入的名称（英文，大小写、空格都要一致；排除理由会进入 PRISMA，标签不会）：</w:t>
+      </w:r>
+    </w:p>
+    <w:p>
+      <w:pPr>
+        <w:pStyle w:val="ListParagraph"/>
+        <w:numPr>
+          <w:ilvl w:val="0"/>
+          <w:numId w:val="2"/>
+        </w:numPr>
+        <w:spacing w:after="60"/>
+      </w:pPr>
+      <w:r>
+        <w:rPr>
+          <w:rFonts w:ascii="Consolas" w:cs="Consolas" w:eastAsia="Microsoft YaHei" w:hAnsi="Consolas"/>
+          <w:sz w:val="19"/>
+          <w:szCs w:val="19"/>
+          <w:shd w:fill="EEEEEE" w:val="clear"/>
+        </w:rPr>
+        <w:t xml:space="preserve">E1 non-human</w:t>
+      </w:r>
+    </w:p>
+    <w:p>
+      <w:pPr>
+        <w:pStyle w:val="ListParagraph"/>
+        <w:numPr>
+          <w:ilvl w:val="0"/>
+          <w:numId w:val="2"/>
+        </w:numPr>
+        <w:spacing w:after="60"/>
+      </w:pPr>
+      <w:r>
+        <w:rPr>
+          <w:rFonts w:ascii="Consolas" w:cs="Consolas" w:eastAsia="Microsoft YaHei" w:hAnsi="Consolas"/>
+          <w:sz w:val="19"/>
+          <w:szCs w:val="19"/>
+          <w:shd w:fill="EEEEEE" w:val="clear"/>
+        </w:rPr>
+        <w:t xml:space="preserve">E2 not wandering spleen</w:t>
+      </w:r>
+    </w:p>
+    <w:p>
+      <w:pPr>
+        <w:pStyle w:val="ListParagraph"/>
+        <w:numPr>
+          <w:ilvl w:val="0"/>
+          <w:numId w:val="2"/>
+        </w:numPr>
+        <w:spacing w:after="60"/>
+      </w:pPr>
+      <w:r>
+        <w:rPr>
+          <w:rFonts w:ascii="Consolas" w:cs="Consolas" w:eastAsia="Microsoft YaHei" w:hAnsi="Consolas"/>
+          <w:sz w:val="19"/>
+          <w:szCs w:val="19"/>
+          <w:shd w:fill="EEEEEE" w:val="clear"/>
+        </w:rPr>
+        <w:t xml:space="preserve">E3 adults only</w:t>
+      </w:r>
+    </w:p>
+    <w:p>
+      <w:pPr>
+        <w:pStyle w:val="ListParagraph"/>
+        <w:numPr>
+          <w:ilvl w:val="0"/>
+          <w:numId w:val="2"/>
+        </w:numPr>
+        <w:spacing w:after="60"/>
+      </w:pPr>
+      <w:r>
+        <w:rPr>
+          <w:rFonts w:ascii="Consolas" w:cs="Consolas" w:eastAsia="Microsoft YaHei" w:hAnsi="Consolas"/>
+          <w:sz w:val="19"/>
+          <w:szCs w:val="19"/>
+          <w:shd w:fill="EEEEEE" w:val="clear"/>
+        </w:rPr>
+        <w:t xml:space="preserve">E4 no original patient data</w:t>
+      </w:r>
+    </w:p>
+    <w:p>
+      <w:pPr>
+        <w:pStyle w:val="ListParagraph"/>
+        <w:numPr>
+          <w:ilvl w:val="0"/>
+          <w:numId w:val="2"/>
+        </w:numPr>
+        <w:spacing w:after="60"/>
+      </w:pPr>
+      <w:r>
+        <w:rPr>
+          <w:rFonts w:ascii="Consolas" w:cs="Consolas" w:eastAsia="Microsoft YaHei" w:hAnsi="Consolas"/>
+          <w:sz w:val="19"/>
+          <w:szCs w:val="19"/>
+          <w:shd w:fill="EEEEEE" w:val="clear"/>
+        </w:rPr>
+        <w:t xml:space="preserve">E5 not a formal article</w:t>
+      </w:r>
+    </w:p>
+    <w:p>
+      <w:pPr>
+        <w:pStyle w:val="ListParagraph"/>
+        <w:numPr>
+          <w:ilvl w:val="0"/>
+          <w:numId w:val="2"/>
+        </w:numPr>
+        <w:spacing w:after="60"/>
+      </w:pPr>
+      <w:r>
+        <w:rPr>
+          <w:rFonts w:ascii="Consolas" w:cs="Consolas" w:eastAsia="Microsoft YaHei" w:hAnsi="Consolas"/>
+          <w:sz w:val="19"/>
+          <w:szCs w:val="19"/>
+          <w:shd w:fill="EEEEEE" w:val="clear"/>
+        </w:rPr>
+        <w:t xml:space="preserve">E6 other</w:t>
+      </w:r>
+      <w:r>
+        <w:rPr>
+          <w:rFonts w:ascii="Calibri" w:cs="Calibri" w:eastAsia="Microsoft YaHei" w:hAnsi="Calibri"/>
+        </w:rPr>
+        <w:t xml:space="preserve">（具体说明写在备注里，是否有备注功能请在校准时确认；没有的话改为在名称里直接写 </w:t>
+      </w:r>
+      <w:r>
+        <w:rPr>
+          <w:rFonts w:ascii="Consolas" w:cs="Consolas" w:eastAsia="Microsoft YaHei" w:hAnsi="Consolas"/>
+          <w:sz w:val="19"/>
+          <w:szCs w:val="19"/>
+          <w:shd w:fill="EEEEEE" w:val="clear"/>
+        </w:rPr>
+        <w:t xml:space="preserve">E6 other - 一句话说明</w:t>
+      </w:r>
+      <w:r>
+        <w:rPr>
+          <w:rFonts w:ascii="Calibri" w:cs="Calibri" w:eastAsia="Microsoft YaHei" w:hAnsi="Calibri"/>
+        </w:rPr>
+        <w:t xml:space="preserve">，并在校准后统一）</w:t>
+      </w:r>
+    </w:p>
+    <w:p>
+      <w:pPr>
+        <w:pStyle w:val="ListParagraph"/>
+        <w:numPr>
+          <w:ilvl w:val="0"/>
+          <w:numId w:val="2"/>
+        </w:numPr>
+        <w:spacing w:after="60"/>
+      </w:pPr>
+      <w:r>
+        <w:rPr>
+          <w:rFonts w:ascii="Calibri" w:cs="Calibri" w:eastAsia="Microsoft YaHei" w:hAnsi="Calibri"/>
+        </w:rPr>
+        <w:t xml:space="preserve">标签：</w:t>
+      </w:r>
+      <w:r>
+        <w:rPr>
+          <w:rFonts w:ascii="Consolas" w:cs="Consolas" w:eastAsia="Microsoft YaHei" w:hAnsi="Consolas"/>
+          <w:sz w:val="19"/>
+          <w:szCs w:val="19"/>
+          <w:shd w:fill="EEEEEE" w:val="clear"/>
+        </w:rPr>
+        <w:t xml:space="preserve">review-for-refs</w:t>
+      </w:r>
+      <w:r>
+        <w:rPr>
+          <w:rFonts w:ascii="Calibri" w:cs="Calibri" w:eastAsia="Microsoft YaHei" w:hAnsi="Calibri"/>
+        </w:rPr>
+        <w:t xml:space="preserve">、</w:t>
+      </w:r>
+      <w:r>
+        <w:rPr>
+          <w:rFonts w:ascii="Consolas" w:cs="Consolas" w:eastAsia="Microsoft YaHei" w:hAnsi="Consolas"/>
+          <w:sz w:val="19"/>
+          <w:szCs w:val="19"/>
+          <w:shd w:fill="EEEEEE" w:val="clear"/>
+        </w:rPr>
+        <w:t xml:space="preserve">lang-other</w:t>
+      </w:r>
+    </w:p>
+    <w:p>
+      <w:pPr>
+        <w:spacing w:after="120"/>
+      </w:pPr>
+      <w:r>
+        <w:rPr>
+          <w:rFonts w:ascii="Calibri" w:cs="Calibri" w:eastAsia="Microsoft YaHei" w:hAnsi="Calibri"/>
         </w:rPr>
         <w:t xml:space="preserve">全文阶段另有：</w:t>
       </w:r>
@@ -4239,7 +4469,7 @@
         <w:sz w:val="17"/>
         <w:szCs w:val="17"/>
       </w:rPr>
-      <w:t xml:space="preserve">儿童游走脾系统综述 CRD420261520329 筛选指南（草稿）   |   第 </w:t>
+      <w:t xml:space="preserve">筛选指南（草稿）v2026-10-05   |   第 </w:t>
     </w:r>
     <w:r>
       <w:rPr>

</xml_diff>

<commit_message>
Screening guide: remove Rayyan default RCT keywords, no AI features, use notes; log screening page
Co-Authored-By: Claude Sonnet 5.5 <noreply@anthropic.com>
Claude-Session: https://claude.ai/code/session_01FRD7etKqYN8v2bbXeeLMRW
</commit_message>
<xml_diff>
--- a/Screening guide - title and abstract (draft).docx
+++ b/Screening guide - title and abstract (draft).docx
@@ -546,6 +546,189 @@
           <w:rFonts w:ascii="Calibri" w:cs="Calibri" w:eastAsia="Microsoft YaHei" w:hAnsi="Calibri"/>
         </w:rPr>
         <w:t xml:space="preserve">：既不是英文也不是中文的文章（法、德、西、葡、意、俄、土耳其等）。</w:t>
+      </w:r>
+    </w:p>
+    <w:p>
+      <w:pPr>
+        <w:pStyle w:val="ListParagraph"/>
+        <w:numPr>
+          <w:ilvl w:val="0"/>
+          <w:numId w:val="2"/>
+        </w:numPr>
+        <w:spacing w:after="60"/>
+      </w:pPr>
+      <w:r>
+        <w:rPr>
+          <w:rFonts w:ascii="Calibri" w:cs="Calibri" w:eastAsia="Microsoft YaHei" w:hAnsi="Calibri"/>
+          <w:b/>
+          <w:bCs/>
+        </w:rPr>
+        <w:t xml:space="preserve">先改 Rayyan 的默认高亮关键词（5 Oct 校准项目截图所见）。</w:t>
+      </w:r>
+      <w:r>
+        <w:rPr>
+          <w:rFonts w:ascii="Calibri" w:cs="Calibri" w:eastAsia="Microsoft YaHei" w:hAnsi="Calibri"/>
+        </w:rPr>
+        <w:t xml:space="preserve"> 右侧 Keywords for exclude 里默认有 </w:t>
+      </w:r>
+      <w:r>
+        <w:rPr>
+          <w:rFonts w:ascii="Consolas" w:cs="Consolas" w:eastAsia="Microsoft YaHei" w:hAnsi="Consolas"/>
+          <w:sz w:val="19"/>
+          <w:szCs w:val="19"/>
+          <w:shd w:fill="EEEEEE" w:val="clear"/>
+        </w:rPr>
+        <w:t xml:space="preserve">case report</w:t>
+      </w:r>
+      <w:r>
+        <w:rPr>
+          <w:rFonts w:ascii="Calibri" w:cs="Calibri" w:eastAsia="Microsoft YaHei" w:hAnsi="Calibri"/>
+        </w:rPr>
+        <w:t xml:space="preserve">、</w:t>
+      </w:r>
+      <w:r>
+        <w:rPr>
+          <w:rFonts w:ascii="Consolas" w:cs="Consolas" w:eastAsia="Microsoft YaHei" w:hAnsi="Consolas"/>
+          <w:sz w:val="19"/>
+          <w:szCs w:val="19"/>
+          <w:shd w:fill="EEEEEE" w:val="clear"/>
+        </w:rPr>
+        <w:t xml:space="preserve">case reports</w:t>
+      </w:r>
+      <w:r>
+        <w:rPr>
+          <w:rFonts w:ascii="Calibri" w:cs="Calibri" w:eastAsia="Microsoft YaHei" w:hAnsi="Calibri"/>
+        </w:rPr>
+        <w:t xml:space="preserve">、</w:t>
+      </w:r>
+      <w:r>
+        <w:rPr>
+          <w:rFonts w:ascii="Consolas" w:cs="Consolas" w:eastAsia="Microsoft YaHei" w:hAnsi="Consolas"/>
+          <w:sz w:val="19"/>
+          <w:szCs w:val="19"/>
+          <w:shd w:fill="EEEEEE" w:val="clear"/>
+        </w:rPr>
+        <w:t xml:space="preserve">literature review</w:t>
+      </w:r>
+      <w:r>
+        <w:rPr>
+          <w:rFonts w:ascii="Calibri" w:cs="Calibri" w:eastAsia="Microsoft YaHei" w:hAnsi="Calibri"/>
+        </w:rPr>
+        <w:t xml:space="preserve">、</w:t>
+      </w:r>
+      <w:r>
+        <w:rPr>
+          <w:rFonts w:ascii="Consolas" w:cs="Consolas" w:eastAsia="Microsoft YaHei" w:hAnsi="Consolas"/>
+          <w:sz w:val="19"/>
+          <w:szCs w:val="19"/>
+          <w:shd w:fill="EEEEEE" w:val="clear"/>
+        </w:rPr>
+        <w:t xml:space="preserve">this review</w:t>
+      </w:r>
+      <w:r>
+        <w:rPr>
+          <w:rFonts w:ascii="Calibri" w:cs="Calibri" w:eastAsia="Microsoft YaHei" w:hAnsi="Calibri"/>
+        </w:rPr>
+        <w:t xml:space="preserve">（红色），Keywords for include 里是 RCT、placebo、randomly 等随机对照试验用词。本综述要找的恰恰是病例报告，红色的 </w:t>
+      </w:r>
+      <w:r>
+        <w:rPr>
+          <w:rFonts w:ascii="Consolas" w:cs="Consolas" w:eastAsia="Microsoft YaHei" w:hAnsi="Consolas"/>
+          <w:sz w:val="19"/>
+          <w:szCs w:val="19"/>
+          <w:shd w:fill="EEEEEE" w:val="clear"/>
+        </w:rPr>
+        <w:t xml:space="preserve">case report</w:t>
+      </w:r>
+      <w:r>
+        <w:rPr>
+          <w:rFonts w:ascii="Calibri" w:cs="Calibri" w:eastAsia="Microsoft YaHei" w:hAnsi="Calibri"/>
+        </w:rPr>
+        <w:t xml:space="preserve"> 会误导。</w:t>
+      </w:r>
+      <w:r>
+        <w:rPr>
+          <w:rFonts w:ascii="Calibri" w:cs="Calibri" w:eastAsia="Microsoft YaHei" w:hAnsi="Calibri"/>
+          <w:b/>
+          <w:bCs/>
+        </w:rPr>
+        <w:t xml:space="preserve">开始筛选前删掉这些默认词，只保留下面建议的词</w:t>
+      </w:r>
+      <w:r>
+        <w:rPr>
+          <w:rFonts w:ascii="Calibri" w:cs="Calibri" w:eastAsia="Microsoft YaHei" w:hAnsi="Calibri"/>
+        </w:rPr>
+        <w:t xml:space="preserve">；两位筛选员的设置要一致（高亮是个人设置还是项目共享，请在校准时确认）。</w:t>
+      </w:r>
+    </w:p>
+    <w:p>
+      <w:pPr>
+        <w:pStyle w:val="ListParagraph"/>
+        <w:numPr>
+          <w:ilvl w:val="0"/>
+          <w:numId w:val="2"/>
+        </w:numPr>
+        <w:spacing w:after="60"/>
+      </w:pPr>
+      <w:r>
+        <w:rPr>
+          <w:rFonts w:ascii="Calibri" w:cs="Calibri" w:eastAsia="Microsoft YaHei" w:hAnsi="Calibri"/>
+          <w:b/>
+          <w:bCs/>
+        </w:rPr>
+        <w:t xml:space="preserve">不使用 Rayyan 的 AI 功能来做决定</w:t>
+      </w:r>
+      <w:r>
+        <w:rPr>
+          <w:rFonts w:ascii="Calibri" w:cs="Calibri" w:eastAsia="Microsoft YaHei" w:hAnsi="Calibri"/>
+        </w:rPr>
+        <w:t xml:space="preserve">（AI Reviewer、Analyze、ResearchPilot 聊天等）：协议 v1.2 没有写使用 AI 或自动化工具辅助筛选。如果以后要用，先修改协议，并在方法部分说明。</w:t>
+      </w:r>
+    </w:p>
+    <w:p>
+      <w:pPr>
+        <w:pStyle w:val="ListParagraph"/>
+        <w:numPr>
+          <w:ilvl w:val="0"/>
+          <w:numId w:val="2"/>
+        </w:numPr>
+        <w:spacing w:after="60"/>
+      </w:pPr>
+      <w:r>
+        <w:rPr>
+          <w:rFonts w:ascii="Calibri" w:cs="Calibri" w:eastAsia="Microsoft YaHei" w:hAnsi="Calibri"/>
+        </w:rPr>
+        <w:t xml:space="preserve">每条记录下方有 </w:t>
+      </w:r>
+      <w:r>
+        <w:rPr>
+          <w:rFonts w:ascii="Calibri" w:cs="Calibri" w:eastAsia="Microsoft YaHei" w:hAnsi="Calibri"/>
+          <w:b/>
+          <w:bCs/>
+        </w:rPr>
+        <w:t xml:space="preserve">Add note</w:t>
+      </w:r>
+      <w:r>
+        <w:rPr>
+          <w:rFonts w:ascii="Calibri" w:cs="Calibri" w:eastAsia="Microsoft YaHei" w:hAnsi="Calibri"/>
+        </w:rPr>
+        <w:t xml:space="preserve">（备注）框：E6 的具体说明、可能是重复患者的提示都写在这里。</w:t>
+      </w:r>
+    </w:p>
+    <w:p>
+      <w:pPr>
+        <w:pStyle w:val="ListParagraph"/>
+        <w:numPr>
+          <w:ilvl w:val="0"/>
+          <w:numId w:val="2"/>
+        </w:numPr>
+        <w:spacing w:after="60"/>
+      </w:pPr>
+      <w:r>
+        <w:rPr>
+          <w:rFonts w:ascii="Calibri" w:cs="Calibri" w:eastAsia="Microsoft YaHei" w:hAnsi="Calibri"/>
+        </w:rPr>
+        <w:t xml:space="preserve">记录标题下写着"作者和期刊信息已隐藏"（有 Show 按钮）：标题摘要阶段不需要作者和期刊，保持隐藏即可；如果有人点了 Show，在校准讨论时说明。</w:t>
       </w:r>
     </w:p>
     <w:p>

</xml_diff>

<commit_message>
Screening guide: switch off browser translation in Rayyan; log translated screenshot
Co-Authored-By: Claude Sonnet 5.5 <noreply@anthropic.com>
Claude-Session: https://claude.ai/code/session_01FRD7etKqYN8v2bbXeeLMRW
</commit_message>
<xml_diff>
--- a/Screening guide - title and abstract (draft).docx
+++ b/Screening guide - title and abstract (draft).docx
@@ -659,6 +659,30 @@
           <w:rFonts w:ascii="Calibri" w:cs="Calibri" w:eastAsia="Microsoft YaHei" w:hAnsi="Calibri"/>
         </w:rPr>
         <w:t xml:space="preserve">；两位筛选员的设置要一致（高亮是个人设置还是项目共享，请在校准时确认）。</w:t>
+      </w:r>
+    </w:p>
+    <w:p>
+      <w:pPr>
+        <w:pStyle w:val="ListParagraph"/>
+        <w:numPr>
+          <w:ilvl w:val="0"/>
+          <w:numId w:val="2"/>
+        </w:numPr>
+        <w:spacing w:after="60"/>
+      </w:pPr>
+      <w:r>
+        <w:rPr>
+          <w:rFonts w:ascii="Calibri" w:cs="Calibri" w:eastAsia="Microsoft YaHei" w:hAnsi="Calibri"/>
+          <w:b/>
+          <w:bCs/>
+        </w:rPr>
+        <w:t xml:space="preserve">关闭浏览器自动翻译（Rayyan 页面和摘要都要显示英文原文）。</w:t>
+      </w:r>
+      <w:r>
+        <w:rPr>
+          <w:rFonts w:ascii="Calibri" w:cs="Calibri" w:eastAsia="Microsoft YaHei" w:hAnsi="Calibri"/>
+        </w:rPr>
+        <w:t xml:space="preserve"> 5 Oct 校准项目的截图里，按钮、标题和摘要都被浏览器译成了中文：机器翻译会改变医学术语，也可能让 Rayyan 的按钮失灵（29 Sep 的 Embase 页面就因自动翻译报过 React 错误）。两位筛选员都读原文，筛选才可比；中文记录本来就是中文，不受影响。</w:t>
       </w:r>
     </w:p>
     <w:p>

</xml_diff>

<commit_message>
Screening guide: protocol requires independent screening, blind mode is our setting
Co-Authored-By: Claude Sonnet 5.5 <noreply@anthropic.com>
Claude-Session: https://claude.ai/code/session_01FRD7etKqYN8v2bbXeeLMRW
</commit_message>
<xml_diff>
--- a/Screening guide - title and abstract (draft).docx
+++ b/Screening guide - title and abstract (draft).docx
@@ -170,6 +170,45 @@
           <w:rFonts w:ascii="Calibri" w:cs="Calibri" w:eastAsia="Microsoft YaHei" w:hAnsi="Calibri"/>
         </w:rPr>
         <w:t xml:space="preserve">2. 流程（来自协议第 14 节）</w:t>
+      </w:r>
+    </w:p>
+    <w:p>
+      <w:pPr>
+        <w:spacing w:after="120"/>
+      </w:pPr>
+      <w:r>
+        <w:rPr>
+          <w:rFonts w:ascii="Calibri" w:cs="Calibri" w:eastAsia="Microsoft YaHei" w:hAnsi="Calibri"/>
+        </w:rPr>
+        <w:t xml:space="preserve">说明：协议第 14 节写的是</w:t>
+      </w:r>
+      <w:r>
+        <w:rPr>
+          <w:rFonts w:ascii="Calibri" w:cs="Calibri" w:eastAsia="Microsoft YaHei" w:hAnsi="Calibri"/>
+          <w:b/>
+          <w:bCs/>
+        </w:rPr>
+        <w:t xml:space="preserve">两位筛选员独立筛选</w:t>
+      </w:r>
+      <w:r>
+        <w:rPr>
+          <w:rFonts w:ascii="Calibri" w:cs="Calibri" w:eastAsia="Microsoft YaHei" w:hAnsi="Calibri"/>
+        </w:rPr>
+        <w:t xml:space="preserve">，分歧由讨论或第三位（杨军）解决；协议没有提 Rayyan 的盲法开关。下面的 </w:t>
+      </w:r>
+      <w:r>
+        <w:rPr>
+          <w:rFonts w:ascii="Calibri" w:cs="Calibri" w:eastAsia="Microsoft YaHei" w:hAnsi="Calibri"/>
+          <w:b/>
+          <w:bCs/>
+        </w:rPr>
+        <w:t xml:space="preserve">Blind ON</w:t>
+      </w:r>
+      <w:r>
+        <w:rPr>
+          <w:rFonts w:ascii="Calibri" w:cs="Calibri" w:eastAsia="Microsoft YaHei" w:hAnsi="Calibri"/>
+        </w:rPr>
+        <w:t xml:space="preserve"> 是我们为落实"独立"选的设置：盲法开着，两人在筛完之前看不到对方的决定，方法部分才能写"独立筛选"。两人都筛完标题摘要后，再关掉盲法看冲突。</w:t>
       </w:r>
     </w:p>
     <w:p>

</xml_diff>

<commit_message>
Screening guide: note Rayyan's built-in default exclusion reasons must not be used; log reason-optional question
Co-Authored-By: Claude Sonnet 5.5 <noreply@anthropic.com>
Claude-Session: https://claude.ai/code/session_01FRD7etKqYN8v2bbXeeLMRW
</commit_message>
<xml_diff>
--- a/Screening guide - title and abstract (draft).docx
+++ b/Screening guide - title and abstract (draft).docx
@@ -476,7 +476,7 @@
         <w:rPr>
           <w:rFonts w:ascii="Calibri" w:cs="Calibri" w:eastAsia="Microsoft YaHei" w:hAnsi="Calibri"/>
         </w:rPr>
-        <w:t xml:space="preserve">之一。Rayyan 没有预先设置的步骤：排除理由和标签都是在筛选时、打开一条记录后点决定栏里的 </w:t>
+        <w:t xml:space="preserve">之一。我们的 E1–E6 在 Rayyan 里没有预先设置的步骤：排除理由和标签都是在筛选时、打开一条记录后点决定栏里的 </w:t>
       </w:r>
       <w:r>
         <w:rPr>
@@ -504,7 +504,7 @@
         <w:rPr>
           <w:rFonts w:ascii="Calibri" w:cs="Calibri" w:eastAsia="Microsoft YaHei" w:hAnsi="Calibri"/>
         </w:rPr>
-        <w:t xml:space="preserve">，输入名称并应用，之后就保存在项目的列表里。</w:t>
+        <w:t xml:space="preserve">，在 "Add exclusion reasons" 框里输入名称并应用，之后就保存在项目的列表里。</w:t>
       </w:r>
       <w:r>
         <w:rPr>
@@ -519,6 +519,179 @@
           <w:rFonts w:ascii="Calibri" w:cs="Calibri" w:eastAsia="Microsoft YaHei" w:hAnsi="Calibri"/>
         </w:rPr>
         <w:t xml:space="preserve">（据 Rayyan 帮助中心搜索结果的说明；帮助页本身在我们的环境里打不开，细节以校准时的实际界面为准）。</w:t>
+      </w:r>
+    </w:p>
+    <w:p>
+      <w:pPr>
+        <w:pStyle w:val="ListParagraph"/>
+        <w:numPr>
+          <w:ilvl w:val="0"/>
+          <w:numId w:val="2"/>
+        </w:numPr>
+        <w:spacing w:after="60"/>
+      </w:pPr>
+      <w:r>
+        <w:rPr>
+          <w:rFonts w:ascii="Calibri" w:cs="Calibri" w:eastAsia="Microsoft YaHei" w:hAnsi="Calibri"/>
+          <w:b/>
+          <w:bCs/>
+        </w:rPr>
+        <w:t xml:space="preserve">Rayyan 的排除理由列表里自带一批默认理由，不是我们的（5 Oct 校准项目截图所见）：</w:t>
+      </w:r>
+      <w:r>
+        <w:rPr>
+          <w:rFonts w:ascii="Calibri" w:cs="Calibri" w:eastAsia="Microsoft YaHei" w:hAnsi="Calibri"/>
+        </w:rPr>
+        <w:t xml:space="preserve"> </w:t>
+      </w:r>
+      <w:r>
+        <w:rPr>
+          <w:rFonts w:ascii="Consolas" w:cs="Consolas" w:eastAsia="Microsoft YaHei" w:hAnsi="Consolas"/>
+          <w:sz w:val="19"/>
+          <w:szCs w:val="19"/>
+          <w:shd w:fill="EEEEEE" w:val="clear"/>
+        </w:rPr>
+        <w:t xml:space="preserve">background article</w:t>
+      </w:r>
+      <w:r>
+        <w:rPr>
+          <w:rFonts w:ascii="Calibri" w:cs="Calibri" w:eastAsia="Microsoft YaHei" w:hAnsi="Calibri"/>
+        </w:rPr>
+        <w:t xml:space="preserve">、</w:t>
+      </w:r>
+      <w:r>
+        <w:rPr>
+          <w:rFonts w:ascii="Consolas" w:cs="Consolas" w:eastAsia="Microsoft YaHei" w:hAnsi="Consolas"/>
+          <w:sz w:val="19"/>
+          <w:szCs w:val="19"/>
+          <w:shd w:fill="EEEEEE" w:val="clear"/>
+        </w:rPr>
+        <w:t xml:space="preserve">foreign language</w:t>
+      </w:r>
+      <w:r>
+        <w:rPr>
+          <w:rFonts w:ascii="Calibri" w:cs="Calibri" w:eastAsia="Microsoft YaHei" w:hAnsi="Calibri"/>
+        </w:rPr>
+        <w:t xml:space="preserve">、</w:t>
+      </w:r>
+      <w:r>
+        <w:rPr>
+          <w:rFonts w:ascii="Consolas" w:cs="Consolas" w:eastAsia="Microsoft YaHei" w:hAnsi="Consolas"/>
+          <w:sz w:val="19"/>
+          <w:szCs w:val="19"/>
+          <w:shd w:fill="EEEEEE" w:val="clear"/>
+        </w:rPr>
+        <w:t xml:space="preserve">wrong drug</w:t>
+      </w:r>
+      <w:r>
+        <w:rPr>
+          <w:rFonts w:ascii="Calibri" w:cs="Calibri" w:eastAsia="Microsoft YaHei" w:hAnsi="Calibri"/>
+        </w:rPr>
+        <w:t xml:space="preserve">、</w:t>
+      </w:r>
+      <w:r>
+        <w:rPr>
+          <w:rFonts w:ascii="Consolas" w:cs="Consolas" w:eastAsia="Microsoft YaHei" w:hAnsi="Consolas"/>
+          <w:sz w:val="19"/>
+          <w:szCs w:val="19"/>
+          <w:shd w:fill="EEEEEE" w:val="clear"/>
+        </w:rPr>
+        <w:t xml:space="preserve">wrong outcome</w:t>
+      </w:r>
+      <w:r>
+        <w:rPr>
+          <w:rFonts w:ascii="Calibri" w:cs="Calibri" w:eastAsia="Microsoft YaHei" w:hAnsi="Calibri"/>
+        </w:rPr>
+        <w:t xml:space="preserve">、</w:t>
+      </w:r>
+      <w:r>
+        <w:rPr>
+          <w:rFonts w:ascii="Consolas" w:cs="Consolas" w:eastAsia="Microsoft YaHei" w:hAnsi="Consolas"/>
+          <w:sz w:val="19"/>
+          <w:szCs w:val="19"/>
+          <w:shd w:fill="EEEEEE" w:val="clear"/>
+        </w:rPr>
+        <w:t xml:space="preserve">wrong population</w:t>
+      </w:r>
+      <w:r>
+        <w:rPr>
+          <w:rFonts w:ascii="Calibri" w:cs="Calibri" w:eastAsia="Microsoft YaHei" w:hAnsi="Calibri"/>
+        </w:rPr>
+        <w:t xml:space="preserve">、</w:t>
+      </w:r>
+      <w:r>
+        <w:rPr>
+          <w:rFonts w:ascii="Consolas" w:cs="Consolas" w:eastAsia="Microsoft YaHei" w:hAnsi="Consolas"/>
+          <w:sz w:val="19"/>
+          <w:szCs w:val="19"/>
+          <w:shd w:fill="EEEEEE" w:val="clear"/>
+        </w:rPr>
+        <w:t xml:space="preserve">wrong publication type</w:t>
+      </w:r>
+      <w:r>
+        <w:rPr>
+          <w:rFonts w:ascii="Calibri" w:cs="Calibri" w:eastAsia="Microsoft YaHei" w:hAnsi="Calibri"/>
+        </w:rPr>
+        <w:t xml:space="preserve">、</w:t>
+      </w:r>
+      <w:r>
+        <w:rPr>
+          <w:rFonts w:ascii="Consolas" w:cs="Consolas" w:eastAsia="Microsoft YaHei" w:hAnsi="Consolas"/>
+          <w:sz w:val="19"/>
+          <w:szCs w:val="19"/>
+          <w:shd w:fill="EEEEEE" w:val="clear"/>
+        </w:rPr>
+        <w:t xml:space="preserve">wrong study design</w:t>
+      </w:r>
+      <w:r>
+        <w:rPr>
+          <w:rFonts w:ascii="Calibri" w:cs="Calibri" w:eastAsia="Microsoft YaHei" w:hAnsi="Calibri"/>
+        </w:rPr>
+        <w:t xml:space="preserve"> 等（列表在截图里被截断，后面是否还有别的没看到）。</w:t>
+      </w:r>
+      <w:r>
+        <w:rPr>
+          <w:rFonts w:ascii="Calibri" w:cs="Calibri" w:eastAsia="Microsoft YaHei" w:hAnsi="Calibri"/>
+          <w:b/>
+          <w:bCs/>
+        </w:rPr>
+        <w:t xml:space="preserve">这些一律不用。</w:t>
+      </w:r>
+      <w:r>
+        <w:rPr>
+          <w:rFonts w:ascii="Calibri" w:cs="Calibri" w:eastAsia="Microsoft YaHei" w:hAnsi="Calibri"/>
+        </w:rPr>
+        <w:t xml:space="preserve"> 它们是为干预研究的综述设计的，和我们的 E1–E6 不对应；两人如果一个用默认理由、一个用 E1–E6，理由就没法比较，也没法进入 PRISMA 图。只选 </w:t>
+      </w:r>
+      <w:r>
+        <w:rPr>
+          <w:rFonts w:ascii="Consolas" w:cs="Consolas" w:eastAsia="Microsoft YaHei" w:hAnsi="Consolas"/>
+          <w:sz w:val="19"/>
+          <w:szCs w:val="19"/>
+          <w:shd w:fill="EEEEEE" w:val="clear"/>
+        </w:rPr>
+        <w:t xml:space="preserve">E1</w:t>
+      </w:r>
+      <w:r>
+        <w:rPr>
+          <w:rFonts w:ascii="Calibri" w:cs="Calibri" w:eastAsia="Microsoft YaHei" w:hAnsi="Calibri"/>
+        </w:rPr>
+        <w:t xml:space="preserve">–</w:t>
+      </w:r>
+      <w:r>
+        <w:rPr>
+          <w:rFonts w:ascii="Consolas" w:cs="Consolas" w:eastAsia="Microsoft YaHei" w:hAnsi="Consolas"/>
+          <w:sz w:val="19"/>
+          <w:szCs w:val="19"/>
+          <w:shd w:fill="EEEEEE" w:val="clear"/>
+        </w:rPr>
+        <w:t xml:space="preserve">E6</w:t>
+      </w:r>
+      <w:r>
+        <w:rPr>
+          <w:rFonts w:ascii="Calibri" w:cs="Calibri" w:eastAsia="Microsoft YaHei" w:hAnsi="Calibri"/>
+        </w:rPr>
+        <w:t xml:space="preserve"> 的名称。默认理由能否从列表里删除，我们没有验证；删不掉也没关系，不选就行。</w:t>
       </w:r>
     </w:p>
     <w:p>

</xml_diff>

<commit_message>
Screening guide revised after the 50-record calibration (sections 3, 4.3, 5, new section 11)
Co-Authored-By: Claude Sonnet 5.5 <noreply@anthropic.com>
Claude-Session: https://claude.ai/code/session_01FRD7etKqYN8v2bbXeeLMRW
</commit_message>
<xml_diff>
--- a/Screening guide - title and abstract (draft).docx
+++ b/Screening guide - title and abstract (draft).docx
@@ -22,7 +22,21 @@
         <w:rPr>
           <w:rFonts w:ascii="Calibri" w:cs="Calibri" w:eastAsia="Microsoft YaHei" w:hAnsi="Calibri"/>
         </w:rPr>
-        <w:t xml:space="preserve">适用对象：舒俊（筛选员 1）、彭飞（筛选员 2）、杨军（仲裁）。草稿日期：2026 年 10 月 4 日。</w:t>
+        <w:t xml:space="preserve">适用对象：舒俊（筛选员 1）、彭飞（筛选员 2）、杨军（仲裁）。草稿日期：2026 年 10 月 4 日；</w:t>
+      </w:r>
+      <w:r>
+        <w:rPr>
+          <w:rFonts w:ascii="Calibri" w:cs="Calibri" w:eastAsia="Microsoft YaHei" w:hAnsi="Calibri"/>
+          <w:b/>
+          <w:bCs/>
+        </w:rPr>
+        <w:t xml:space="preserve">2026 年 10 月 7 日按 50 条校准的结果修订（第 3、4.3、5 节有改动，校准结果和修订记录见第 11 节）。</w:t>
+      </w:r>
+      <w:r>
+        <w:rPr>
+          <w:rFonts w:ascii="Calibri" w:cs="Calibri" w:eastAsia="Microsoft YaHei" w:hAnsi="Calibri"/>
+        </w:rPr>
+        <w:t xml:space="preserve"> </w:t>
       </w:r>
       <w:r>
         <w:rPr>
@@ -326,6 +340,14 @@
         </w:rPr>
         <w:t xml:space="preserve">两人独立筛完，导出各自的决定，比较。</w:t>
       </w:r>
+      <w:r>
+        <w:rPr>
+          <w:rFonts w:ascii="Calibri" w:cs="Calibri" w:eastAsia="Microsoft YaHei" w:hAnsi="Calibri"/>
+          <w:b/>
+          <w:bCs/>
+        </w:rPr>
+        <w:t xml:space="preserve">（已于 2026 年 10 月 5 日完成，结果见第 11 节。）</w:t>
+      </w:r>
     </w:p>
     <w:p>
       <w:pPr>
@@ -476,7 +498,21 @@
         <w:rPr>
           <w:rFonts w:ascii="Calibri" w:cs="Calibri" w:eastAsia="Microsoft YaHei" w:hAnsi="Calibri"/>
         </w:rPr>
-        <w:t xml:space="preserve">之一。我们的 E1–E6 在 Rayyan 里没有预先设置的步骤：排除理由和标签都是在筛选时、打开一条记录后点决定栏里的 </w:t>
+        <w:t xml:space="preserve">之一，标题摘要阶段也一样。</w:t>
+      </w:r>
+      <w:r>
+        <w:rPr>
+          <w:rFonts w:ascii="Calibri" w:cs="Calibri" w:eastAsia="Microsoft YaHei" w:hAnsi="Calibri"/>
+          <w:b/>
+          <w:bCs/>
+        </w:rPr>
+        <w:t xml:space="preserve">如果你想 Exclude，却说不出适用的是 E1–E6 里的哪一条，就不要 Exclude，改选 Maybe</w:t>
+      </w:r>
+      <w:r>
+        <w:rPr>
+          <w:rFonts w:ascii="Calibri" w:cs="Calibri" w:eastAsia="Microsoft YaHei" w:hAnsi="Calibri"/>
+        </w:rPr>
+        <w:t xml:space="preserve">（校准中有 4 条 Exclude 没选理由，见第 11 节）。我们的 E1–E6 在 Rayyan 里没有预先设置的步骤：排除理由和标签都是在筛选时、打开一条记录后点决定栏里的 </w:t>
       </w:r>
       <w:r>
         <w:rPr>
@@ -964,7 +1000,63 @@
         <w:rPr>
           <w:rFonts w:ascii="Calibri" w:cs="Calibri" w:eastAsia="Microsoft YaHei" w:hAnsi="Calibri"/>
         </w:rPr>
-        <w:t xml:space="preserve">记录标题下写着"作者和期刊信息已隐藏"（有 Show 按钮）：标题摘要阶段不需要作者和期刊，保持隐藏即可；如果有人点了 Show，在校准讨论时说明。</w:t>
+        <w:t xml:space="preserve">记录标题下写着"作者和期刊信息已隐藏"（有 Show 按钮）：标题摘要阶段不需要作者和期刊，保持隐藏即可。</w:t>
+      </w:r>
+      <w:r>
+        <w:rPr>
+          <w:rFonts w:ascii="Calibri" w:cs="Calibri" w:eastAsia="Microsoft YaHei" w:hAnsi="Calibri"/>
+          <w:b/>
+          <w:bCs/>
+        </w:rPr>
+        <w:t xml:space="preserve">校准中发现这条在筛选过程中变成了显示状态，原因不明（见第 11 节）。因此正式筛选时，两人每次开始之前都先确认处于隐藏状态；如果发现显示了，不要继续筛，先记下日期和时间，并告诉其他人。</w:t>
+      </w:r>
+    </w:p>
+    <w:p>
+      <w:pPr>
+        <w:pStyle w:val="ListParagraph"/>
+        <w:numPr>
+          <w:ilvl w:val="0"/>
+          <w:numId w:val="2"/>
+        </w:numPr>
+        <w:spacing w:after="60"/>
+      </w:pPr>
+      <w:r>
+        <w:rPr>
+          <w:rFonts w:ascii="Calibri" w:cs="Calibri" w:eastAsia="Microsoft YaHei" w:hAnsi="Calibri"/>
+          <w:b/>
+          <w:bCs/>
+        </w:rPr>
+        <w:t xml:space="preserve">导出决定的方法</w:t>
+      </w:r>
+      <w:r>
+        <w:rPr>
+          <w:rFonts w:ascii="Calibri" w:cs="Calibri" w:eastAsia="Microsoft YaHei" w:hAnsi="Calibri"/>
+        </w:rPr>
+        <w:t xml:space="preserve">：Review data 标签 → 右上角 "···" → Review settings 面板 → Export；范围选 All references，格式 CSV，勾选 decisions、exclusion reasons、labels、user notes。</w:t>
+      </w:r>
+    </w:p>
+    <w:p>
+      <w:pPr>
+        <w:pStyle w:val="ListParagraph"/>
+        <w:numPr>
+          <w:ilvl w:val="0"/>
+          <w:numId w:val="2"/>
+        </w:numPr>
+        <w:spacing w:after="60"/>
+      </w:pPr>
+      <w:r>
+        <w:rPr>
+          <w:rFonts w:ascii="Calibri" w:cs="Calibri" w:eastAsia="Microsoft YaHei" w:hAnsi="Calibri"/>
+          <w:b/>
+          <w:bCs/>
+        </w:rPr>
+        <w:t xml:space="preserve">不要点</w:t>
+      </w:r>
+      <w:r>
+        <w:rPr>
+          <w:rFonts w:ascii="Calibri" w:cs="Calibri" w:eastAsia="Microsoft YaHei" w:hAnsi="Calibri"/>
+        </w:rPr>
+        <w:t xml:space="preserve"> Detect duplicates 和 Auto resolve：去重已经由脚本和 EndNote 完成，Rayyan 的查重会把标题通用的记录（如 "Wandering spleen."）误判为重复。</w:t>
       </w:r>
     </w:p>
     <w:p>
@@ -1073,7 +1165,15 @@
         <w:rPr>
           <w:rFonts w:ascii="Calibri" w:cs="Calibri" w:eastAsia="Microsoft YaHei" w:hAnsi="Calibri"/>
         </w:rPr>
-        <w:t xml:space="preserve"> 只有在记录明确符合某条排除理由时才排除。</w:t>
+        <w:t xml:space="preserve"> 只有在记录明确符合某条排除理由时才排除；</w:t>
+      </w:r>
+      <w:r>
+        <w:rPr>
+          <w:rFonts w:ascii="Calibri" w:cs="Calibri" w:eastAsia="Microsoft YaHei" w:hAnsi="Calibri"/>
+          <w:b/>
+          <w:bCs/>
+        </w:rPr>
+        <w:t xml:space="preserve">能说出是 E1–E6 里的哪一条，才可以 Exclude。</w:t>
       </w:r>
     </w:p>
     <w:p>
@@ -3004,7 +3104,7 @@
                 <w:sz w:val="20"/>
                 <w:szCs w:val="20"/>
               </w:rPr>
-              <w:t xml:space="preserve">只看标题。标题明显无关则 Exclude（选相应理由）；标题可能相关则 </w:t>
+              <w:t xml:space="preserve">只看标题，</w:t>
             </w:r>
             <w:r>
               <w:rPr>
@@ -3014,6 +3114,42 @@
                 <w:sz w:val="20"/>
                 <w:szCs w:val="20"/>
               </w:rPr>
+              <w:t xml:space="preserve">只用 Maybe 或 Exclude，不用 Include</w:t>
+            </w:r>
+            <w:r>
+              <w:rPr>
+                <w:rFonts w:ascii="Calibri" w:cs="Calibri" w:eastAsia="Microsoft YaHei" w:hAnsi="Calibri"/>
+                <w:sz w:val="20"/>
+                <w:szCs w:val="20"/>
+              </w:rPr>
+              <w:t xml:space="preserve">。标题明确符合某条 E1–E6（如标题写明动物、全部成人、副脾、脾种植）才 </w:t>
+            </w:r>
+            <w:r>
+              <w:rPr>
+                <w:rFonts w:ascii="Calibri" w:cs="Calibri" w:eastAsia="Microsoft YaHei" w:hAnsi="Calibri"/>
+                <w:b/>
+                <w:bCs/>
+                <w:sz w:val="20"/>
+                <w:szCs w:val="20"/>
+              </w:rPr>
+              <w:t xml:space="preserve">Exclude</w:t>
+            </w:r>
+            <w:r>
+              <w:rPr>
+                <w:rFonts w:ascii="Calibri" w:cs="Calibri" w:eastAsia="Microsoft YaHei" w:hAnsi="Calibri"/>
+                <w:sz w:val="20"/>
+                <w:szCs w:val="20"/>
+              </w:rPr>
+              <w:t xml:space="preserve"> 并选对应理由；说不出是哪一条理由的，一律 </w:t>
+            </w:r>
+            <w:r>
+              <w:rPr>
+                <w:rFonts w:ascii="Calibri" w:cs="Calibri" w:eastAsia="Microsoft YaHei" w:hAnsi="Calibri"/>
+                <w:b/>
+                <w:bCs/>
+                <w:sz w:val="20"/>
+                <w:szCs w:val="20"/>
+              </w:rPr>
               <w:t xml:space="preserve">Maybe</w:t>
             </w:r>
             <w:r>
@@ -3022,7 +3158,17 @@
                 <w:sz w:val="20"/>
                 <w:szCs w:val="20"/>
               </w:rPr>
-              <w:t xml:space="preserve">，留待全文</w:t>
+              <w:t xml:space="preserve">，留待全文。老文献、看起来像成人或像其他科室的标题，只要标题里有游走脾 / 浮动脾 / 脾扭转等词、又没有明确的排除理由，也选 </w:t>
+            </w:r>
+            <w:r>
+              <w:rPr>
+                <w:rFonts w:ascii="Calibri" w:cs="Calibri" w:eastAsia="Microsoft YaHei" w:hAnsi="Calibri"/>
+                <w:b/>
+                <w:bCs/>
+                <w:sz w:val="20"/>
+                <w:szCs w:val="20"/>
+              </w:rPr>
+              <w:t xml:space="preserve">Maybe</w:t>
             </w:r>
           </w:p>
         </w:tc>
@@ -4153,22 +4299,27 @@
       <w:r>
         <w:rPr>
           <w:rFonts w:ascii="Calibri" w:cs="Calibri" w:eastAsia="Microsoft YaHei" w:hAnsi="Calibri"/>
-        </w:rPr>
-        <w:t xml:space="preserve">全文阶段另有：</w:t>
-      </w:r>
-      <w:r>
-        <w:rPr>
-          <w:rFonts w:ascii="Calibri" w:cs="Calibri" w:eastAsia="Microsoft YaHei" w:hAnsi="Calibri"/>
           <w:b/>
           <w:bCs/>
         </w:rPr>
-        <w:t xml:space="preserve">L 语言</w:t>
-      </w:r>
-      <w:r>
-        <w:rPr>
-          <w:rFonts w:ascii="Calibri" w:cs="Calibri" w:eastAsia="Microsoft YaHei" w:hAnsi="Calibri"/>
-        </w:rPr>
-        <w:t xml:space="preserve">（既非英文也非中文，单独计数）、</w:t>
+        <w:t xml:space="preserve">一条记录同时符合两条理由时</w:t>
+      </w:r>
+      <w:r>
+        <w:rPr>
+          <w:rFonts w:ascii="Calibri" w:cs="Calibri" w:eastAsia="Microsoft YaHei" w:hAnsi="Calibri"/>
+        </w:rPr>
+        <w:t xml:space="preserve">（例如成人的副脾：既是 E2 又是 E3），选任何一条适用的都可以，不用为此讨论。标题摘要阶段的理由不影响谁进入全文，只有全文阶段的理由才进入 PRISMA 图。（校准中，成人副脾那条两人选了同一条 E3，副脾患儿那条两人选了同一条 E2，没有造成分歧。）</w:t>
+      </w:r>
+    </w:p>
+    <w:p>
+      <w:pPr>
+        <w:spacing w:after="120"/>
+      </w:pPr>
+      <w:r>
+        <w:rPr>
+          <w:rFonts w:ascii="Calibri" w:cs="Calibri" w:eastAsia="Microsoft YaHei" w:hAnsi="Calibri"/>
+        </w:rPr>
+        <w:t xml:space="preserve">全文阶段另有：</w:t>
       </w:r>
       <w:r>
         <w:rPr>
@@ -4176,13 +4327,13 @@
           <w:b/>
           <w:bCs/>
         </w:rPr>
-        <w:t xml:space="preserve">D 无法获得全文</w:t>
-      </w:r>
-      <w:r>
-        <w:rPr>
-          <w:rFonts w:ascii="Calibri" w:cs="Calibri" w:eastAsia="Microsoft YaHei" w:hAnsi="Calibri"/>
-        </w:rPr>
-        <w:t xml:space="preserve">（记下尝试过的途径）、</w:t>
+        <w:t xml:space="preserve">L 语言</w:t>
+      </w:r>
+      <w:r>
+        <w:rPr>
+          <w:rFonts w:ascii="Calibri" w:cs="Calibri" w:eastAsia="Microsoft YaHei" w:hAnsi="Calibri"/>
+        </w:rPr>
+        <w:t xml:space="preserve">（既非英文也非中文，单独计数）、</w:t>
       </w:r>
       <w:r>
         <w:rPr>
@@ -4190,13 +4341,13 @@
           <w:b/>
           <w:bCs/>
         </w:rPr>
-        <w:t xml:space="preserve">A 仅有汇总数据</w:t>
-      </w:r>
-      <w:r>
-        <w:rPr>
-          <w:rFonts w:ascii="Calibri" w:cs="Calibri" w:eastAsia="Microsoft YaHei" w:hAnsi="Calibri"/>
-        </w:rPr>
-        <w:t xml:space="preserve">（见第 6 节）、</w:t>
+        <w:t xml:space="preserve">D 无法获得全文</w:t>
+      </w:r>
+      <w:r>
+        <w:rPr>
+          <w:rFonts w:ascii="Calibri" w:cs="Calibri" w:eastAsia="Microsoft YaHei" w:hAnsi="Calibri"/>
+        </w:rPr>
+        <w:t xml:space="preserve">（记下尝试过的途径）、</w:t>
       </w:r>
       <w:r>
         <w:rPr>
@@ -4204,6 +4355,20 @@
           <w:b/>
           <w:bCs/>
         </w:rPr>
+        <w:t xml:space="preserve">A 仅有汇总数据</w:t>
+      </w:r>
+      <w:r>
+        <w:rPr>
+          <w:rFonts w:ascii="Calibri" w:cs="Calibri" w:eastAsia="Microsoft YaHei" w:hAnsi="Calibri"/>
+        </w:rPr>
+        <w:t xml:space="preserve">（见第 6 节）、</w:t>
+      </w:r>
+      <w:r>
+        <w:rPr>
+          <w:rFonts w:ascii="Calibri" w:cs="Calibri" w:eastAsia="Microsoft YaHei" w:hAnsi="Calibri"/>
+          <w:b/>
+          <w:bCs/>
+        </w:rPr>
         <w:t xml:space="preserve">N 年龄无法确认小于 18 岁</w:t>
       </w:r>
       <w:r>
@@ -4580,7 +4745,7 @@
         <w:rPr>
           <w:rFonts w:ascii="Calibri" w:cs="Calibri" w:eastAsia="Microsoft YaHei" w:hAnsi="Calibri"/>
         </w:rPr>
-        <w:t xml:space="preserve">：协议只要求提取阶段报告 Cohen's kappa。标题摘要筛选阶段是否也报告？建议报告，以便读者评估。</w:t>
+        <w:t xml:space="preserve">：协议只要求提取阶段报告 Cohen's kappa。标题摘要筛选阶段是否也报告？建议报告，以便读者评估。（校准集的数字见第 11 节。）</w:t>
       </w:r>
     </w:p>
     <w:p>
@@ -4820,7 +4985,1040 @@
         <w:rPr>
           <w:rFonts w:ascii="Calibri" w:cs="Calibri" w:eastAsia="Microsoft YaHei" w:hAnsi="Calibri"/>
         </w:rPr>
-        <w:t xml:space="preserve">校准结束后，请把对本指南的修改记下来，并告诉我，我更新到文件里。</w:t>
+        <w:t xml:space="preserve">正式筛选中如果再发现指南没写清楚的情形，请记下记录编号和你的做法，告诉我，我更新到文件里，并在第 11 节记录。</w:t>
+      </w:r>
+    </w:p>
+    <w:p>
+      <w:pPr>
+        <w:pStyle w:val="Heading2"/>
+        <w:keepNext/>
+      </w:pPr>
+      <w:r>
+        <w:rPr>
+          <w:rFonts w:ascii="Calibri" w:cs="Calibri" w:eastAsia="Microsoft YaHei" w:hAnsi="Calibri"/>
+        </w:rPr>
+        <w:t xml:space="preserve">11. 校准结果和指南修订记录（2026 年 10 月 7 日）</w:t>
+      </w:r>
+    </w:p>
+    <w:p>
+      <w:pPr>
+        <w:spacing w:after="120"/>
+      </w:pPr>
+      <w:r>
+        <w:rPr>
+          <w:rFonts w:ascii="Calibri" w:cs="Calibri" w:eastAsia="Microsoft YaHei" w:hAnsi="Calibri"/>
+          <w:b/>
+          <w:bCs/>
+        </w:rPr>
+        <w:t xml:space="preserve">校准做了什么：</w:t>
+      </w:r>
+      <w:r>
+        <w:rPr>
+          <w:rFonts w:ascii="Calibri" w:cs="Calibri" w:eastAsia="Microsoft YaHei" w:hAnsi="Calibri"/>
+        </w:rPr>
+        <w:t xml:space="preserve"> 50 条随机样本（从 2,548 条中抽取，随机种子 20261004），舒俊（R1）和彭飞（R2）在盲法开启的独立 Rayyan 项目里各自筛选，2026 年 10 月 5 日完成。结果表见 </w:t>
+      </w:r>
+      <w:r>
+        <w:rPr>
+          <w:rFonts w:ascii="Consolas" w:cs="Consolas" w:eastAsia="Microsoft YaHei" w:hAnsi="Consolas"/>
+          <w:sz w:val="19"/>
+          <w:szCs w:val="19"/>
+          <w:shd w:fill="EEEEEE" w:val="clear"/>
+        </w:rPr>
+        <w:t xml:space="preserve">search/screening/calibration_results_filled.csv</w:t>
+      </w:r>
+      <w:r>
+        <w:rPr>
+          <w:rFonts w:ascii="Calibri" w:cs="Calibri" w:eastAsia="Microsoft YaHei" w:hAnsi="Calibri"/>
+        </w:rPr>
+        <w:t xml:space="preserve">，分析脚本见 </w:t>
+      </w:r>
+      <w:r>
+        <w:rPr>
+          <w:rFonts w:ascii="Consolas" w:cs="Consolas" w:eastAsia="Microsoft YaHei" w:hAnsi="Consolas"/>
+          <w:sz w:val="19"/>
+          <w:szCs w:val="19"/>
+          <w:shd w:fill="EEEEEE" w:val="clear"/>
+        </w:rPr>
+        <w:t xml:space="preserve">tools/calib_analysis.py</w:t>
+      </w:r>
+      <w:r>
+        <w:rPr>
+          <w:rFonts w:ascii="Calibri" w:cs="Calibri" w:eastAsia="Microsoft YaHei" w:hAnsi="Calibri"/>
+        </w:rPr>
+        <w:t xml:space="preserve">。</w:t>
+      </w:r>
+    </w:p>
+    <w:p>
+      <w:pPr>
+        <w:spacing w:after="120"/>
+      </w:pPr>
+      <w:r>
+        <w:rPr>
+          <w:rFonts w:ascii="Calibri" w:cs="Calibri" w:eastAsia="Microsoft YaHei" w:hAnsi="Calibri"/>
+          <w:b/>
+          <w:bCs/>
+        </w:rPr>
+        <w:t xml:space="preserve">结果：</w:t>
+      </w:r>
+    </w:p>
+    <w:tbl>
+      <w:tblPr>
+        <w:tblW w:type="dxa" w:w="9026"/>
+        <w:tblBorders>
+          <w:top w:val="single" w:color="auto" w:sz="4"/>
+          <w:left w:val="single" w:color="auto" w:sz="4"/>
+          <w:bottom w:val="single" w:color="auto" w:sz="4"/>
+          <w:right w:val="single" w:color="auto" w:sz="4"/>
+          <w:insideH w:val="single" w:color="auto" w:sz="4"/>
+          <w:insideV w:val="single" w:color="auto" w:sz="4"/>
+        </w:tblBorders>
+      </w:tblPr>
+      <w:tblGrid>
+        <w:gridCol w:w="900"/>
+        <w:gridCol w:w="2400"/>
+        <w:gridCol w:w="5726"/>
+      </w:tblGrid>
+      <w:tr>
+        <w:trPr>
+          <w:cantSplit/>
+          <w:tblHeader/>
+        </w:trPr>
+        <w:tc>
+          <w:tcPr>
+            <w:tcW w:type="dxa" w:w="900"/>
+            <w:tcBorders>
+              <w:top w:val="single" w:color="BBBBBB" w:sz="4"/>
+              <w:left w:val="single" w:color="BBBBBB" w:sz="4"/>
+              <w:bottom w:val="single" w:color="BBBBBB" w:sz="4"/>
+              <w:right w:val="single" w:color="BBBBBB" w:sz="4"/>
+            </w:tcBorders>
+            <w:shd w:fill="E8EEF4" w:val="clear"/>
+            <w:tcMar>
+              <w:top w:type="dxa" w:w="60"/>
+              <w:left w:type="dxa" w:w="100"/>
+              <w:bottom w:type="dxa" w:w="60"/>
+              <w:right w:type="dxa" w:w="100"/>
+            </w:tcMar>
+          </w:tcPr>
+          <w:p>
+            <w:r>
+              <w:rPr>
+                <w:rFonts w:ascii="Calibri" w:cs="Calibri" w:eastAsia="Microsoft YaHei" w:hAnsi="Calibri"/>
+                <w:b/>
+                <w:bCs/>
+                <w:sz w:val="20"/>
+                <w:szCs w:val="20"/>
+              </w:rPr>
+              <w:t xml:space="preserve">项目</w:t>
+            </w:r>
+          </w:p>
+        </w:tc>
+        <w:tc>
+          <w:tcPr>
+            <w:tcW w:type="dxa" w:w="2400"/>
+            <w:tcBorders>
+              <w:top w:val="single" w:color="BBBBBB" w:sz="4"/>
+              <w:left w:val="single" w:color="BBBBBB" w:sz="4"/>
+              <w:bottom w:val="single" w:color="BBBBBB" w:sz="4"/>
+              <w:right w:val="single" w:color="BBBBBB" w:sz="4"/>
+            </w:tcBorders>
+            <w:shd w:fill="E8EEF4" w:val="clear"/>
+            <w:tcMar>
+              <w:top w:type="dxa" w:w="60"/>
+              <w:left w:type="dxa" w:w="100"/>
+              <w:bottom w:type="dxa" w:w="60"/>
+              <w:right w:type="dxa" w:w="100"/>
+            </w:tcMar>
+          </w:tcPr>
+          <w:p>
+            <w:r>
+              <w:rPr>
+                <w:rFonts w:ascii="Calibri" w:cs="Calibri" w:eastAsia="Microsoft YaHei" w:hAnsi="Calibri"/>
+                <w:b/>
+                <w:bCs/>
+                <w:sz w:val="20"/>
+                <w:szCs w:val="20"/>
+              </w:rPr>
+              <w:t xml:space="preserve">R1（舒俊）</w:t>
+            </w:r>
+          </w:p>
+        </w:tc>
+        <w:tc>
+          <w:tcPr>
+            <w:tcW w:type="dxa" w:w="5726"/>
+            <w:tcBorders>
+              <w:top w:val="single" w:color="BBBBBB" w:sz="4"/>
+              <w:left w:val="single" w:color="BBBBBB" w:sz="4"/>
+              <w:bottom w:val="single" w:color="BBBBBB" w:sz="4"/>
+              <w:right w:val="single" w:color="BBBBBB" w:sz="4"/>
+            </w:tcBorders>
+            <w:shd w:fill="E8EEF4" w:val="clear"/>
+            <w:tcMar>
+              <w:top w:type="dxa" w:w="60"/>
+              <w:left w:type="dxa" w:w="100"/>
+              <w:bottom w:type="dxa" w:w="60"/>
+              <w:right w:type="dxa" w:w="100"/>
+            </w:tcMar>
+          </w:tcPr>
+          <w:p>
+            <w:r>
+              <w:rPr>
+                <w:rFonts w:ascii="Calibri" w:cs="Calibri" w:eastAsia="Microsoft YaHei" w:hAnsi="Calibri"/>
+                <w:b/>
+                <w:bCs/>
+                <w:sz w:val="20"/>
+                <w:szCs w:val="20"/>
+              </w:rPr>
+              <w:t xml:space="preserve">R2（彭飞）</w:t>
+            </w:r>
+          </w:p>
+        </w:tc>
+      </w:tr>
+      <w:tr>
+        <w:trPr>
+          <w:cantSplit/>
+          <w:tblHeader w:val="false"/>
+        </w:trPr>
+        <w:tc>
+          <w:tcPr>
+            <w:tcW w:type="dxa" w:w="900"/>
+            <w:tcBorders>
+              <w:top w:val="single" w:color="BBBBBB" w:sz="4"/>
+              <w:left w:val="single" w:color="BBBBBB" w:sz="4"/>
+              <w:bottom w:val="single" w:color="BBBBBB" w:sz="4"/>
+              <w:right w:val="single" w:color="BBBBBB" w:sz="4"/>
+            </w:tcBorders>
+            <w:tcMar>
+              <w:top w:type="dxa" w:w="60"/>
+              <w:left w:type="dxa" w:w="100"/>
+              <w:bottom w:type="dxa" w:w="60"/>
+              <w:right w:type="dxa" w:w="100"/>
+            </w:tcMar>
+          </w:tcPr>
+          <w:p>
+            <w:r>
+              <w:rPr>
+                <w:rFonts w:ascii="Calibri" w:cs="Calibri" w:eastAsia="Microsoft YaHei" w:hAnsi="Calibri"/>
+                <w:sz w:val="20"/>
+                <w:szCs w:val="20"/>
+              </w:rPr>
+              <w:t xml:space="preserve">Include / Maybe / Exclude</w:t>
+            </w:r>
+          </w:p>
+        </w:tc>
+        <w:tc>
+          <w:tcPr>
+            <w:tcW w:type="dxa" w:w="2400"/>
+            <w:tcBorders>
+              <w:top w:val="single" w:color="BBBBBB" w:sz="4"/>
+              <w:left w:val="single" w:color="BBBBBB" w:sz="4"/>
+              <w:bottom w:val="single" w:color="BBBBBB" w:sz="4"/>
+              <w:right w:val="single" w:color="BBBBBB" w:sz="4"/>
+            </w:tcBorders>
+            <w:tcMar>
+              <w:top w:type="dxa" w:w="60"/>
+              <w:left w:type="dxa" w:w="100"/>
+              <w:bottom w:type="dxa" w:w="60"/>
+              <w:right w:type="dxa" w:w="100"/>
+            </w:tcMar>
+          </w:tcPr>
+          <w:p>
+            <w:r>
+              <w:rPr>
+                <w:rFonts w:ascii="Calibri" w:cs="Calibri" w:eastAsia="Microsoft YaHei" w:hAnsi="Calibri"/>
+                <w:sz w:val="20"/>
+                <w:szCs w:val="20"/>
+              </w:rPr>
+              <w:t xml:space="preserve">7 / 21 / 22</w:t>
+            </w:r>
+          </w:p>
+        </w:tc>
+        <w:tc>
+          <w:tcPr>
+            <w:tcW w:type="dxa" w:w="5726"/>
+            <w:tcBorders>
+              <w:top w:val="single" w:color="BBBBBB" w:sz="4"/>
+              <w:left w:val="single" w:color="BBBBBB" w:sz="4"/>
+              <w:bottom w:val="single" w:color="BBBBBB" w:sz="4"/>
+              <w:right w:val="single" w:color="BBBBBB" w:sz="4"/>
+            </w:tcBorders>
+            <w:tcMar>
+              <w:top w:type="dxa" w:w="60"/>
+              <w:left w:type="dxa" w:w="100"/>
+              <w:bottom w:type="dxa" w:w="60"/>
+              <w:right w:type="dxa" w:w="100"/>
+            </w:tcMar>
+          </w:tcPr>
+          <w:p>
+            <w:r>
+              <w:rPr>
+                <w:rFonts w:ascii="Calibri" w:cs="Calibri" w:eastAsia="Microsoft YaHei" w:hAnsi="Calibri"/>
+                <w:sz w:val="20"/>
+                <w:szCs w:val="20"/>
+              </w:rPr>
+              <w:t xml:space="preserve">6 / 18 / 26</w:t>
+            </w:r>
+          </w:p>
+        </w:tc>
+      </w:tr>
+      <w:tr>
+        <w:trPr>
+          <w:cantSplit/>
+          <w:tblHeader w:val="false"/>
+        </w:trPr>
+        <w:tc>
+          <w:tcPr>
+            <w:tcW w:type="dxa" w:w="900"/>
+            <w:tcBorders>
+              <w:top w:val="single" w:color="BBBBBB" w:sz="4"/>
+              <w:left w:val="single" w:color="BBBBBB" w:sz="4"/>
+              <w:bottom w:val="single" w:color="BBBBBB" w:sz="4"/>
+              <w:right w:val="single" w:color="BBBBBB" w:sz="4"/>
+            </w:tcBorders>
+            <w:tcMar>
+              <w:top w:type="dxa" w:w="60"/>
+              <w:left w:type="dxa" w:w="100"/>
+              <w:bottom w:type="dxa" w:w="60"/>
+              <w:right w:type="dxa" w:w="100"/>
+            </w:tcMar>
+          </w:tcPr>
+          <w:p>
+            <w:r>
+              <w:rPr>
+                <w:rFonts w:ascii="Calibri" w:cs="Calibri" w:eastAsia="Microsoft YaHei" w:hAnsi="Calibri"/>
+                <w:sz w:val="20"/>
+                <w:szCs w:val="20"/>
+              </w:rPr>
+              <w:t xml:space="preserve">排除理由（E3 / E2 / E1 / E4）</w:t>
+            </w:r>
+          </w:p>
+        </w:tc>
+        <w:tc>
+          <w:tcPr>
+            <w:tcW w:type="dxa" w:w="2400"/>
+            <w:tcBorders>
+              <w:top w:val="single" w:color="BBBBBB" w:sz="4"/>
+              <w:left w:val="single" w:color="BBBBBB" w:sz="4"/>
+              <w:bottom w:val="single" w:color="BBBBBB" w:sz="4"/>
+              <w:right w:val="single" w:color="BBBBBB" w:sz="4"/>
+            </w:tcBorders>
+            <w:tcMar>
+              <w:top w:type="dxa" w:w="60"/>
+              <w:left w:type="dxa" w:w="100"/>
+              <w:bottom w:type="dxa" w:w="60"/>
+              <w:right w:type="dxa" w:w="100"/>
+            </w:tcMar>
+          </w:tcPr>
+          <w:p>
+            <w:r>
+              <w:rPr>
+                <w:rFonts w:ascii="Calibri" w:cs="Calibri" w:eastAsia="Microsoft YaHei" w:hAnsi="Calibri"/>
+                <w:sz w:val="20"/>
+                <w:szCs w:val="20"/>
+              </w:rPr>
+              <w:t xml:space="preserve">10 / 7 / 3 / 2</w:t>
+            </w:r>
+          </w:p>
+        </w:tc>
+        <w:tc>
+          <w:tcPr>
+            <w:tcW w:type="dxa" w:w="5726"/>
+            <w:tcBorders>
+              <w:top w:val="single" w:color="BBBBBB" w:sz="4"/>
+              <w:left w:val="single" w:color="BBBBBB" w:sz="4"/>
+              <w:bottom w:val="single" w:color="BBBBBB" w:sz="4"/>
+              <w:right w:val="single" w:color="BBBBBB" w:sz="4"/>
+            </w:tcBorders>
+            <w:tcMar>
+              <w:top w:type="dxa" w:w="60"/>
+              <w:left w:type="dxa" w:w="100"/>
+              <w:bottom w:type="dxa" w:w="60"/>
+              <w:right w:type="dxa" w:w="100"/>
+            </w:tcMar>
+          </w:tcPr>
+          <w:p>
+            <w:r>
+              <w:rPr>
+                <w:rFonts w:ascii="Calibri" w:cs="Calibri" w:eastAsia="Microsoft YaHei" w:hAnsi="Calibri"/>
+                <w:sz w:val="20"/>
+                <w:szCs w:val="20"/>
+              </w:rPr>
+              <w:t xml:space="preserve">10 / 7 / 3 / 2</w:t>
+            </w:r>
+          </w:p>
+        </w:tc>
+      </w:tr>
+      <w:tr>
+        <w:trPr>
+          <w:cantSplit/>
+          <w:tblHeader w:val="false"/>
+        </w:trPr>
+        <w:tc>
+          <w:tcPr>
+            <w:tcW w:type="dxa" w:w="900"/>
+            <w:tcBorders>
+              <w:top w:val="single" w:color="BBBBBB" w:sz="4"/>
+              <w:left w:val="single" w:color="BBBBBB" w:sz="4"/>
+              <w:bottom w:val="single" w:color="BBBBBB" w:sz="4"/>
+              <w:right w:val="single" w:color="BBBBBB" w:sz="4"/>
+            </w:tcBorders>
+            <w:tcMar>
+              <w:top w:type="dxa" w:w="60"/>
+              <w:left w:type="dxa" w:w="100"/>
+              <w:bottom w:type="dxa" w:w="60"/>
+              <w:right w:type="dxa" w:w="100"/>
+            </w:tcMar>
+          </w:tcPr>
+          <w:p>
+            <w:r>
+              <w:rPr>
+                <w:rFonts w:ascii="Calibri" w:cs="Calibri" w:eastAsia="Microsoft YaHei" w:hAnsi="Calibri"/>
+                <w:sz w:val="20"/>
+                <w:szCs w:val="20"/>
+              </w:rPr>
+              <w:t xml:space="preserve">从第一个到最后一个决定的间隔</w:t>
+            </w:r>
+          </w:p>
+        </w:tc>
+        <w:tc>
+          <w:tcPr>
+            <w:tcW w:type="dxa" w:w="2400"/>
+            <w:tcBorders>
+              <w:top w:val="single" w:color="BBBBBB" w:sz="4"/>
+              <w:left w:val="single" w:color="BBBBBB" w:sz="4"/>
+              <w:bottom w:val="single" w:color="BBBBBB" w:sz="4"/>
+              <w:right w:val="single" w:color="BBBBBB" w:sz="4"/>
+            </w:tcBorders>
+            <w:tcMar>
+              <w:top w:type="dxa" w:w="60"/>
+              <w:left w:type="dxa" w:w="100"/>
+              <w:bottom w:type="dxa" w:w="60"/>
+              <w:right w:type="dxa" w:w="100"/>
+            </w:tcMar>
+          </w:tcPr>
+          <w:p>
+            <w:r>
+              <w:rPr>
+                <w:rFonts w:ascii="Calibri" w:cs="Calibri" w:eastAsia="Microsoft YaHei" w:hAnsi="Calibri"/>
+                <w:sz w:val="20"/>
+                <w:szCs w:val="20"/>
+              </w:rPr>
+              <w:t xml:space="preserve">约 48 分钟（去掉三次超过 2 分钟的停顿约 20 分钟；本人估计约 30 分钟）</w:t>
+            </w:r>
+          </w:p>
+        </w:tc>
+        <w:tc>
+          <w:tcPr>
+            <w:tcW w:type="dxa" w:w="5726"/>
+            <w:tcBorders>
+              <w:top w:val="single" w:color="BBBBBB" w:sz="4"/>
+              <w:left w:val="single" w:color="BBBBBB" w:sz="4"/>
+              <w:bottom w:val="single" w:color="BBBBBB" w:sz="4"/>
+              <w:right w:val="single" w:color="BBBBBB" w:sz="4"/>
+            </w:tcBorders>
+            <w:tcMar>
+              <w:top w:type="dxa" w:w="60"/>
+              <w:left w:type="dxa" w:w="100"/>
+              <w:bottom w:type="dxa" w:w="60"/>
+              <w:right w:type="dxa" w:w="100"/>
+            </w:tcMar>
+          </w:tcPr>
+          <w:p>
+            <w:r>
+              <w:rPr>
+                <w:rFonts w:ascii="Calibri" w:cs="Calibri" w:eastAsia="Microsoft YaHei" w:hAnsi="Calibri"/>
+                <w:sz w:val="20"/>
+                <w:szCs w:val="20"/>
+              </w:rPr>
+              <w:t xml:space="preserve">约 10 分钟</w:t>
+            </w:r>
+          </w:p>
+        </w:tc>
+      </w:tr>
+    </w:tbl>
+    <w:p>
+      <w:pPr>
+        <w:spacing w:after="120"/>
+      </w:pPr>
+    </w:p>
+    <w:p>
+      <w:pPr>
+        <w:pStyle w:val="ListParagraph"/>
+        <w:numPr>
+          <w:ilvl w:val="0"/>
+          <w:numId w:val="2"/>
+        </w:numPr>
+        <w:spacing w:after="60"/>
+      </w:pPr>
+      <w:r>
+        <w:rPr>
+          <w:rFonts w:ascii="Calibri" w:cs="Calibri" w:eastAsia="Microsoft YaHei" w:hAnsi="Calibri"/>
+          <w:b/>
+          <w:bCs/>
+        </w:rPr>
+        <w:t xml:space="preserve">一致率：</w:t>
+      </w:r>
+      <w:r>
+        <w:rPr>
+          <w:rFonts w:ascii="Calibri" w:cs="Calibri" w:eastAsia="Microsoft YaHei" w:hAnsi="Calibri"/>
+        </w:rPr>
+        <w:t xml:space="preserve"> 三分类 45/50 = 90.0%，Cohen's kappa 0.83（简单公式估算的 95% 区间约 0.70–0.97，n = 50）；进入全文（Include 或 Maybe）对排除：46/50 = 92.0%，kappa 0.84。</w:t>
+      </w:r>
+    </w:p>
+    <w:p>
+      <w:pPr>
+        <w:pStyle w:val="ListParagraph"/>
+        <w:numPr>
+          <w:ilvl w:val="0"/>
+          <w:numId w:val="2"/>
+        </w:numPr>
+        <w:spacing w:after="60"/>
+      </w:pPr>
+      <w:r>
+        <w:rPr>
+          <w:rFonts w:ascii="Calibri" w:cs="Calibri" w:eastAsia="Microsoft YaHei" w:hAnsi="Calibri"/>
+          <w:b/>
+          <w:bCs/>
+        </w:rPr>
+        <w:t xml:space="preserve">5 条分歧全部是没有摘要的记录</w:t>
+      </w:r>
+      <w:r>
+        <w:rPr>
+          <w:rFonts w:ascii="Calibri" w:cs="Calibri" w:eastAsia="Microsoft YaHei" w:hAnsi="Calibri"/>
+        </w:rPr>
+        <w:t xml:space="preserve">（共 11 条没有摘要；39 条有摘要的 0 条分歧）：1 条是 R1 Include 对 R2 Maybe；4 条是 R1 Maybe 对 R2 Exclude，而这 4 条 Exclude 都没有选排除理由。</w:t>
+      </w:r>
+    </w:p>
+    <w:p>
+      <w:pPr>
+        <w:pStyle w:val="ListParagraph"/>
+        <w:numPr>
+          <w:ilvl w:val="0"/>
+          <w:numId w:val="2"/>
+        </w:numPr>
+        <w:spacing w:after="60"/>
+      </w:pPr>
+      <w:r>
+        <w:rPr>
+          <w:rFonts w:ascii="Calibri" w:cs="Calibri" w:eastAsia="Microsoft YaHei" w:hAnsi="Calibri"/>
+        </w:rPr>
+        <w:t xml:space="preserve">两人都排除的 22 条，理由完全相同。两人都没有用 Rayyan 的默认理由。</w:t>
+      </w:r>
+    </w:p>
+    <w:p>
+      <w:pPr>
+        <w:pStyle w:val="ListParagraph"/>
+        <w:numPr>
+          <w:ilvl w:val="0"/>
+          <w:numId w:val="2"/>
+        </w:numPr>
+        <w:spacing w:after="60"/>
+      </w:pPr>
+      <w:r>
+        <w:rPr>
+          <w:rFonts w:ascii="Calibri" w:cs="Calibri" w:eastAsia="Microsoft YaHei" w:hAnsi="Calibri"/>
+        </w:rPr>
+        <w:t xml:space="preserve">作者和期刊信息在 R1 筛选过程中从隐藏变成了显示，R1 回忆没有点过 Show，原因不明；R2 是否也看到过，待确认。</w:t>
+      </w:r>
+    </w:p>
+    <w:p>
+      <w:pPr>
+        <w:spacing w:after="120"/>
+      </w:pPr>
+      <w:r>
+        <w:rPr>
+          <w:rFonts w:ascii="Calibri" w:cs="Calibri" w:eastAsia="Microsoft YaHei" w:hAnsi="Calibri"/>
+          <w:b/>
+          <w:bCs/>
+        </w:rPr>
+        <w:t xml:space="preserve">据此修订的内容（2026 年 10 月 7 日由舒俊同意；彭飞和杨军的确认待做）：</w:t>
+      </w:r>
+    </w:p>
+    <w:tbl>
+      <w:tblPr>
+        <w:tblW w:type="dxa" w:w="9026"/>
+        <w:tblBorders>
+          <w:top w:val="single" w:color="auto" w:sz="4"/>
+          <w:left w:val="single" w:color="auto" w:sz="4"/>
+          <w:bottom w:val="single" w:color="auto" w:sz="4"/>
+          <w:right w:val="single" w:color="auto" w:sz="4"/>
+          <w:insideH w:val="single" w:color="auto" w:sz="4"/>
+          <w:insideV w:val="single" w:color="auto" w:sz="4"/>
+        </w:tblBorders>
+      </w:tblPr>
+      <w:tblGrid>
+        <w:gridCol w:w="4300"/>
+        <w:gridCol w:w="4726"/>
+      </w:tblGrid>
+      <w:tr>
+        <w:trPr>
+          <w:cantSplit/>
+          <w:tblHeader/>
+        </w:trPr>
+        <w:tc>
+          <w:tcPr>
+            <w:tcW w:type="dxa" w:w="4300"/>
+            <w:tcBorders>
+              <w:top w:val="single" w:color="BBBBBB" w:sz="4"/>
+              <w:left w:val="single" w:color="BBBBBB" w:sz="4"/>
+              <w:bottom w:val="single" w:color="BBBBBB" w:sz="4"/>
+              <w:right w:val="single" w:color="BBBBBB" w:sz="4"/>
+            </w:tcBorders>
+            <w:shd w:fill="E8EEF4" w:val="clear"/>
+            <w:tcMar>
+              <w:top w:type="dxa" w:w="60"/>
+              <w:left w:type="dxa" w:w="100"/>
+              <w:bottom w:type="dxa" w:w="60"/>
+              <w:right w:type="dxa" w:w="100"/>
+            </w:tcMar>
+          </w:tcPr>
+          <w:p>
+            <w:r>
+              <w:rPr>
+                <w:rFonts w:ascii="Calibri" w:cs="Calibri" w:eastAsia="Microsoft YaHei" w:hAnsi="Calibri"/>
+                <w:b/>
+                <w:bCs/>
+                <w:sz w:val="20"/>
+                <w:szCs w:val="20"/>
+              </w:rPr>
+              <w:t xml:space="preserve">修订</w:t>
+            </w:r>
+          </w:p>
+        </w:tc>
+        <w:tc>
+          <w:tcPr>
+            <w:tcW w:type="dxa" w:w="4726"/>
+            <w:tcBorders>
+              <w:top w:val="single" w:color="BBBBBB" w:sz="4"/>
+              <w:left w:val="single" w:color="BBBBBB" w:sz="4"/>
+              <w:bottom w:val="single" w:color="BBBBBB" w:sz="4"/>
+              <w:right w:val="single" w:color="BBBBBB" w:sz="4"/>
+            </w:tcBorders>
+            <w:shd w:fill="E8EEF4" w:val="clear"/>
+            <w:tcMar>
+              <w:top w:type="dxa" w:w="60"/>
+              <w:left w:type="dxa" w:w="100"/>
+              <w:bottom w:type="dxa" w:w="60"/>
+              <w:right w:type="dxa" w:w="100"/>
+            </w:tcMar>
+          </w:tcPr>
+          <w:p>
+            <w:r>
+              <w:rPr>
+                <w:rFonts w:ascii="Calibri" w:cs="Calibri" w:eastAsia="Microsoft YaHei" w:hAnsi="Calibri"/>
+                <w:b/>
+                <w:bCs/>
+                <w:sz w:val="20"/>
+                <w:szCs w:val="20"/>
+              </w:rPr>
+              <w:t xml:space="preserve">位置</w:t>
+            </w:r>
+          </w:p>
+        </w:tc>
+      </w:tr>
+      <w:tr>
+        <w:trPr>
+          <w:cantSplit/>
+          <w:tblHeader w:val="false"/>
+        </w:trPr>
+        <w:tc>
+          <w:tcPr>
+            <w:tcW w:type="dxa" w:w="4300"/>
+            <w:tcBorders>
+              <w:top w:val="single" w:color="BBBBBB" w:sz="4"/>
+              <w:left w:val="single" w:color="BBBBBB" w:sz="4"/>
+              <w:bottom w:val="single" w:color="BBBBBB" w:sz="4"/>
+              <w:right w:val="single" w:color="BBBBBB" w:sz="4"/>
+            </w:tcBorders>
+            <w:tcMar>
+              <w:top w:type="dxa" w:w="60"/>
+              <w:left w:type="dxa" w:w="100"/>
+              <w:bottom w:type="dxa" w:w="60"/>
+              <w:right w:type="dxa" w:w="100"/>
+            </w:tcMar>
+          </w:tcPr>
+          <w:p>
+            <w:r>
+              <w:rPr>
+                <w:rFonts w:ascii="Calibri" w:cs="Calibri" w:eastAsia="Microsoft YaHei" w:hAnsi="Calibri"/>
+                <w:sz w:val="20"/>
+                <w:szCs w:val="20"/>
+              </w:rPr>
+              <w:t xml:space="preserve">Exclude 必须能说出 E1–E6 里的哪一条；说不出就选 Maybe</w:t>
+            </w:r>
+          </w:p>
+        </w:tc>
+        <w:tc>
+          <w:tcPr>
+            <w:tcW w:type="dxa" w:w="4726"/>
+            <w:tcBorders>
+              <w:top w:val="single" w:color="BBBBBB" w:sz="4"/>
+              <w:left w:val="single" w:color="BBBBBB" w:sz="4"/>
+              <w:bottom w:val="single" w:color="BBBBBB" w:sz="4"/>
+              <w:right w:val="single" w:color="BBBBBB" w:sz="4"/>
+            </w:tcBorders>
+            <w:tcMar>
+              <w:top w:type="dxa" w:w="60"/>
+              <w:left w:type="dxa" w:w="100"/>
+              <w:bottom w:type="dxa" w:w="60"/>
+              <w:right w:type="dxa" w:w="100"/>
+            </w:tcMar>
+          </w:tcPr>
+          <w:p>
+            <w:r>
+              <w:rPr>
+                <w:rFonts w:ascii="Calibri" w:cs="Calibri" w:eastAsia="Microsoft YaHei" w:hAnsi="Calibri"/>
+                <w:sz w:val="20"/>
+                <w:szCs w:val="20"/>
+              </w:rPr>
+              <w:t xml:space="preserve">第 3 节、第 4 节开头</w:t>
+            </w:r>
+          </w:p>
+        </w:tc>
+      </w:tr>
+      <w:tr>
+        <w:trPr>
+          <w:cantSplit/>
+          <w:tblHeader w:val="false"/>
+        </w:trPr>
+        <w:tc>
+          <w:tcPr>
+            <w:tcW w:type="dxa" w:w="4300"/>
+            <w:tcBorders>
+              <w:top w:val="single" w:color="BBBBBB" w:sz="4"/>
+              <w:left w:val="single" w:color="BBBBBB" w:sz="4"/>
+              <w:bottom w:val="single" w:color="BBBBBB" w:sz="4"/>
+              <w:right w:val="single" w:color="BBBBBB" w:sz="4"/>
+            </w:tcBorders>
+            <w:tcMar>
+              <w:top w:type="dxa" w:w="60"/>
+              <w:left w:type="dxa" w:w="100"/>
+              <w:bottom w:type="dxa" w:w="60"/>
+              <w:right w:type="dxa" w:w="100"/>
+            </w:tcMar>
+          </w:tcPr>
+          <w:p>
+            <w:r>
+              <w:rPr>
+                <w:rFonts w:ascii="Calibri" w:cs="Calibri" w:eastAsia="Microsoft YaHei" w:hAnsi="Calibri"/>
+                <w:sz w:val="20"/>
+                <w:szCs w:val="20"/>
+              </w:rPr>
+              <w:t xml:space="preserve">没有摘要的记录只用 Maybe 或 Exclude，不用 Include；Exclude 要有明确理由</w:t>
+            </w:r>
+          </w:p>
+        </w:tc>
+        <w:tc>
+          <w:tcPr>
+            <w:tcW w:type="dxa" w:w="4726"/>
+            <w:tcBorders>
+              <w:top w:val="single" w:color="BBBBBB" w:sz="4"/>
+              <w:left w:val="single" w:color="BBBBBB" w:sz="4"/>
+              <w:bottom w:val="single" w:color="BBBBBB" w:sz="4"/>
+              <w:right w:val="single" w:color="BBBBBB" w:sz="4"/>
+            </w:tcBorders>
+            <w:tcMar>
+              <w:top w:type="dxa" w:w="60"/>
+              <w:left w:type="dxa" w:w="100"/>
+              <w:bottom w:type="dxa" w:w="60"/>
+              <w:right w:type="dxa" w:w="100"/>
+            </w:tcMar>
+          </w:tcPr>
+          <w:p>
+            <w:r>
+              <w:rPr>
+                <w:rFonts w:ascii="Calibri" w:cs="Calibri" w:eastAsia="Microsoft YaHei" w:hAnsi="Calibri"/>
+                <w:sz w:val="20"/>
+                <w:szCs w:val="20"/>
+              </w:rPr>
+              <w:t xml:space="preserve">4.3 节</w:t>
+            </w:r>
+          </w:p>
+        </w:tc>
+      </w:tr>
+      <w:tr>
+        <w:trPr>
+          <w:cantSplit/>
+          <w:tblHeader w:val="false"/>
+        </w:trPr>
+        <w:tc>
+          <w:tcPr>
+            <w:tcW w:type="dxa" w:w="4300"/>
+            <w:tcBorders>
+              <w:top w:val="single" w:color="BBBBBB" w:sz="4"/>
+              <w:left w:val="single" w:color="BBBBBB" w:sz="4"/>
+              <w:bottom w:val="single" w:color="BBBBBB" w:sz="4"/>
+              <w:right w:val="single" w:color="BBBBBB" w:sz="4"/>
+            </w:tcBorders>
+            <w:tcMar>
+              <w:top w:type="dxa" w:w="60"/>
+              <w:left w:type="dxa" w:w="100"/>
+              <w:bottom w:type="dxa" w:w="60"/>
+              <w:right w:type="dxa" w:w="100"/>
+            </w:tcMar>
+          </w:tcPr>
+          <w:p>
+            <w:r>
+              <w:rPr>
+                <w:rFonts w:ascii="Calibri" w:cs="Calibri" w:eastAsia="Microsoft YaHei" w:hAnsi="Calibri"/>
+                <w:sz w:val="20"/>
+                <w:szCs w:val="20"/>
+              </w:rPr>
+              <w:t xml:space="preserve">标题摘要阶段排除理由保持必选（数据显示：没选理由的 4 条 Exclude 正是分歧所在）</w:t>
+            </w:r>
+          </w:p>
+        </w:tc>
+        <w:tc>
+          <w:tcPr>
+            <w:tcW w:type="dxa" w:w="4726"/>
+            <w:tcBorders>
+              <w:top w:val="single" w:color="BBBBBB" w:sz="4"/>
+              <w:left w:val="single" w:color="BBBBBB" w:sz="4"/>
+              <w:bottom w:val="single" w:color="BBBBBB" w:sz="4"/>
+              <w:right w:val="single" w:color="BBBBBB" w:sz="4"/>
+            </w:tcBorders>
+            <w:tcMar>
+              <w:top w:type="dxa" w:w="60"/>
+              <w:left w:type="dxa" w:w="100"/>
+              <w:bottom w:type="dxa" w:w="60"/>
+              <w:right w:type="dxa" w:w="100"/>
+            </w:tcMar>
+          </w:tcPr>
+          <w:p>
+            <w:r>
+              <w:rPr>
+                <w:rFonts w:ascii="Calibri" w:cs="Calibri" w:eastAsia="Microsoft YaHei" w:hAnsi="Calibri"/>
+                <w:sz w:val="20"/>
+                <w:szCs w:val="20"/>
+              </w:rPr>
+              <w:t xml:space="preserve">第 3 节</w:t>
+            </w:r>
+          </w:p>
+        </w:tc>
+      </w:tr>
+      <w:tr>
+        <w:trPr>
+          <w:cantSplit/>
+          <w:tblHeader w:val="false"/>
+        </w:trPr>
+        <w:tc>
+          <w:tcPr>
+            <w:tcW w:type="dxa" w:w="4300"/>
+            <w:tcBorders>
+              <w:top w:val="single" w:color="BBBBBB" w:sz="4"/>
+              <w:left w:val="single" w:color="BBBBBB" w:sz="4"/>
+              <w:bottom w:val="single" w:color="BBBBBB" w:sz="4"/>
+              <w:right w:val="single" w:color="BBBBBB" w:sz="4"/>
+            </w:tcBorders>
+            <w:tcMar>
+              <w:top w:type="dxa" w:w="60"/>
+              <w:left w:type="dxa" w:w="100"/>
+              <w:bottom w:type="dxa" w:w="60"/>
+              <w:right w:type="dxa" w:w="100"/>
+            </w:tcMar>
+          </w:tcPr>
+          <w:p>
+            <w:r>
+              <w:rPr>
+                <w:rFonts w:ascii="Calibri" w:cs="Calibri" w:eastAsia="Microsoft YaHei" w:hAnsi="Calibri"/>
+                <w:sz w:val="20"/>
+                <w:szCs w:val="20"/>
+              </w:rPr>
+              <w:t xml:space="preserve">一条记录同时符合两条理由时，任选一条适用的即可</w:t>
+            </w:r>
+          </w:p>
+        </w:tc>
+        <w:tc>
+          <w:tcPr>
+            <w:tcW w:type="dxa" w:w="4726"/>
+            <w:tcBorders>
+              <w:top w:val="single" w:color="BBBBBB" w:sz="4"/>
+              <w:left w:val="single" w:color="BBBBBB" w:sz="4"/>
+              <w:bottom w:val="single" w:color="BBBBBB" w:sz="4"/>
+              <w:right w:val="single" w:color="BBBBBB" w:sz="4"/>
+            </w:tcBorders>
+            <w:tcMar>
+              <w:top w:type="dxa" w:w="60"/>
+              <w:left w:type="dxa" w:w="100"/>
+              <w:bottom w:type="dxa" w:w="60"/>
+              <w:right w:type="dxa" w:w="100"/>
+            </w:tcMar>
+          </w:tcPr>
+          <w:p>
+            <w:r>
+              <w:rPr>
+                <w:rFonts w:ascii="Calibri" w:cs="Calibri" w:eastAsia="Microsoft YaHei" w:hAnsi="Calibri"/>
+                <w:sz w:val="20"/>
+                <w:szCs w:val="20"/>
+              </w:rPr>
+              <w:t xml:space="preserve">第 5 节</w:t>
+            </w:r>
+          </w:p>
+        </w:tc>
+      </w:tr>
+      <w:tr>
+        <w:trPr>
+          <w:cantSplit/>
+          <w:tblHeader w:val="false"/>
+        </w:trPr>
+        <w:tc>
+          <w:tcPr>
+            <w:tcW w:type="dxa" w:w="4300"/>
+            <w:tcBorders>
+              <w:top w:val="single" w:color="BBBBBB" w:sz="4"/>
+              <w:left w:val="single" w:color="BBBBBB" w:sz="4"/>
+              <w:bottom w:val="single" w:color="BBBBBB" w:sz="4"/>
+              <w:right w:val="single" w:color="BBBBBB" w:sz="4"/>
+            </w:tcBorders>
+            <w:tcMar>
+              <w:top w:type="dxa" w:w="60"/>
+              <w:left w:type="dxa" w:w="100"/>
+              <w:bottom w:type="dxa" w:w="60"/>
+              <w:right w:type="dxa" w:w="100"/>
+            </w:tcMar>
+          </w:tcPr>
+          <w:p>
+            <w:r>
+              <w:rPr>
+                <w:rFonts w:ascii="Calibri" w:cs="Calibri" w:eastAsia="Microsoft YaHei" w:hAnsi="Calibri"/>
+                <w:sz w:val="20"/>
+                <w:szCs w:val="20"/>
+              </w:rPr>
+              <w:t xml:space="preserve">每次开始筛选前确认作者和期刊处于隐藏状态；发现显示了先记录并告知</w:t>
+            </w:r>
+          </w:p>
+        </w:tc>
+        <w:tc>
+          <w:tcPr>
+            <w:tcW w:type="dxa" w:w="4726"/>
+            <w:tcBorders>
+              <w:top w:val="single" w:color="BBBBBB" w:sz="4"/>
+              <w:left w:val="single" w:color="BBBBBB" w:sz="4"/>
+              <w:bottom w:val="single" w:color="BBBBBB" w:sz="4"/>
+              <w:right w:val="single" w:color="BBBBBB" w:sz="4"/>
+            </w:tcBorders>
+            <w:tcMar>
+              <w:top w:type="dxa" w:w="60"/>
+              <w:left w:type="dxa" w:w="100"/>
+              <w:bottom w:type="dxa" w:w="60"/>
+              <w:right w:type="dxa" w:w="100"/>
+            </w:tcMar>
+          </w:tcPr>
+          <w:p>
+            <w:r>
+              <w:rPr>
+                <w:rFonts w:ascii="Calibri" w:cs="Calibri" w:eastAsia="Microsoft YaHei" w:hAnsi="Calibri"/>
+                <w:sz w:val="20"/>
+                <w:szCs w:val="20"/>
+              </w:rPr>
+              <w:t xml:space="preserve">第 3 节</w:t>
+            </w:r>
+          </w:p>
+        </w:tc>
+      </w:tr>
+      <w:tr>
+        <w:trPr>
+          <w:cantSplit/>
+          <w:tblHeader w:val="false"/>
+        </w:trPr>
+        <w:tc>
+          <w:tcPr>
+            <w:tcW w:type="dxa" w:w="4300"/>
+            <w:tcBorders>
+              <w:top w:val="single" w:color="BBBBBB" w:sz="4"/>
+              <w:left w:val="single" w:color="BBBBBB" w:sz="4"/>
+              <w:bottom w:val="single" w:color="BBBBBB" w:sz="4"/>
+              <w:right w:val="single" w:color="BBBBBB" w:sz="4"/>
+            </w:tcBorders>
+            <w:tcMar>
+              <w:top w:type="dxa" w:w="60"/>
+              <w:left w:type="dxa" w:w="100"/>
+              <w:bottom w:type="dxa" w:w="60"/>
+              <w:right w:type="dxa" w:w="100"/>
+            </w:tcMar>
+          </w:tcPr>
+          <w:p>
+            <w:r>
+              <w:rPr>
+                <w:rFonts w:ascii="Calibri" w:cs="Calibri" w:eastAsia="Microsoft YaHei" w:hAnsi="Calibri"/>
+                <w:sz w:val="20"/>
+                <w:szCs w:val="20"/>
+              </w:rPr>
+              <w:t xml:space="preserve">增加导出决定的方法；不点 Detect duplicates 和 Auto resolve</w:t>
+            </w:r>
+          </w:p>
+        </w:tc>
+        <w:tc>
+          <w:tcPr>
+            <w:tcW w:type="dxa" w:w="4726"/>
+            <w:tcBorders>
+              <w:top w:val="single" w:color="BBBBBB" w:sz="4"/>
+              <w:left w:val="single" w:color="BBBBBB" w:sz="4"/>
+              <w:bottom w:val="single" w:color="BBBBBB" w:sz="4"/>
+              <w:right w:val="single" w:color="BBBBBB" w:sz="4"/>
+            </w:tcBorders>
+            <w:tcMar>
+              <w:top w:type="dxa" w:w="60"/>
+              <w:left w:type="dxa" w:w="100"/>
+              <w:bottom w:type="dxa" w:w="60"/>
+              <w:right w:type="dxa" w:w="100"/>
+            </w:tcMar>
+          </w:tcPr>
+          <w:p>
+            <w:r>
+              <w:rPr>
+                <w:rFonts w:ascii="Calibri" w:cs="Calibri" w:eastAsia="Microsoft YaHei" w:hAnsi="Calibri"/>
+                <w:sz w:val="20"/>
+                <w:szCs w:val="20"/>
+              </w:rPr>
+              <w:t xml:space="preserve">第 3 节</w:t>
+            </w:r>
+          </w:p>
+        </w:tc>
+      </w:tr>
+    </w:tbl>
+    <w:p>
+      <w:pPr>
+        <w:spacing w:after="120"/>
+      </w:pPr>
+    </w:p>
+    <w:p>
+      <w:pPr>
+        <w:spacing w:after="120"/>
+      </w:pPr>
+      <w:r>
+        <w:rPr>
+          <w:rFonts w:ascii="Calibri" w:cs="Calibri" w:eastAsia="Microsoft YaHei" w:hAnsi="Calibri"/>
+          <w:b/>
+          <w:bCs/>
+        </w:rPr>
+        <w:t xml:space="preserve">没有改的：</w:t>
+      </w:r>
+      <w:r>
+        <w:rPr>
+          <w:rFonts w:ascii="Calibri" w:cs="Calibri" w:eastAsia="Microsoft YaHei" w:hAnsi="Calibri"/>
+        </w:rPr>
+        <w:t xml:space="preserve"> 第 8 节的 6 项待决定事项仍待三位商定；筛选员人数不变，仍是两人各筛一遍（协议规定），不改为一人筛选。</w:t>
+      </w:r>
+    </w:p>
+    <w:p>
+      <w:pPr>
+        <w:spacing w:after="120"/>
+      </w:pPr>
+      <w:r>
+        <w:rPr>
+          <w:rFonts w:ascii="Calibri" w:cs="Calibri" w:eastAsia="Microsoft YaHei" w:hAnsi="Calibri"/>
+          <w:b/>
+          <w:bCs/>
+        </w:rPr>
+        <w:t xml:space="preserve">局限：</w:t>
+      </w:r>
+      <w:r>
+        <w:rPr>
+          <w:rFonts w:ascii="Calibri" w:cs="Calibri" w:eastAsia="Microsoft YaHei" w:hAnsi="Calibri"/>
+        </w:rPr>
+        <w:t xml:space="preserve"> n = 50，kappa 的区间较宽；校准里没有摘要的记录只有 11 条，这一类的结论是初步的，正式筛选时要继续观察。</w:t>
       </w:r>
     </w:p>
     <w:sectPr>
@@ -4888,7 +6086,7 @@
         <w:sz w:val="17"/>
         <w:szCs w:val="17"/>
       </w:rPr>
-      <w:t xml:space="preserve">筛选指南（草稿）v2026-10-05   |   第 </w:t>
+      <w:t xml:space="preserve">筛选指南（草稿）v2026-10-07   |   第 </w:t>
     </w:r>
     <w:r>
       <w:rPr>

</xml_diff>

<commit_message>
Conflicts resolved outside Rayyan: guide section 7 rewritten, tools/screening_conflicts.py added and tested on calibration data
Co-Authored-By: Claude Sonnet 5.5 <noreply@anthropic.com>
Claude-Session: https://claude.ai/code/session_01FRD7etKqYN8v2bbXeeLMRW
</commit_message>
<xml_diff>
--- a/Screening guide - title and abstract (draft).docx
+++ b/Screening guide - title and abstract (draft).docx
@@ -4554,6 +4554,25 @@
     </w:p>
     <w:p>
       <w:pPr>
+        <w:spacing w:after="120"/>
+      </w:pPr>
+      <w:r>
+        <w:rPr>
+          <w:rFonts w:ascii="Calibri" w:cs="Calibri" w:eastAsia="Microsoft YaHei" w:hAnsi="Calibri"/>
+          <w:b/>
+          <w:bCs/>
+        </w:rPr>
+        <w:t xml:space="preserve">分歧在 Rayyan 外面解决（舒俊 2026 年 10 月 7 日选定；杨军不需要 Rayyan 账号）。</w:t>
+      </w:r>
+      <w:r>
+        <w:rPr>
+          <w:rFonts w:ascii="Calibri" w:cs="Calibri" w:eastAsia="Microsoft YaHei" w:hAnsi="Calibri"/>
+        </w:rPr>
+        <w:t xml:space="preserve"> Rayyan 里保留两人各自独立的原始决定，不在里面改。</w:t>
+      </w:r>
+    </w:p>
+    <w:p>
+      <w:pPr>
         <w:pStyle w:val="ListParagraph"/>
         <w:numPr>
           <w:ilvl w:val="0"/>
@@ -4565,7 +4584,7 @@
         <w:rPr>
           <w:rFonts w:ascii="Calibri" w:cs="Calibri" w:eastAsia="Microsoft YaHei" w:hAnsi="Calibri"/>
         </w:rPr>
-        <w:t xml:space="preserve">Rayyan 里两人都筛完之后，打开冲突列表。</w:t>
+        <w:t xml:space="preserve">两人都筛完全部记录后，才由舒俊关闭正式项目的 Blind Mode。关闭前请先各自记下自己的数字。</w:t>
       </w:r>
     </w:p>
     <w:p>
@@ -4581,7 +4600,51 @@
         <w:rPr>
           <w:rFonts w:ascii="Calibri" w:cs="Calibri" w:eastAsia="Microsoft YaHei" w:hAnsi="Calibri"/>
         </w:rPr>
-        <w:t xml:space="preserve">先讨论，达成一致后统一决定。</w:t>
+        <w:t xml:space="preserve">舒俊导出：Review data → 右上 "···" → Export，范围 All references，格式 CSV，勾选 decisions、exclusion reasons、labels、user notes。导出会得到两个文件（</w:t>
+      </w:r>
+      <w:r>
+        <w:rPr>
+          <w:rFonts w:ascii="Consolas" w:cs="Consolas" w:eastAsia="Microsoft YaHei" w:hAnsi="Consolas"/>
+          <w:sz w:val="19"/>
+          <w:szCs w:val="19"/>
+          <w:shd w:fill="EEEEEE" w:val="clear"/>
+        </w:rPr>
+        <w:t xml:space="preserve">articles.csv</w:t>
+      </w:r>
+      <w:r>
+        <w:rPr>
+          <w:rFonts w:ascii="Calibri" w:cs="Calibri" w:eastAsia="Microsoft YaHei" w:hAnsi="Calibri"/>
+        </w:rPr>
+        <w:t xml:space="preserve"> 和 </w:t>
+      </w:r>
+      <w:r>
+        <w:rPr>
+          <w:rFonts w:ascii="Consolas" w:cs="Consolas" w:eastAsia="Microsoft YaHei" w:hAnsi="Consolas"/>
+          <w:sz w:val="19"/>
+          <w:szCs w:val="19"/>
+          <w:shd w:fill="EEEEEE" w:val="clear"/>
+        </w:rPr>
+        <w:t xml:space="preserve">customizations_log.csv</w:t>
+      </w:r>
+      <w:r>
+        <w:rPr>
+          <w:rFonts w:ascii="Calibri" w:cs="Calibri" w:eastAsia="Microsoft YaHei" w:hAnsi="Calibri"/>
+        </w:rPr>
+        <w:t xml:space="preserve">），其中带有筛选员的邮箱，</w:t>
+      </w:r>
+      <w:r>
+        <w:rPr>
+          <w:rFonts w:ascii="Calibri" w:cs="Calibri" w:eastAsia="Microsoft YaHei" w:hAnsi="Calibri"/>
+          <w:b/>
+          <w:bCs/>
+        </w:rPr>
+        <w:t xml:space="preserve">不要提交到仓库</w:t>
+      </w:r>
+      <w:r>
+        <w:rPr>
+          <w:rFonts w:ascii="Calibri" w:cs="Calibri" w:eastAsia="Microsoft YaHei" w:hAnsi="Calibri"/>
+        </w:rPr>
+        <w:t xml:space="preserve">。</w:t>
       </w:r>
     </w:p>
     <w:p>
@@ -4597,7 +4660,36 @@
         <w:rPr>
           <w:rFonts w:ascii="Calibri" w:cs="Calibri" w:eastAsia="Microsoft YaHei" w:hAnsi="Calibri"/>
         </w:rPr>
-        <w:t xml:space="preserve">讨论不一致的，交杨军仲裁，仲裁结果记入备注。</w:t>
+        <w:t xml:space="preserve">用 </w:t>
+      </w:r>
+      <w:r>
+        <w:rPr>
+          <w:rFonts w:ascii="Consolas" w:cs="Consolas" w:eastAsia="Microsoft YaHei" w:hAnsi="Consolas"/>
+          <w:sz w:val="19"/>
+          <w:szCs w:val="19"/>
+          <w:shd w:fill="EEEEEE" w:val="clear"/>
+        </w:rPr>
+        <w:t xml:space="preserve">tools/screening_conflicts.py</w:t>
+      </w:r>
+      <w:r>
+        <w:rPr>
+          <w:rFonts w:ascii="Calibri" w:cs="Calibri" w:eastAsia="Microsoft YaHei" w:hAnsi="Calibri"/>
+        </w:rPr>
+        <w:t xml:space="preserve"> 处理（Claude 或舒俊运行；用法见脚本开头）。它生成四个不含邮箱的文件：全部记录的两人决定表；</w:t>
+      </w:r>
+      <w:r>
+        <w:rPr>
+          <w:rFonts w:ascii="Calibri" w:cs="Calibri" w:eastAsia="Microsoft YaHei" w:hAnsi="Calibri"/>
+          <w:b/>
+          <w:bCs/>
+        </w:rPr>
+        <w:t xml:space="preserve">分歧清单</w:t>
+      </w:r>
+      <w:r>
+        <w:rPr>
+          <w:rFonts w:ascii="Calibri" w:cs="Calibri" w:eastAsia="Microsoft YaHei" w:hAnsi="Calibri"/>
+        </w:rPr>
+        <w:t xml:space="preserve">（含标题、摘要、两人的决定和理由，以及讨论和仲裁要填的列）；"纳入对 Maybe"清单；汇总（一致率、kappa、没选理由的 Exclude 数、未能对应到 WS 编号的记录数）。</w:t>
       </w:r>
     </w:p>
     <w:p>
@@ -4612,8 +4704,182 @@
       <w:r>
         <w:rPr>
           <w:rFonts w:ascii="Calibri" w:cs="Calibri" w:eastAsia="Microsoft YaHei" w:hAnsi="Calibri"/>
-        </w:rPr>
-        <w:t xml:space="preserve">记录分歧条数，PRISMA 和方法部分可以引用。</w:t>
+          <w:b/>
+          <w:bCs/>
+        </w:rPr>
+        <w:t xml:space="preserve">只有"一人 Exclude、另一人 Include 或 Maybe"的分歧需要解决</w:t>
+      </w:r>
+      <w:r>
+        <w:rPr>
+          <w:rFonts w:ascii="Calibri" w:cs="Calibri" w:eastAsia="Microsoft YaHei" w:hAnsi="Calibri"/>
+        </w:rPr>
+        <w:t xml:space="preserve">，因为这类记录会不会进入全文取决于它。</w:t>
+      </w:r>
+      <w:r>
+        <w:rPr>
+          <w:rFonts w:ascii="Calibri" w:cs="Calibri" w:eastAsia="Microsoft YaHei" w:hAnsi="Calibri"/>
+          <w:b/>
+          <w:bCs/>
+        </w:rPr>
+        <w:t xml:space="preserve">"Include 对 Maybe"两种都进入全文，只报告条数，不解决</w:t>
+      </w:r>
+      <w:r>
+        <w:rPr>
+          <w:rFonts w:ascii="Calibri" w:cs="Calibri" w:eastAsia="Microsoft YaHei" w:hAnsi="Calibri"/>
+        </w:rPr>
+        <w:t xml:space="preserve">（这一条是 Claude 的建议，待三位确认）。</w:t>
+      </w:r>
+    </w:p>
+    <w:p>
+      <w:pPr>
+        <w:pStyle w:val="ListParagraph"/>
+        <w:numPr>
+          <w:ilvl w:val="0"/>
+          <w:numId w:val="6"/>
+        </w:numPr>
+        <w:spacing w:after="60"/>
+      </w:pPr>
+      <w:r>
+        <w:rPr>
+          <w:rFonts w:ascii="Calibri" w:cs="Calibri" w:eastAsia="Microsoft YaHei" w:hAnsi="Calibri"/>
+        </w:rPr>
+        <w:t xml:space="preserve">解决顺序：先由舒俊和彭飞讨论，达成一致的决定填入 </w:t>
+      </w:r>
+      <w:r>
+        <w:rPr>
+          <w:rFonts w:ascii="Consolas" w:cs="Consolas" w:eastAsia="Microsoft YaHei" w:hAnsi="Consolas"/>
+          <w:sz w:val="19"/>
+          <w:szCs w:val="19"/>
+          <w:shd w:fill="EEEEEE" w:val="clear"/>
+        </w:rPr>
+        <w:t xml:space="preserve">discussion_agreed_decision</w:t>
+      </w:r>
+      <w:r>
+        <w:rPr>
+          <w:rFonts w:ascii="Calibri" w:cs="Calibri" w:eastAsia="Microsoft YaHei" w:hAnsi="Calibri"/>
+        </w:rPr>
+        <w:t xml:space="preserve">，理由写在 </w:t>
+      </w:r>
+      <w:r>
+        <w:rPr>
+          <w:rFonts w:ascii="Consolas" w:cs="Consolas" w:eastAsia="Microsoft YaHei" w:hAnsi="Consolas"/>
+          <w:sz w:val="19"/>
+          <w:szCs w:val="19"/>
+          <w:shd w:fill="EEEEEE" w:val="clear"/>
+        </w:rPr>
+        <w:t xml:space="preserve">discussion_note</w:t>
+      </w:r>
+      <w:r>
+        <w:rPr>
+          <w:rFonts w:ascii="Calibri" w:cs="Calibri" w:eastAsia="Microsoft YaHei" w:hAnsi="Calibri"/>
+        </w:rPr>
+        <w:t xml:space="preserve">；讨论不一致的交杨军，杨军填 </w:t>
+      </w:r>
+      <w:r>
+        <w:rPr>
+          <w:rFonts w:ascii="Consolas" w:cs="Consolas" w:eastAsia="Microsoft YaHei" w:hAnsi="Consolas"/>
+          <w:sz w:val="19"/>
+          <w:szCs w:val="19"/>
+          <w:shd w:fill="EEEEEE" w:val="clear"/>
+        </w:rPr>
+        <w:t xml:space="preserve">adjudicator_decision</w:t>
+      </w:r>
+      <w:r>
+        <w:rPr>
+          <w:rFonts w:ascii="Calibri" w:cs="Calibri" w:eastAsia="Microsoft YaHei" w:hAnsi="Calibri"/>
+        </w:rPr>
+        <w:t xml:space="preserve"> 和 </w:t>
+      </w:r>
+      <w:r>
+        <w:rPr>
+          <w:rFonts w:ascii="Consolas" w:cs="Consolas" w:eastAsia="Microsoft YaHei" w:hAnsi="Consolas"/>
+          <w:sz w:val="19"/>
+          <w:szCs w:val="19"/>
+          <w:shd w:fill="EEEEEE" w:val="clear"/>
+        </w:rPr>
+        <w:t xml:space="preserve">adjudicator_note</w:t>
+      </w:r>
+      <w:r>
+        <w:rPr>
+          <w:rFonts w:ascii="Calibri" w:cs="Calibri" w:eastAsia="Microsoft YaHei" w:hAnsi="Calibri"/>
+        </w:rPr>
+        <w:t xml:space="preserve">；最后在 </w:t>
+      </w:r>
+      <w:r>
+        <w:rPr>
+          <w:rFonts w:ascii="Consolas" w:cs="Consolas" w:eastAsia="Microsoft YaHei" w:hAnsi="Consolas"/>
+          <w:sz w:val="19"/>
+          <w:szCs w:val="19"/>
+          <w:shd w:fill="EEEEEE" w:val="clear"/>
+        </w:rPr>
+        <w:t xml:space="preserve">final_decision</w:t>
+      </w:r>
+      <w:r>
+        <w:rPr>
+          <w:rFonts w:ascii="Calibri" w:cs="Calibri" w:eastAsia="Microsoft YaHei" w:hAnsi="Calibri"/>
+        </w:rPr>
+        <w:t xml:space="preserve"> 填最终决定。杨军直接用 Excel 或 WPS 打开分歧清单即可，清单里有标题和摘要。</w:t>
+      </w:r>
+    </w:p>
+    <w:p>
+      <w:pPr>
+        <w:pStyle w:val="ListParagraph"/>
+        <w:numPr>
+          <w:ilvl w:val="0"/>
+          <w:numId w:val="6"/>
+        </w:numPr>
+        <w:spacing w:after="60"/>
+      </w:pPr>
+      <w:r>
+        <w:rPr>
+          <w:rFonts w:ascii="Calibri" w:cs="Calibri" w:eastAsia="Microsoft YaHei" w:hAnsi="Calibri"/>
+        </w:rPr>
+        <w:t xml:space="preserve">填好的分歧清单提交到仓库 </w:t>
+      </w:r>
+      <w:r>
+        <w:rPr>
+          <w:rFonts w:ascii="Consolas" w:cs="Consolas" w:eastAsia="Microsoft YaHei" w:hAnsi="Consolas"/>
+          <w:sz w:val="19"/>
+          <w:szCs w:val="19"/>
+          <w:shd w:fill="EEEEEE" w:val="clear"/>
+        </w:rPr>
+        <w:t xml:space="preserve">search/screening/formal/</w:t>
+      </w:r>
+      <w:r>
+        <w:rPr>
+          <w:rFonts w:ascii="Calibri" w:cs="Calibri" w:eastAsia="Microsoft YaHei" w:hAnsi="Calibri"/>
+        </w:rPr>
+        <w:t xml:space="preserve">，作为可核对的记录。</w:t>
+      </w:r>
+      <w:r>
+        <w:rPr>
+          <w:rFonts w:ascii="Calibri" w:cs="Calibri" w:eastAsia="Microsoft YaHei" w:hAnsi="Calibri"/>
+          <w:b/>
+          <w:bCs/>
+        </w:rPr>
+        <w:t xml:space="preserve">进入全文阶段的记录</w:t>
+      </w:r>
+      <w:r>
+        <w:rPr>
+          <w:rFonts w:ascii="Calibri" w:cs="Calibri" w:eastAsia="Microsoft YaHei" w:hAnsi="Calibri"/>
+        </w:rPr>
+        <w:t xml:space="preserve"> = 两人一致的 Include 和 Maybe + 分歧解决后的 Include 和 Maybe。PRISMA 的数字从这些文件计算。</w:t>
+      </w:r>
+    </w:p>
+    <w:p>
+      <w:pPr>
+        <w:pStyle w:val="ListParagraph"/>
+        <w:numPr>
+          <w:ilvl w:val="0"/>
+          <w:numId w:val="6"/>
+        </w:numPr>
+        <w:spacing w:after="60"/>
+      </w:pPr>
+      <w:r>
+        <w:rPr>
+          <w:rFonts w:ascii="Calibri" w:cs="Calibri" w:eastAsia="Microsoft YaHei" w:hAnsi="Calibri"/>
+        </w:rPr>
+        <w:t xml:space="preserve">记录：分歧条数、讨论解决条数、仲裁条数、一致率和 kappa（方法部分引用）。</w:t>
       </w:r>
     </w:p>
     <w:p>
@@ -5977,6 +6243,66 @@
           </w:p>
         </w:tc>
       </w:tr>
+      <w:tr>
+        <w:trPr>
+          <w:cantSplit/>
+          <w:tblHeader w:val="false"/>
+        </w:trPr>
+        <w:tc>
+          <w:tcPr>
+            <w:tcW w:type="dxa" w:w="4300"/>
+            <w:tcBorders>
+              <w:top w:val="single" w:color="BBBBBB" w:sz="4"/>
+              <w:left w:val="single" w:color="BBBBBB" w:sz="4"/>
+              <w:bottom w:val="single" w:color="BBBBBB" w:sz="4"/>
+              <w:right w:val="single" w:color="BBBBBB" w:sz="4"/>
+            </w:tcBorders>
+            <w:tcMar>
+              <w:top w:type="dxa" w:w="60"/>
+              <w:left w:type="dxa" w:w="100"/>
+              <w:bottom w:type="dxa" w:w="60"/>
+              <w:right w:type="dxa" w:w="100"/>
+            </w:tcMar>
+          </w:tcPr>
+          <w:p>
+            <w:r>
+              <w:rPr>
+                <w:rFonts w:ascii="Calibri" w:cs="Calibri" w:eastAsia="Microsoft YaHei" w:hAnsi="Calibri"/>
+                <w:sz w:val="20"/>
+                <w:szCs w:val="20"/>
+              </w:rPr>
+              <w:t xml:space="preserve">分歧在 Rayyan 外面解决，用导出文件生成分歧清单，杨军不需要 Rayyan 账号（舒俊选定）；"Include 对 Maybe"只报告不解决（Claude 建议，待三位确认）</w:t>
+            </w:r>
+          </w:p>
+        </w:tc>
+        <w:tc>
+          <w:tcPr>
+            <w:tcW w:type="dxa" w:w="4726"/>
+            <w:tcBorders>
+              <w:top w:val="single" w:color="BBBBBB" w:sz="4"/>
+              <w:left w:val="single" w:color="BBBBBB" w:sz="4"/>
+              <w:bottom w:val="single" w:color="BBBBBB" w:sz="4"/>
+              <w:right w:val="single" w:color="BBBBBB" w:sz="4"/>
+            </w:tcBorders>
+            <w:tcMar>
+              <w:top w:type="dxa" w:w="60"/>
+              <w:left w:type="dxa" w:w="100"/>
+              <w:bottom w:type="dxa" w:w="60"/>
+              <w:right w:type="dxa" w:w="100"/>
+            </w:tcMar>
+          </w:tcPr>
+          <w:p>
+            <w:r>
+              <w:rPr>
+                <w:rFonts w:ascii="Calibri" w:cs="Calibri" w:eastAsia="Microsoft YaHei" w:hAnsi="Calibri"/>
+                <w:sz w:val="20"/>
+                <w:szCs w:val="20"/>
+              </w:rPr>
+              <w:t xml:space="preserve">第 7 节</w:t>
+            </w:r>
+          </w:p>
+        </w:tc>
+      </w:tr>
     </w:tbl>
     <w:p>
       <w:pPr>
@@ -6086,7 +6412,7 @@
         <w:sz w:val="17"/>
         <w:szCs w:val="17"/>
       </w:rPr>
-      <w:t xml:space="preserve">筛选指南（草稿）v2026-10-07   |   第 </w:t>
+      <w:t xml:space="preserve">筛选指南（草稿）v2026-10-07b   |   第 </w:t>
     </w:r>
     <w:r>
       <w:rPr>

</xml_diff>

<commit_message>
Guide: section 8 decisions recorded (items 1,2,3,4,6); confirmations by Fei Peng and Jun Yang noted
Co-Authored-By: Claude Sonnet 5.5 <noreply@anthropic.com>
Claude-Session: https://claude.ai/code/session_01FRD7etKqYN8v2bbXeeLMRW
</commit_message>
<xml_diff>
--- a/Screening guide - title and abstract (draft).docx
+++ b/Screening guide - title and abstract (draft).docx
@@ -2879,7 +2879,7 @@
                 <w:sz w:val="20"/>
                 <w:szCs w:val="20"/>
               </w:rPr>
-              <w:t xml:space="preserve">（待作者决定，见第 8 节）</w:t>
+              <w:t xml:space="preserve">（已决定，见第 8 节）</w:t>
             </w:r>
           </w:p>
         </w:tc>
@@ -2949,7 +2949,7 @@
                 <w:sz w:val="20"/>
                 <w:szCs w:val="20"/>
               </w:rPr>
-              <w:t xml:space="preserve">（待作者决定）</w:t>
+              <w:t xml:space="preserve">（已决定，见第 8 节）</w:t>
             </w:r>
           </w:p>
         </w:tc>
@@ -4891,7 +4891,18 @@
         <w:rPr>
           <w:rFonts w:ascii="Calibri" w:cs="Calibri" w:eastAsia="Microsoft YaHei" w:hAnsi="Calibri"/>
         </w:rPr>
-        <w:t xml:space="preserve">8. 待作者决定的事项</w:t>
+        <w:t xml:space="preserve">8. 待决定事项及其决定（2026 年 10 月 7 日）</w:t>
+      </w:r>
+    </w:p>
+    <w:p>
+      <w:pPr>
+        <w:spacing w:after="120"/>
+      </w:pPr>
+      <w:r>
+        <w:rPr>
+          <w:rFonts w:ascii="Calibri" w:cs="Calibri" w:eastAsia="Microsoft YaHei" w:hAnsi="Calibri"/>
+        </w:rPr>
+        <w:t xml:space="preserve">舒俊决定第 1、2、3、4、6 项按 Claude 的建议执行；第 5 项待确认。</w:t>
       </w:r>
     </w:p>
     <w:p>
@@ -4915,31 +4926,21 @@
         <w:rPr>
           <w:rFonts w:ascii="Calibri" w:cs="Calibri" w:eastAsia="Microsoft YaHei" w:hAnsi="Calibri"/>
         </w:rPr>
-        <w:t xml:space="preserve">：只有摘要的排除（E5），看起来是完整论文的按 Maybe 处理，是否同意？</w:t>
-      </w:r>
-    </w:p>
-    <w:p>
-      <w:pPr>
-        <w:pStyle w:val="ListParagraph"/>
-        <w:numPr>
-          <w:ilvl w:val="0"/>
-          <w:numId w:val="7"/>
-        </w:numPr>
-        <w:spacing w:after="60"/>
-      </w:pPr>
+        <w:t xml:space="preserve">：</w:t>
+      </w:r>
       <w:r>
         <w:rPr>
           <w:rFonts w:ascii="Calibri" w:cs="Calibri" w:eastAsia="Microsoft YaHei" w:hAnsi="Calibri"/>
           <w:b/>
           <w:bCs/>
         </w:rPr>
-        <w:t xml:space="preserve">学位论文</w:t>
-      </w:r>
-      <w:r>
-        <w:rPr>
-          <w:rFonts w:ascii="Calibri" w:cs="Calibri" w:eastAsia="Microsoft YaHei" w:hAnsi="Calibri"/>
-        </w:rPr>
-        <w:t xml:space="preserve">（10 条）：含临床病例资料的按 Maybe，全文再定，是否同意？</w:t>
+        <w:t xml:space="preserve">决定：</w:t>
+      </w:r>
+      <w:r>
+        <w:rPr>
+          <w:rFonts w:ascii="Calibri" w:cs="Calibri" w:eastAsia="Microsoft YaHei" w:hAnsi="Calibri"/>
+        </w:rPr>
+        <w:t xml:space="preserve"> 只有摘要的按 E5 排除；看起来是完整论文的按 Maybe。</w:t>
       </w:r>
     </w:p>
     <w:p>
@@ -4957,37 +4958,27 @@
           <w:b/>
           <w:bCs/>
         </w:rPr>
-        <w:t xml:space="preserve">成人与儿童混合系列</w:t>
-      </w:r>
-      <w:r>
-        <w:rPr>
-          <w:rFonts w:ascii="Calibri" w:cs="Calibri" w:eastAsia="Microsoft YaHei" w:hAnsi="Calibri"/>
-        </w:rPr>
-        <w:t xml:space="preserve">：一律 Maybe，由全文判断能否提取儿童个体数据，是否同意？</w:t>
-      </w:r>
-    </w:p>
-    <w:p>
-      <w:pPr>
-        <w:pStyle w:val="ListParagraph"/>
-        <w:numPr>
-          <w:ilvl w:val="0"/>
-          <w:numId w:val="7"/>
-        </w:numPr>
-        <w:spacing w:after="60"/>
-      </w:pPr>
+        <w:t xml:space="preserve">学位论文</w:t>
+      </w:r>
+      <w:r>
+        <w:rPr>
+          <w:rFonts w:ascii="Calibri" w:cs="Calibri" w:eastAsia="Microsoft YaHei" w:hAnsi="Calibri"/>
+        </w:rPr>
+        <w:t xml:space="preserve">（10 条）：</w:t>
+      </w:r>
       <w:r>
         <w:rPr>
           <w:rFonts w:ascii="Calibri" w:cs="Calibri" w:eastAsia="Microsoft YaHei" w:hAnsi="Calibri"/>
           <w:b/>
           <w:bCs/>
         </w:rPr>
-        <w:t xml:space="preserve">review-for-refs 标签</w:t>
-      </w:r>
-      <w:r>
-        <w:rPr>
-          <w:rFonts w:ascii="Calibri" w:cs="Calibri" w:eastAsia="Microsoft YaHei" w:hAnsi="Calibri"/>
-        </w:rPr>
-        <w:t xml:space="preserve">：引文追溯目前没有做，保留标签是为了以后补做的可能，是否需要？</w:t>
+        <w:t xml:space="preserve">决定：</w:t>
+      </w:r>
+      <w:r>
+        <w:rPr>
+          <w:rFonts w:ascii="Calibri" w:cs="Calibri" w:eastAsia="Microsoft YaHei" w:hAnsi="Calibri"/>
+        </w:rPr>
+        <w:t xml:space="preserve"> 含临床病例资料的按 Maybe，全文阶段再定。</w:t>
       </w:r>
     </w:p>
     <w:p>
@@ -5005,37 +4996,149 @@
           <w:b/>
           <w:bCs/>
         </w:rPr>
-        <w:t xml:space="preserve">筛选一致性</w:t>
-      </w:r>
-      <w:r>
-        <w:rPr>
-          <w:rFonts w:ascii="Calibri" w:cs="Calibri" w:eastAsia="Microsoft YaHei" w:hAnsi="Calibri"/>
-        </w:rPr>
-        <w:t xml:space="preserve">：协议只要求提取阶段报告 Cohen's kappa。标题摘要筛选阶段是否也报告？建议报告，以便读者评估。（校准集的数字见第 11 节。）</w:t>
-      </w:r>
-    </w:p>
-    <w:p>
-      <w:pPr>
-        <w:pStyle w:val="ListParagraph"/>
-        <w:numPr>
-          <w:ilvl w:val="0"/>
-          <w:numId w:val="7"/>
-        </w:numPr>
-        <w:spacing w:after="60"/>
-      </w:pPr>
+        <w:t xml:space="preserve">成人与儿童混合系列</w:t>
+      </w:r>
+      <w:r>
+        <w:rPr>
+          <w:rFonts w:ascii="Calibri" w:cs="Calibri" w:eastAsia="Microsoft YaHei" w:hAnsi="Calibri"/>
+        </w:rPr>
+        <w:t xml:space="preserve">：</w:t>
+      </w:r>
       <w:r>
         <w:rPr>
           <w:rFonts w:ascii="Calibri" w:cs="Calibri" w:eastAsia="Microsoft YaHei" w:hAnsi="Calibri"/>
           <w:b/>
           <w:bCs/>
         </w:rPr>
+        <w:t xml:space="preserve">决定：</w:t>
+      </w:r>
+      <w:r>
+        <w:rPr>
+          <w:rFonts w:ascii="Calibri" w:cs="Calibri" w:eastAsia="Microsoft YaHei" w:hAnsi="Calibri"/>
+        </w:rPr>
+        <w:t xml:space="preserve"> 一律 Maybe，由全文判断能否提取儿童个体数据。</w:t>
+      </w:r>
+    </w:p>
+    <w:p>
+      <w:pPr>
+        <w:pStyle w:val="ListParagraph"/>
+        <w:numPr>
+          <w:ilvl w:val="0"/>
+          <w:numId w:val="7"/>
+        </w:numPr>
+        <w:spacing w:after="60"/>
+      </w:pPr>
+      <w:r>
+        <w:rPr>
+          <w:rFonts w:ascii="Calibri" w:cs="Calibri" w:eastAsia="Microsoft YaHei" w:hAnsi="Calibri"/>
+          <w:b/>
+          <w:bCs/>
+        </w:rPr>
+        <w:t xml:space="preserve">review-for-refs 标签</w:t>
+      </w:r>
+      <w:r>
+        <w:rPr>
+          <w:rFonts w:ascii="Calibri" w:cs="Calibri" w:eastAsia="Microsoft YaHei" w:hAnsi="Calibri"/>
+        </w:rPr>
+        <w:t xml:space="preserve">：引文追溯目前没有做，保留标签是为了以后补做的可能。</w:t>
+      </w:r>
+      <w:r>
+        <w:rPr>
+          <w:rFonts w:ascii="Calibri" w:cs="Calibri" w:eastAsia="Microsoft YaHei" w:hAnsi="Calibri"/>
+          <w:b/>
+          <w:bCs/>
+        </w:rPr>
+        <w:t xml:space="preserve">决定：</w:t>
+      </w:r>
+      <w:r>
+        <w:rPr>
+          <w:rFonts w:ascii="Calibri" w:cs="Calibri" w:eastAsia="Microsoft YaHei" w:hAnsi="Calibri"/>
+        </w:rPr>
+        <w:t xml:space="preserve"> 保留，只用在属于 E4 的综述上。</w:t>
+      </w:r>
+    </w:p>
+    <w:p>
+      <w:pPr>
+        <w:pStyle w:val="ListParagraph"/>
+        <w:numPr>
+          <w:ilvl w:val="0"/>
+          <w:numId w:val="7"/>
+        </w:numPr>
+        <w:spacing w:after="60"/>
+      </w:pPr>
+      <w:r>
+        <w:rPr>
+          <w:rFonts w:ascii="Calibri" w:cs="Calibri" w:eastAsia="Microsoft YaHei" w:hAnsi="Calibri"/>
+          <w:b/>
+          <w:bCs/>
+        </w:rPr>
+        <w:t xml:space="preserve">筛选一致性</w:t>
+      </w:r>
+      <w:r>
+        <w:rPr>
+          <w:rFonts w:ascii="Calibri" w:cs="Calibri" w:eastAsia="Microsoft YaHei" w:hAnsi="Calibri"/>
+        </w:rPr>
+        <w:t xml:space="preserve">：协议只要求提取阶段报告 Cohen's kappa。标题摘要筛选阶段是否也报告？</w:t>
+      </w:r>
+      <w:r>
+        <w:rPr>
+          <w:rFonts w:ascii="Calibri" w:cs="Calibri" w:eastAsia="Microsoft YaHei" w:hAnsi="Calibri"/>
+          <w:b/>
+          <w:bCs/>
+        </w:rPr>
+        <w:t xml:space="preserve">建议报告</w:t>
+      </w:r>
+      <w:r>
+        <w:rPr>
+          <w:rFonts w:ascii="Calibri" w:cs="Calibri" w:eastAsia="Microsoft YaHei" w:hAnsi="Calibri"/>
+        </w:rPr>
+        <w:t xml:space="preserve">，以便读者评估（校准集的数字见第 11 节）；</w:t>
+      </w:r>
+      <w:r>
+        <w:rPr>
+          <w:rFonts w:ascii="Calibri" w:cs="Calibri" w:eastAsia="Microsoft YaHei" w:hAnsi="Calibri"/>
+          <w:b/>
+          <w:bCs/>
+        </w:rPr>
+        <w:t xml:space="preserve">待确认。</w:t>
+      </w:r>
+    </w:p>
+    <w:p>
+      <w:pPr>
+        <w:pStyle w:val="ListParagraph"/>
+        <w:numPr>
+          <w:ilvl w:val="0"/>
+          <w:numId w:val="7"/>
+        </w:numPr>
+        <w:spacing w:after="60"/>
+      </w:pPr>
+      <w:r>
+        <w:rPr>
+          <w:rFonts w:ascii="Calibri" w:cs="Calibri" w:eastAsia="Microsoft YaHei" w:hAnsi="Calibri"/>
+          <w:b/>
+          <w:bCs/>
+        </w:rPr>
         <w:t xml:space="preserve">预试用的 53 篇</w:t>
       </w:r>
       <w:r>
         <w:rPr>
           <w:rFonts w:ascii="Calibri" w:cs="Calibri" w:eastAsia="Microsoft YaHei" w:hAnsi="Calibri"/>
         </w:rPr>
-        <w:t xml:space="preserve">：协议说明它们会被重新筛选，不预先放行，是否照此执行？</w:t>
+        <w:t xml:space="preserve">：</w:t>
+      </w:r>
+      <w:r>
+        <w:rPr>
+          <w:rFonts w:ascii="Calibri" w:cs="Calibri" w:eastAsia="Microsoft YaHei" w:hAnsi="Calibri"/>
+          <w:b/>
+          <w:bCs/>
+        </w:rPr>
+        <w:t xml:space="preserve">决定：</w:t>
+      </w:r>
+      <w:r>
+        <w:rPr>
+          <w:rFonts w:ascii="Calibri" w:cs="Calibri" w:eastAsia="Microsoft YaHei" w:hAnsi="Calibri"/>
+        </w:rPr>
+        <w:t xml:space="preserve"> 按协议，不预先放行，和其他记录一样重新筛选；它们本来就在 2,548 条里，不需要特殊处理。</w:t>
       </w:r>
     </w:p>
     <w:p>
@@ -5798,7 +5901,7 @@
           <w:b/>
           <w:bCs/>
         </w:rPr>
-        <w:t xml:space="preserve">据此修订的内容（2026 年 10 月 7 日由舒俊同意；彭飞和杨军的确认待做）：</w:t>
+        <w:t xml:space="preserve">据此修订的内容（2026 年 10 月 7 日由舒俊同意；彭飞和杨军已确认修订后的指南，由舒俊转告）：</w:t>
       </w:r>
     </w:p>
     <w:tbl>
@@ -6319,13 +6422,27 @@
           <w:b/>
           <w:bCs/>
         </w:rPr>
+        <w:t xml:space="preserve">第 8 节的决定：</w:t>
+      </w:r>
+      <w:r>
+        <w:rPr>
+          <w:rFonts w:ascii="Calibri" w:cs="Calibri" w:eastAsia="Microsoft YaHei" w:hAnsi="Calibri"/>
+        </w:rPr>
+        <w:t xml:space="preserve"> 第 1、2、3、4、6 项已按建议决定（见第 8 节）；第 5 项（是否报告标题摘要阶段的 kappa）待确认。</w:t>
+      </w:r>
+      <w:r>
+        <w:rPr>
+          <w:rFonts w:ascii="Calibri" w:cs="Calibri" w:eastAsia="Microsoft YaHei" w:hAnsi="Calibri"/>
+          <w:b/>
+          <w:bCs/>
+        </w:rPr>
         <w:t xml:space="preserve">没有改的：</w:t>
       </w:r>
       <w:r>
         <w:rPr>
           <w:rFonts w:ascii="Calibri" w:cs="Calibri" w:eastAsia="Microsoft YaHei" w:hAnsi="Calibri"/>
         </w:rPr>
-        <w:t xml:space="preserve"> 第 8 节的 6 项待决定事项仍待三位商定；筛选员人数不变，仍是两人各筛一遍（协议规定），不改为一人筛选。</w:t>
+        <w:t xml:space="preserve"> 筛选员人数不变，仍是两人各筛一遍（协议规定），不改为一人筛选。</w:t>
       </w:r>
     </w:p>
     <w:p>
@@ -6412,7 +6529,7 @@
         <w:sz w:val="17"/>
         <w:szCs w:val="17"/>
       </w:rPr>
-      <w:t xml:space="preserve">筛选指南（草稿）v2026-10-07b   |   第 </w:t>
+      <w:t xml:space="preserve">筛选指南（草稿）v2026-10-07c   |   第 </w:t>
     </w:r>
     <w:r>
       <w:rPr>

</xml_diff>

<commit_message>
Guide: kappa reporting and Include-vs-Maybe rule agreed; all section 8 items decided
Co-Authored-By: Claude Sonnet 5.5 <noreply@anthropic.com>
Claude-Session: https://claude.ai/code/session_01FRD7etKqYN8v2bbXeeLMRW
</commit_message>
<xml_diff>
--- a/Screening guide - title and abstract (draft).docx
+++ b/Screening guide - title and abstract (draft).docx
@@ -4727,7 +4727,7 @@
         <w:rPr>
           <w:rFonts w:ascii="Calibri" w:cs="Calibri" w:eastAsia="Microsoft YaHei" w:hAnsi="Calibri"/>
         </w:rPr>
-        <w:t xml:space="preserve">（这一条是 Claude 的建议，待三位确认）。</w:t>
+        <w:t xml:space="preserve">（Claude 建议，舒俊 2026 年 10 月 7 日同意）。</w:t>
       </w:r>
     </w:p>
     <w:p>
@@ -4902,7 +4902,7 @@
         <w:rPr>
           <w:rFonts w:ascii="Calibri" w:cs="Calibri" w:eastAsia="Microsoft YaHei" w:hAnsi="Calibri"/>
         </w:rPr>
-        <w:t xml:space="preserve">舒俊决定第 1、2、3、4、6 项按 Claude 的建议执行；第 5 项待确认。</w:t>
+        <w:t xml:space="preserve">舒俊决定第 1 至 6 项全部按 Claude 的建议执行。</w:t>
       </w:r>
     </w:p>
     <w:p>
@@ -5086,21 +5086,13 @@
           <w:b/>
           <w:bCs/>
         </w:rPr>
-        <w:t xml:space="preserve">建议报告</w:t>
-      </w:r>
-      <w:r>
-        <w:rPr>
-          <w:rFonts w:ascii="Calibri" w:cs="Calibri" w:eastAsia="Microsoft YaHei" w:hAnsi="Calibri"/>
-        </w:rPr>
-        <w:t xml:space="preserve">，以便读者评估（校准集的数字见第 11 节）；</w:t>
-      </w:r>
-      <w:r>
-        <w:rPr>
-          <w:rFonts w:ascii="Calibri" w:cs="Calibri" w:eastAsia="Microsoft YaHei" w:hAnsi="Calibri"/>
-          <w:b/>
-          <w:bCs/>
-        </w:rPr>
-        <w:t xml:space="preserve">待确认。</w:t>
+        <w:t xml:space="preserve">决定：</w:t>
+      </w:r>
+      <w:r>
+        <w:rPr>
+          <w:rFonts w:ascii="Calibri" w:cs="Calibri" w:eastAsia="Microsoft YaHei" w:hAnsi="Calibri"/>
+        </w:rPr>
+        <w:t xml:space="preserve"> 报告，以便读者评估（校准集的数字见第 11 节）。</w:t>
       </w:r>
     </w:p>
     <w:p>
@@ -6374,7 +6366,7 @@
                 <w:sz w:val="20"/>
                 <w:szCs w:val="20"/>
               </w:rPr>
-              <w:t xml:space="preserve">分歧在 Rayyan 外面解决，用导出文件生成分歧清单，杨军不需要 Rayyan 账号（舒俊选定）；"Include 对 Maybe"只报告不解决（Claude 建议，待三位确认）</w:t>
+              <w:t xml:space="preserve">分歧在 Rayyan 外面解决，用导出文件生成分歧清单，杨军不需要 Rayyan 账号（舒俊选定）；"Include 对 Maybe"只报告不解决（Claude 建议，舒俊同意）</w:t>
             </w:r>
           </w:p>
         </w:tc>
@@ -6428,7 +6420,7 @@
         <w:rPr>
           <w:rFonts w:ascii="Calibri" w:cs="Calibri" w:eastAsia="Microsoft YaHei" w:hAnsi="Calibri"/>
         </w:rPr>
-        <w:t xml:space="preserve"> 第 1、2、3、4、6 项已按建议决定（见第 8 节）；第 5 项（是否报告标题摘要阶段的 kappa）待确认。</w:t>
+        <w:t xml:space="preserve"> 第 1 至 6 项都已按建议决定（见第 8 节），其中第 5 项决定报告标题摘要阶段的 kappa。</w:t>
       </w:r>
       <w:r>
         <w:rPr>
@@ -6529,7 +6521,7 @@
         <w:sz w:val="17"/>
         <w:szCs w:val="17"/>
       </w:rPr>
-      <w:t xml:space="preserve">筛选指南（草稿）v2026-10-07c   |   第 </w:t>
+      <w:t xml:space="preserve">筛选指南 v2026-10-07d   |   第 </w:t>
     </w:r>
     <w:r>
       <w:rPr>

</xml_diff>

<commit_message>
Guide: screen only on the Screening tab (Review data shows authors); log Fei Peng's calibration screenshot
Co-Authored-By: Claude Sonnet 5.5 <noreply@anthropic.com>
Claude-Session: https://claude.ai/code/session_01FRD7etKqYN8v2bbXeeLMRW
</commit_message>
<xml_diff>
--- a/Screening guide - title and abstract (draft).docx
+++ b/Screening guide - title and abstract (draft).docx
@@ -1009,6 +1009,30 @@
           <w:bCs/>
         </w:rPr>
         <w:t xml:space="preserve">校准中发现这条在筛选过程中变成了显示状态，原因不明（见第 11 节）。因此正式筛选时，两人每次开始之前都先确认处于隐藏状态；如果发现显示了，不要继续筛，先记下日期和时间，并告诉其他人。</w:t>
+      </w:r>
+    </w:p>
+    <w:p>
+      <w:pPr>
+        <w:pStyle w:val="ListParagraph"/>
+        <w:numPr>
+          <w:ilvl w:val="0"/>
+          <w:numId w:val="2"/>
+        </w:numPr>
+        <w:spacing w:after="60"/>
+      </w:pPr>
+      <w:r>
+        <w:rPr>
+          <w:rFonts w:ascii="Calibri" w:cs="Calibri" w:eastAsia="Microsoft YaHei" w:hAnsi="Calibri"/>
+          <w:b/>
+          <w:bCs/>
+        </w:rPr>
+        <w:t xml:space="preserve">筛选时只用 Screening 标签。</w:t>
+      </w:r>
+      <w:r>
+        <w:rPr>
+          <w:rFonts w:ascii="Calibri" w:cs="Calibri" w:eastAsia="Microsoft YaHei" w:hAnsi="Calibri"/>
+        </w:rPr>
+        <w:t xml:space="preserve"> Review data 标签的列表会直接显示作者和日期，不受"隐藏"设置约束（2026 年 10 月 7 日彭飞的截图所见）；这个标签只在导出时使用，不要在筛选过程中打开。这是操作提醒，不改变任何判断规则。</w:t>
       </w:r>
     </w:p>
     <w:p>
@@ -6521,7 +6545,7 @@
         <w:sz w:val="17"/>
         <w:szCs w:val="17"/>
       </w:rPr>
-      <w:t xml:space="preserve">筛选指南 v2026-10-07d   |   第 </w:t>
+      <w:t xml:space="preserve">筛选指南 v2026-10-07e   |   第 </w:t>
     </w:r>
     <w:r>
       <w:rPr>

</xml_diff>

<commit_message>
Calibration: both reviewers saw author/journal (recorded); formal project ready to start
Co-Authored-By: Claude Sonnet 5.5 <noreply@anthropic.com>
Claude-Session: https://claude.ai/code/session_01FRD7etKqYN8v2bbXeeLMRW
</commit_message>
<xml_diff>
--- a/Screening guide - title and abstract (draft).docx
+++ b/Screening guide - title and abstract (draft).docx
@@ -5904,7 +5904,7 @@
         <w:rPr>
           <w:rFonts w:ascii="Calibri" w:cs="Calibri" w:eastAsia="Microsoft YaHei" w:hAnsi="Calibri"/>
         </w:rPr>
-        <w:t xml:space="preserve">作者和期刊信息在 R1 筛选过程中从隐藏变成了显示，R1 回忆没有点过 Show，原因不明；R2 是否也看到过，待确认。</w:t>
+        <w:t xml:space="preserve">作者和期刊信息在 R1 筛选过程中从隐藏变成了显示，R1 回忆没有点过 Show，原因不明；R2 也确认在校准时看到过作者和期刊（从哪一条开始、通过哪个页面看到，没有询问）。正式项目里，2026 年 10 月 7 日两人的截图都显示作者和期刊处于隐藏状态。</w:t>
       </w:r>
     </w:p>
     <w:p>
@@ -6477,7 +6477,7 @@
         <w:rPr>
           <w:rFonts w:ascii="Calibri" w:cs="Calibri" w:eastAsia="Microsoft YaHei" w:hAnsi="Calibri"/>
         </w:rPr>
-        <w:t xml:space="preserve"> n = 50，kappa 的区间较宽；校准里没有摘要的记录只有 11 条，这一类的结论是初步的，正式筛选时要继续观察。</w:t>
+        <w:t xml:space="preserve"> n = 50，kappa 的区间较宽；校准里没有摘要的记录只有 11 条，这一类的结论是初步的，正式筛选时要继续观察。校准期间作者和期刊信息对两位筛选员都曾可见（至少部分时间），这对一致率有没有影响无法判断；写方法时要如实说明。</w:t>
       </w:r>
     </w:p>
     <w:sectPr>
@@ -6545,7 +6545,7 @@
         <w:sz w:val="17"/>
         <w:szCs w:val="17"/>
       </w:rPr>
-      <w:t xml:space="preserve">筛选指南 v2026-10-07e   |   第 </w:t>
+      <w:t xml:space="preserve">筛选指南 v2026-10-07f   |   第 </w:t>
     </w:r>
     <w:r>
       <w:rPr>

</xml_diff>

<commit_message>
Guide: Rayyan highlight limits (whole-word, Chinese terms mostly not highlighted); log E5 question
Counts shown by Rayyan for 19 English keywords are reproduced by whole-word
matching; Chinese keywords are strongly under-counted (e.g. 20 shown vs 162
records containing the word). Operating note added to guide sections 3 and 11,
docx regenerated; CLAUDE.md records the E5-record candidates and the finding.

Co-Authored-By: Claude Sonnet 5.5 <noreply@anthropic.com>
Claude-Session: https://claude.ai/code/session_01FRD7etKqYN8v2bbXeeLMRW
</commit_message>
<xml_diff>
--- a/Screening guide - title and abstract (draft).docx
+++ b/Screening guide - title and abstract (draft).docx
@@ -1159,6 +1159,59 @@
           <w:rFonts w:ascii="Calibri" w:cs="Calibri" w:eastAsia="Microsoft YaHei" w:hAnsi="Calibri"/>
         </w:rPr>
         <w:t xml:space="preserve">。</w:t>
+      </w:r>
+    </w:p>
+    <w:p>
+      <w:pPr>
+        <w:pStyle w:val="ListParagraph"/>
+        <w:numPr>
+          <w:ilvl w:val="1"/>
+          <w:numId w:val="2"/>
+        </w:numPr>
+        <w:spacing w:after="60"/>
+      </w:pPr>
+      <w:r>
+        <w:rPr>
+          <w:rFonts w:ascii="Calibri" w:cs="Calibri" w:eastAsia="Microsoft YaHei" w:hAnsi="Calibri"/>
+          <w:b/>
+          <w:bCs/>
+        </w:rPr>
+        <w:t xml:space="preserve">高亮的限制（2026 年 10 月 10 日按 Rayyan 显示的命中数核对，属于操作提醒，不改判断规则）：</w:t>
+      </w:r>
+      <w:r>
+        <w:rPr>
+          <w:rFonts w:ascii="Calibri" w:cs="Calibri" w:eastAsia="Microsoft YaHei" w:hAnsi="Calibri"/>
+        </w:rPr>
+        <w:t xml:space="preserve"> Rayyan 按整词匹配，所以 </w:t>
+      </w:r>
+      <w:r>
+        <w:rPr>
+          <w:rFonts w:ascii="Consolas" w:cs="Consolas" w:eastAsia="Microsoft YaHei" w:hAnsi="Consolas"/>
+          <w:sz w:val="19"/>
+          <w:szCs w:val="19"/>
+          <w:shd w:fill="EEEEEE" w:val="clear"/>
+        </w:rPr>
+        <w:t xml:space="preserve">child</w:t>
+      </w:r>
+      <w:r>
+        <w:rPr>
+          <w:rFonts w:ascii="Calibri" w:cs="Calibri" w:eastAsia="Microsoft YaHei" w:hAnsi="Calibri"/>
+        </w:rPr>
+        <w:t xml:space="preserve"> 不会标出 children。中文词只有两侧是标点或空格时才会标出，夹在其他汉字中间的不会标：2,548 条里标题或摘要含"游走脾"的有 162 条，Rayyan 只显示 20 条。</w:t>
+      </w:r>
+      <w:r>
+        <w:rPr>
+          <w:rFonts w:ascii="Calibri" w:cs="Calibri" w:eastAsia="Microsoft YaHei" w:hAnsi="Calibri"/>
+          <w:b/>
+          <w:bCs/>
+        </w:rPr>
+        <w:t xml:space="preserve">所以中文记录没有高亮不说明不相关</w:t>
+      </w:r>
+      <w:r>
+        <w:rPr>
+          <w:rFonts w:ascii="Calibri" w:cs="Calibri" w:eastAsia="Microsoft YaHei" w:hAnsi="Calibri"/>
+        </w:rPr>
+        <w:t xml:space="preserve">，仍然要读标题和摘要。</w:t>
       </w:r>
     </w:p>
     <w:p>
@@ -6471,6 +6524,25 @@
           <w:b/>
           <w:bCs/>
         </w:rPr>
+        <w:t xml:space="preserve">2026 年 10 月 10 日补充（操作提醒，不是判断规则的修订）：</w:t>
+      </w:r>
+      <w:r>
+        <w:rPr>
+          <w:rFonts w:ascii="Calibri" w:cs="Calibri" w:eastAsia="Microsoft YaHei" w:hAnsi="Calibri"/>
+        </w:rPr>
+        <w:t xml:space="preserve"> 第 3 节加了一条关于高亮关键词的限制（整词匹配；中文词多数不会被标出）。</w:t>
+      </w:r>
+    </w:p>
+    <w:p>
+      <w:pPr>
+        <w:spacing w:after="120"/>
+      </w:pPr>
+      <w:r>
+        <w:rPr>
+          <w:rFonts w:ascii="Calibri" w:cs="Calibri" w:eastAsia="Microsoft YaHei" w:hAnsi="Calibri"/>
+          <w:b/>
+          <w:bCs/>
+        </w:rPr>
         <w:t xml:space="preserve">局限：</w:t>
       </w:r>
       <w:r>
@@ -6545,7 +6617,7 @@
         <w:sz w:val="17"/>
         <w:szCs w:val="17"/>
       </w:rPr>
-      <w:t xml:space="preserve">筛选指南 v2026-10-07f   |   第 </w:t>
+      <w:t xml:space="preserve">筛选指南 v2026-10-10a   |   第 </w:t>
     </w:r>
     <w:r>
       <w:rPr>

</xml_diff>

<commit_message>
Guide and manual v2026-10-10b: status-only corrections (protocol v1.3, EndNote, shared keyword lists)
No screening rule, decision, reason name or table row changed. Guide: protocol v1.2 -> v1.3
references, protocol now states blind mode and no AI/auto-duplicate functions, EndNote check
marked done, outdated "confirm at calibration" hedges removed, highlight word lists now the
19 green / 47 red words actually set in the formal project, IPD request timing stated.
Manual: version and guide references updated, protocol-v1.3 statements for blind mode, AI
Reviewer and Ratings. Both .docx regenerated and schema-validated; log added to CLAUDE.md.

Co-Authored-By: Claude Sonnet 5.5 <noreply@anthropic.com>
Claude-Session: https://claude.ai/code/session_01FRD7etKqYN8v2bbXeeLMRW
</commit_message>
<xml_diff>
--- a/Screening guide - title and abstract (draft).docx
+++ b/Screening guide - title and abstract (draft).docx
@@ -11,7 +11,7 @@
         <w:rPr>
           <w:rFonts w:ascii="Calibri" w:cs="Calibri" w:eastAsia="Microsoft YaHei" w:hAnsi="Calibri"/>
         </w:rPr>
-        <w:t xml:space="preserve">筛选指南（草稿）— 儿童游走脾系统综述（PROSPERO CRD420261520329，协议 v1.2）</w:t>
+        <w:t xml:space="preserve">筛选指南（草稿）— 儿童游走脾系统综述（PROSPERO CRD420261520329，协议 v1.3）</w:t>
       </w:r>
     </w:p>
     <w:p>
@@ -36,15 +36,29 @@
         <w:rPr>
           <w:rFonts w:ascii="Calibri" w:cs="Calibri" w:eastAsia="Microsoft YaHei" w:hAnsi="Calibri"/>
         </w:rPr>
-        <w:t xml:space="preserve"> </w:t>
-      </w:r>
-      <w:r>
-        <w:rPr>
-          <w:rFonts w:ascii="Calibri" w:cs="Calibri" w:eastAsia="Microsoft YaHei" w:hAnsi="Calibri"/>
-          <w:b/>
-          <w:bCs/>
-        </w:rPr>
-        <w:t xml:space="preserve">本指南只是把已注册协议的纳入排除标准落成可操作的规则，不改变协议；标"待作者决定"的事项需要三位商定。</w:t>
+        <w:t xml:space="preserve"> 2026 年 10 月 10 日有两次补充：加了高亮限制的提醒；再更新状态性说明和协议版本号（v2026-10-10b），</w:t>
+      </w:r>
+      <w:r>
+        <w:rPr>
+          <w:rFonts w:ascii="Calibri" w:cs="Calibri" w:eastAsia="Microsoft YaHei" w:hAnsi="Calibri"/>
+          <w:b/>
+          <w:bCs/>
+        </w:rPr>
+        <w:t xml:space="preserve">没有改任何判断规则</w:t>
+      </w:r>
+      <w:r>
+        <w:rPr>
+          <w:rFonts w:ascii="Calibri" w:cs="Calibri" w:eastAsia="Microsoft YaHei" w:hAnsi="Calibri"/>
+        </w:rPr>
+        <w:t xml:space="preserve">（见第 11 节）。</w:t>
+      </w:r>
+      <w:r>
+        <w:rPr>
+          <w:rFonts w:ascii="Calibri" w:cs="Calibri" w:eastAsia="Microsoft YaHei" w:hAnsi="Calibri"/>
+          <w:b/>
+          <w:bCs/>
+        </w:rPr>
+        <w:t xml:space="preserve">本指南只是把已注册协议的纳入排除标准落成可操作的规则，不改变协议；第 8 节的待决定事项已于 2026 年 10 月 7 日全部决定。</w:t>
       </w:r>
     </w:p>
     <w:p>
@@ -171,7 +185,7 @@
         <w:rPr>
           <w:rFonts w:ascii="Calibri" w:cs="Calibri" w:eastAsia="Microsoft YaHei" w:hAnsi="Calibri"/>
         </w:rPr>
-        <w:t xml:space="preserve">去重由脚本完成，EndNote 核对待做。筛选时如果发现同一篇文章的两条记录，在 Rayyan 里标为重复，不要直接删除。</w:t>
+        <w:t xml:space="preserve">去重由脚本完成，并已用 EndNote 的查重功能核对（2026 年 10 月 5 日）。筛选时如果发现同一篇文章的两条记录，在 Rayyan 里标为重复，不要直接删除。</w:t>
       </w:r>
     </w:p>
     <w:p>
@@ -194,7 +208,7 @@
         <w:rPr>
           <w:rFonts w:ascii="Calibri" w:cs="Calibri" w:eastAsia="Microsoft YaHei" w:hAnsi="Calibri"/>
         </w:rPr>
-        <w:t xml:space="preserve">说明：协议第 14 节写的是</w:t>
+        <w:t xml:space="preserve">说明：协议第 14 节写明</w:t>
       </w:r>
       <w:r>
         <w:rPr>
@@ -208,7 +222,7 @@
         <w:rPr>
           <w:rFonts w:ascii="Calibri" w:cs="Calibri" w:eastAsia="Microsoft YaHei" w:hAnsi="Calibri"/>
         </w:rPr>
-        <w:t xml:space="preserve">，分歧由讨论或第三位（杨军）解决；协议没有提 Rayyan 的盲法开关。下面的 </w:t>
+        <w:t xml:space="preserve">，分歧由讨论或第三位（杨军）解决；协议 v1.3 还写明：Rayyan 的盲法在两人都筛完一个阶段之前保持开启，作者和期刊信息隐藏。所以下面的 </w:t>
       </w:r>
       <w:r>
         <w:rPr>
@@ -222,7 +236,7 @@
         <w:rPr>
           <w:rFonts w:ascii="Calibri" w:cs="Calibri" w:eastAsia="Microsoft YaHei" w:hAnsi="Calibri"/>
         </w:rPr>
-        <w:t xml:space="preserve"> 是我们为落实"独立"选的设置：盲法开着，两人在筛完之前看不到对方的决定，方法部分才能写"独立筛选"。两人都筛完标题摘要后，再关掉盲法看冲突。</w:t>
+        <w:t xml:space="preserve"> 是协议的一部分：盲法开着，两人在筛完之前看不到对方的决定，方法部分才能写"独立筛选"。两人都筛完标题摘要后，再关掉盲法看冲突。</w:t>
       </w:r>
     </w:p>
     <w:p>
@@ -512,7 +526,7 @@
         <w:rPr>
           <w:rFonts w:ascii="Calibri" w:cs="Calibri" w:eastAsia="Microsoft YaHei" w:hAnsi="Calibri"/>
         </w:rPr>
-        <w:t xml:space="preserve">（校准中有 4 条 Exclude 没选理由，见第 11 节）。我们的 E1–E6 在 Rayyan 里没有预先设置的步骤：排除理由和标签都是在筛选时、打开一条记录后点决定栏里的 </w:t>
+        <w:t xml:space="preserve">（校准中有 4 条 Exclude 没选理由，见第 11 节）。我们没有找到可以预先设置 E1–E6 的地方：排除理由和标签都是在筛选时、打开一条记录后点决定栏里的 </w:t>
       </w:r>
       <w:r>
         <w:rPr>
@@ -540,21 +554,15 @@
         <w:rPr>
           <w:rFonts w:ascii="Calibri" w:cs="Calibri" w:eastAsia="Microsoft YaHei" w:hAnsi="Calibri"/>
         </w:rPr>
-        <w:t xml:space="preserve">，在 "Add exclusion reasons" 框里输入名称并应用，之后就保存在项目的列表里。</w:t>
-      </w:r>
-      <w:r>
-        <w:rPr>
-          <w:rFonts w:ascii="Calibri" w:cs="Calibri" w:eastAsia="Microsoft YaHei" w:hAnsi="Calibri"/>
-          <w:b/>
-          <w:bCs/>
-        </w:rPr>
-        <w:t xml:space="preserve">第一个创建的人按下面的名称一字不差地输入，另一位从列表里选，不要自己再打一遍</w:t>
-      </w:r>
-      <w:r>
-        <w:rPr>
-          <w:rFonts w:ascii="Calibri" w:cs="Calibri" w:eastAsia="Microsoft YaHei" w:hAnsi="Calibri"/>
-        </w:rPr>
-        <w:t xml:space="preserve">（据 Rayyan 帮助中心搜索结果的说明；帮助页本身在我们的环境里打不开，细节以校准时的实际界面为准）。</w:t>
+        <w:t xml:space="preserve">，在 "Add exclusion reasons" 框里输入名称并应用，之后就保存在项目的列表里（校准项目和正式项目里都是这样建的；正式项目里 E1–E4 已于 2026 年 10 月 7 日建好，彭飞的列表里能看到）。</w:t>
+      </w:r>
+      <w:r>
+        <w:rPr>
+          <w:rFonts w:ascii="Calibri" w:cs="Calibri" w:eastAsia="Microsoft YaHei" w:hAnsi="Calibri"/>
+          <w:b/>
+          <w:bCs/>
+        </w:rPr>
+        <w:t xml:space="preserve">创建理由等于对那条记录做了一次真实的 Exclude 决定，所以要用确实适用的记录来建。第一个创建的人按下面的名称一字不差地输入，另一位从列表里选，不要自己再打一遍。</w:t>
       </w:r>
     </w:p>
     <w:p>
@@ -811,13 +819,13 @@
           <w:b/>
           <w:bCs/>
         </w:rPr>
-        <w:t xml:space="preserve">先改 Rayyan 的默认高亮关键词（5 Oct 校准项目截图所见）。</w:t>
-      </w:r>
-      <w:r>
-        <w:rPr>
-          <w:rFonts w:ascii="Calibri" w:cs="Calibri" w:eastAsia="Microsoft YaHei" w:hAnsi="Calibri"/>
-        </w:rPr>
-        <w:t xml:space="preserve"> 右侧 Keywords for exclude 里默认有 </w:t>
+        <w:t xml:space="preserve">Rayyan 的默认高亮关键词已经清理过（正式项目里 2026 年 10 月 7 日完成并核对）。</w:t>
+      </w:r>
+      <w:r>
+        <w:rPr>
+          <w:rFonts w:ascii="Calibri" w:cs="Calibri" w:eastAsia="Microsoft YaHei" w:hAnsi="Calibri"/>
+        </w:rPr>
+        <w:t xml:space="preserve"> Rayyan 默认的 Keywords for exclude 里有 </w:t>
       </w:r>
       <w:r>
         <w:rPr>
@@ -892,21 +900,21 @@
         <w:rPr>
           <w:rFonts w:ascii="Calibri" w:cs="Calibri" w:eastAsia="Microsoft YaHei" w:hAnsi="Calibri"/>
         </w:rPr>
-        <w:t xml:space="preserve"> 会误导。</w:t>
-      </w:r>
-      <w:r>
-        <w:rPr>
-          <w:rFonts w:ascii="Calibri" w:cs="Calibri" w:eastAsia="Microsoft YaHei" w:hAnsi="Calibri"/>
-          <w:b/>
-          <w:bCs/>
-        </w:rPr>
-        <w:t xml:space="preserve">开始筛选前删掉这些默认词，只保留下面建议的词</w:t>
-      </w:r>
-      <w:r>
-        <w:rPr>
-          <w:rFonts w:ascii="Calibri" w:cs="Calibri" w:eastAsia="Microsoft YaHei" w:hAnsi="Calibri"/>
-        </w:rPr>
-        <w:t xml:space="preserve">；两位筛选员的设置要一致（高亮是个人设置还是项目共享，请在校准时确认）。</w:t>
+        <w:t xml:space="preserve"> 会误导，所以这些默认词都已删除，只保留下面"高亮词"一项里的词。</w:t>
+      </w:r>
+      <w:r>
+        <w:rPr>
+          <w:rFonts w:ascii="Calibri" w:cs="Calibri" w:eastAsia="Microsoft YaHei" w:hAnsi="Calibri"/>
+          <w:b/>
+          <w:bCs/>
+        </w:rPr>
+        <w:t xml:space="preserve">这两个列表是项目共享的</w:t>
+      </w:r>
+      <w:r>
+        <w:rPr>
+          <w:rFonts w:ascii="Calibri" w:cs="Calibri" w:eastAsia="Microsoft YaHei" w:hAnsi="Calibri"/>
+        </w:rPr>
+        <w:t xml:space="preserve">（2026 年 10 月 7 日彭飞在正式项目里的截图显示，她的列表与舒俊清理后的完全一致）：任何一个人增删，对方的页面也会变，所以不要自己改，要改先商量。</w:t>
       </w:r>
     </w:p>
     <w:p>
@@ -954,7 +962,7 @@
         <w:rPr>
           <w:rFonts w:ascii="Calibri" w:cs="Calibri" w:eastAsia="Microsoft YaHei" w:hAnsi="Calibri"/>
         </w:rPr>
-        <w:t xml:space="preserve">（AI Reviewer、Analyze、ResearchPilot 聊天等）：协议 v1.2 没有写使用 AI 或自动化工具辅助筛选。如果以后要用，先修改协议，并在方法部分说明。</w:t>
+        <w:t xml:space="preserve">（AI Reviewer、Analyze、ResearchPilot 聊天等）：协议 v1.3 写明不使用 Rayyan 的人工智能功能，也不使用它的自动查重和自动处理重复。如果以后要用，先修改协议，并在方法部分说明。</w:t>
       </w:r>
     </w:p>
     <w:p>
@@ -1096,7 +1104,7 @@
         <w:rPr>
           <w:rFonts w:ascii="Calibri" w:cs="Calibri" w:eastAsia="Microsoft YaHei" w:hAnsi="Calibri"/>
         </w:rPr>
-        <w:t xml:space="preserve">高亮词建议：</w:t>
+        <w:t xml:space="preserve">高亮词（正式项目里已按下面的词设置）：</w:t>
       </w:r>
     </w:p>
     <w:p>
@@ -1112,7 +1120,7 @@
         <w:rPr>
           <w:rFonts w:ascii="Calibri" w:cs="Calibri" w:eastAsia="Microsoft YaHei" w:hAnsi="Calibri"/>
         </w:rPr>
-        <w:t xml:space="preserve">绿色（可能相关）：wandering, floating spleen, movable, pelvic spleen, splenoptosis, torsion, volvulus, splenopexy, child, pediatric, infant, 游走脾, 游动脾, 漂浮脾, 脾下垂, 脾蒂扭转, 儿童, 小儿, 患儿。</w:t>
+        <w:t xml:space="preserve">绿色（可能相关，19 个词）：wandering, floating spleen, movable, pelvic spleen, splenoptosis, torsion, volvulus, splenopexy, child, pediatric, infant, 游走脾, 游动脾, 漂浮脾, 脾下垂, 脾蒂扭转, 儿童, 小儿, 患儿。</w:t>
       </w:r>
     </w:p>
     <w:p>
@@ -1128,7 +1136,7 @@
         <w:rPr>
           <w:rFonts w:ascii="Calibri" w:cs="Calibri" w:eastAsia="Microsoft YaHei" w:hAnsi="Calibri"/>
         </w:rPr>
-        <w:t xml:space="preserve">红色（可能排除）：splenosis, accessory, supernumerary, pregnancy, dog, canine, cat, rat, mouse, patent, 脾种植, 副脾, 妊娠, 犬, 大鼠, 小鼠, 专利。</w:t>
+        <w:t xml:space="preserve">红色（可能排除，47 个词，2026 年 10 月 7 日按截图核对）：splenosis, accessory, supernumerary, pregnancy, patent, 脾种植, 副脾, 妊娠, 专利；动物、兽医和实验用词：animal, animals, veterinary, dog, dogs, canine, cat, cats, horse, equine, pig, porcine, piglets, rat, rats, mouse, mice, murine, rabbit, rabbits, rodent, rodents, beagle, beagles, broiler, broilers, purebred, fish, transgenic, soil, in vitro, cadaver, cadavers, cadaveric, 犬, 猫, 大鼠, 小鼠。</w:t>
       </w:r>
     </w:p>
     <w:p>
@@ -4311,7 +4319,37 @@
         <w:rPr>
           <w:rFonts w:ascii="Calibri" w:cs="Calibri" w:eastAsia="Microsoft YaHei" w:hAnsi="Calibri"/>
         </w:rPr>
-        <w:t xml:space="preserve">（具体说明写在备注里，是否有备注功能请在校准时确认；没有的话改为在名称里直接写 </w:t>
+        <w:t xml:space="preserve">（具体说明写在记录下方的 </w:t>
+      </w:r>
+      <w:r>
+        <w:rPr>
+          <w:rFonts w:ascii="Calibri" w:cs="Calibri" w:eastAsia="Microsoft YaHei" w:hAnsi="Calibri"/>
+          <w:b/>
+          <w:bCs/>
+        </w:rPr>
+        <w:t xml:space="preserve">Add note</w:t>
+      </w:r>
+      <w:r>
+        <w:rPr>
+          <w:rFonts w:ascii="Calibri" w:cs="Calibri" w:eastAsia="Microsoft YaHei" w:hAnsi="Calibri"/>
+        </w:rPr>
+        <w:t xml:space="preserve"> 备注框里）</w:t>
+      </w:r>
+    </w:p>
+    <w:p>
+      <w:pPr>
+        <w:pStyle w:val="ListParagraph"/>
+        <w:numPr>
+          <w:ilvl w:val="0"/>
+          <w:numId w:val="2"/>
+        </w:numPr>
+        <w:spacing w:after="60"/>
+      </w:pPr>
+      <w:r>
+        <w:rPr>
+          <w:rFonts w:ascii="Calibri" w:cs="Calibri" w:eastAsia="Microsoft YaHei" w:hAnsi="Calibri"/>
+        </w:rPr>
+        <w:t xml:space="preserve">标签：</w:t>
       </w:r>
       <w:r>
         <w:rPr>
@@ -4320,29 +4358,13 @@
           <w:szCs w:val="19"/>
           <w:shd w:fill="EEEEEE" w:val="clear"/>
         </w:rPr>
-        <w:t xml:space="preserve">E6 other - 一句话说明</w:t>
-      </w:r>
-      <w:r>
-        <w:rPr>
-          <w:rFonts w:ascii="Calibri" w:cs="Calibri" w:eastAsia="Microsoft YaHei" w:hAnsi="Calibri"/>
-        </w:rPr>
-        <w:t xml:space="preserve">，并在校准后统一）</w:t>
-      </w:r>
-    </w:p>
-    <w:p>
-      <w:pPr>
-        <w:pStyle w:val="ListParagraph"/>
-        <w:numPr>
-          <w:ilvl w:val="0"/>
-          <w:numId w:val="2"/>
-        </w:numPr>
-        <w:spacing w:after="60"/>
-      </w:pPr>
-      <w:r>
-        <w:rPr>
-          <w:rFonts w:ascii="Calibri" w:cs="Calibri" w:eastAsia="Microsoft YaHei" w:hAnsi="Calibri"/>
-        </w:rPr>
-        <w:t xml:space="preserve">标签：</w:t>
+        <w:t xml:space="preserve">review-for-refs</w:t>
+      </w:r>
+      <w:r>
+        <w:rPr>
+          <w:rFonts w:ascii="Calibri" w:cs="Calibri" w:eastAsia="Microsoft YaHei" w:hAnsi="Calibri"/>
+        </w:rPr>
+        <w:t xml:space="preserve">、</w:t>
       </w:r>
       <w:r>
         <w:rPr>
@@ -4351,13 +4373,332 @@
           <w:szCs w:val="19"/>
           <w:shd w:fill="EEEEEE" w:val="clear"/>
         </w:rPr>
-        <w:t xml:space="preserve">review-for-refs</w:t>
-      </w:r>
-      <w:r>
-        <w:rPr>
-          <w:rFonts w:ascii="Calibri" w:cs="Calibri" w:eastAsia="Microsoft YaHei" w:hAnsi="Calibri"/>
-        </w:rPr>
-        <w:t xml:space="preserve">、</w:t>
+        <w:t xml:space="preserve">lang-other</w:t>
+      </w:r>
+    </w:p>
+    <w:p>
+      <w:pPr>
+        <w:spacing w:after="120"/>
+      </w:pPr>
+      <w:r>
+        <w:rPr>
+          <w:rFonts w:ascii="Calibri" w:cs="Calibri" w:eastAsia="Microsoft YaHei" w:hAnsi="Calibri"/>
+          <w:b/>
+          <w:bCs/>
+        </w:rPr>
+        <w:t xml:space="preserve">一条记录同时符合两条理由时</w:t>
+      </w:r>
+      <w:r>
+        <w:rPr>
+          <w:rFonts w:ascii="Calibri" w:cs="Calibri" w:eastAsia="Microsoft YaHei" w:hAnsi="Calibri"/>
+        </w:rPr>
+        <w:t xml:space="preserve">（例如成人的副脾：既是 E2 又是 E3），选任何一条适用的都可以，不用为此讨论。标题摘要阶段的理由不影响谁进入全文，只有全文阶段的理由才进入 PRISMA 图。（校准中，成人副脾那条两人选了同一条 E3，副脾患儿那条两人选了同一条 E2，没有造成分歧。）</w:t>
+      </w:r>
+    </w:p>
+    <w:p>
+      <w:pPr>
+        <w:spacing w:after="120"/>
+      </w:pPr>
+      <w:r>
+        <w:rPr>
+          <w:rFonts w:ascii="Calibri" w:cs="Calibri" w:eastAsia="Microsoft YaHei" w:hAnsi="Calibri"/>
+        </w:rPr>
+        <w:t xml:space="preserve">全文阶段另有：</w:t>
+      </w:r>
+      <w:r>
+        <w:rPr>
+          <w:rFonts w:ascii="Calibri" w:cs="Calibri" w:eastAsia="Microsoft YaHei" w:hAnsi="Calibri"/>
+          <w:b/>
+          <w:bCs/>
+        </w:rPr>
+        <w:t xml:space="preserve">L 语言</w:t>
+      </w:r>
+      <w:r>
+        <w:rPr>
+          <w:rFonts w:ascii="Calibri" w:cs="Calibri" w:eastAsia="Microsoft YaHei" w:hAnsi="Calibri"/>
+        </w:rPr>
+        <w:t xml:space="preserve">（既非英文也非中文，单独计数）、</w:t>
+      </w:r>
+      <w:r>
+        <w:rPr>
+          <w:rFonts w:ascii="Calibri" w:cs="Calibri" w:eastAsia="Microsoft YaHei" w:hAnsi="Calibri"/>
+          <w:b/>
+          <w:bCs/>
+        </w:rPr>
+        <w:t xml:space="preserve">D 无法获得全文</w:t>
+      </w:r>
+      <w:r>
+        <w:rPr>
+          <w:rFonts w:ascii="Calibri" w:cs="Calibri" w:eastAsia="Microsoft YaHei" w:hAnsi="Calibri"/>
+        </w:rPr>
+        <w:t xml:space="preserve">（记下尝试过的途径）、</w:t>
+      </w:r>
+      <w:r>
+        <w:rPr>
+          <w:rFonts w:ascii="Calibri" w:cs="Calibri" w:eastAsia="Microsoft YaHei" w:hAnsi="Calibri"/>
+          <w:b/>
+          <w:bCs/>
+        </w:rPr>
+        <w:t xml:space="preserve">A 仅有汇总数据</w:t>
+      </w:r>
+      <w:r>
+        <w:rPr>
+          <w:rFonts w:ascii="Calibri" w:cs="Calibri" w:eastAsia="Microsoft YaHei" w:hAnsi="Calibri"/>
+        </w:rPr>
+        <w:t xml:space="preserve">（见第 6 节）、</w:t>
+      </w:r>
+      <w:r>
+        <w:rPr>
+          <w:rFonts w:ascii="Calibri" w:cs="Calibri" w:eastAsia="Microsoft YaHei" w:hAnsi="Calibri"/>
+          <w:b/>
+          <w:bCs/>
+        </w:rPr>
+        <w:t xml:space="preserve">N 年龄无法确认小于 18 岁</w:t>
+      </w:r>
+      <w:r>
+        <w:rPr>
+          <w:rFonts w:ascii="Calibri" w:cs="Calibri" w:eastAsia="Microsoft YaHei" w:hAnsi="Calibri"/>
+        </w:rPr>
+        <w:t xml:space="preserve">。</w:t>
+      </w:r>
+    </w:p>
+    <w:p>
+      <w:pPr>
+        <w:pStyle w:val="Heading2"/>
+        <w:keepNext/>
+      </w:pPr>
+      <w:r>
+        <w:rPr>
+          <w:rFonts w:ascii="Calibri" w:cs="Calibri" w:eastAsia="Microsoft YaHei" w:hAnsi="Calibri"/>
+        </w:rPr>
+        <w:t xml:space="preserve">6. 全文阶段</w:t>
+      </w:r>
+    </w:p>
+    <w:p>
+      <w:pPr>
+        <w:spacing w:after="120"/>
+      </w:pPr>
+      <w:r>
+        <w:rPr>
+          <w:rFonts w:ascii="Calibri" w:cs="Calibri" w:eastAsia="Microsoft YaHei" w:hAnsi="Calibri"/>
+          <w:b/>
+          <w:bCs/>
+        </w:rPr>
+        <w:t xml:space="preserve">纳入条件（协议第 7 节）：</w:t>
+      </w:r>
+      <w:r>
+        <w:rPr>
+          <w:rFonts w:ascii="Calibri" w:cs="Calibri" w:eastAsia="Microsoft YaHei" w:hAnsi="Calibri"/>
+        </w:rPr>
+        <w:t xml:space="preserve"> 游走脾经影像和/或手术证实；手术时年龄 &lt; 18 岁（未手术者以诊断时为准）；报告了个体年龄；对主要分析而言还需报告个体的脾脏存活情况。</w:t>
+      </w:r>
+    </w:p>
+    <w:p>
+      <w:pPr>
+        <w:spacing w:after="120"/>
+      </w:pPr>
+      <w:r>
+        <w:rPr>
+          <w:rFonts w:ascii="Calibri" w:cs="Calibri" w:eastAsia="Microsoft YaHei" w:hAnsi="Calibri"/>
+          <w:b/>
+          <w:bCs/>
+        </w:rPr>
+        <w:t xml:space="preserve">每篇全文请记录：</w:t>
+      </w:r>
+    </w:p>
+    <w:p>
+      <w:pPr>
+        <w:pStyle w:val="ListParagraph"/>
+        <w:numPr>
+          <w:ilvl w:val="0"/>
+          <w:numId w:val="2"/>
+        </w:numPr>
+        <w:spacing w:after="60"/>
+      </w:pPr>
+      <w:r>
+        <w:rPr>
+          <w:rFonts w:ascii="Calibri" w:cs="Calibri" w:eastAsia="Microsoft YaHei" w:hAnsi="Calibri"/>
+        </w:rPr>
+        <w:t xml:space="preserve">报告编号（WS 编号）、第一作者、年份、语种。</w:t>
+      </w:r>
+    </w:p>
+    <w:p>
+      <w:pPr>
+        <w:pStyle w:val="ListParagraph"/>
+        <w:numPr>
+          <w:ilvl w:val="0"/>
+          <w:numId w:val="2"/>
+        </w:numPr>
+        <w:spacing w:after="60"/>
+      </w:pPr>
+      <w:r>
+        <w:rPr>
+          <w:rFonts w:ascii="Calibri" w:cs="Calibri" w:eastAsia="Microsoft YaHei" w:hAnsi="Calibri"/>
+        </w:rPr>
+        <w:t xml:space="preserve">纳入的儿童人数。</w:t>
+      </w:r>
+    </w:p>
+    <w:p>
+      <w:pPr>
+        <w:pStyle w:val="ListParagraph"/>
+        <w:numPr>
+          <w:ilvl w:val="0"/>
+          <w:numId w:val="2"/>
+        </w:numPr>
+        <w:spacing w:after="60"/>
+      </w:pPr>
+      <w:r>
+        <w:rPr>
+          <w:rFonts w:ascii="Calibri" w:cs="Calibri" w:eastAsia="Microsoft YaHei" w:hAnsi="Calibri"/>
+        </w:rPr>
+        <w:t xml:space="preserve">个体数据是否可得：个体可得 / 只有汇总。</w:t>
+      </w:r>
+    </w:p>
+    <w:p>
+      <w:pPr>
+        <w:pStyle w:val="ListParagraph"/>
+        <w:numPr>
+          <w:ilvl w:val="0"/>
+          <w:numId w:val="2"/>
+        </w:numPr>
+        <w:spacing w:after="60"/>
+      </w:pPr>
+      <w:r>
+        <w:rPr>
+          <w:rFonts w:ascii="Calibri" w:cs="Calibri" w:eastAsia="Microsoft YaHei" w:hAnsi="Calibri"/>
+        </w:rPr>
+        <w:t xml:space="preserve">是否与其他报告重复患者，重复的写明对应哪篇。</w:t>
+      </w:r>
+    </w:p>
+    <w:p>
+      <w:pPr>
+        <w:pStyle w:val="ListParagraph"/>
+        <w:numPr>
+          <w:ilvl w:val="0"/>
+          <w:numId w:val="2"/>
+        </w:numPr>
+        <w:spacing w:after="60"/>
+      </w:pPr>
+      <w:r>
+        <w:rPr>
+          <w:rFonts w:ascii="Calibri" w:cs="Calibri" w:eastAsia="Microsoft YaHei" w:hAnsi="Calibri"/>
+        </w:rPr>
+        <w:t xml:space="preserve">排除时，选固定理由。</w:t>
+      </w:r>
+    </w:p>
+    <w:p>
+      <w:pPr>
+        <w:spacing w:after="120"/>
+      </w:pPr>
+      <w:r>
+        <w:rPr>
+          <w:rFonts w:ascii="Calibri" w:cs="Calibri" w:eastAsia="Microsoft YaHei" w:hAnsi="Calibri"/>
+          <w:b/>
+          <w:bCs/>
+        </w:rPr>
+        <w:t xml:space="preserve">只有汇总数据的报告：</w:t>
+      </w:r>
+      <w:r>
+        <w:rPr>
+          <w:rFonts w:ascii="Calibri" w:cs="Calibri" w:eastAsia="Microsoft YaHei" w:hAnsi="Calibri"/>
+        </w:rPr>
+        <w:t xml:space="preserve"> 协议规定向通讯作者发邮件索取个体数据，间隔 4 周发两次；索取不到则做叙述性描述。已经发现的重点：北京儿童医院李拴玲等 2024 年 19 例脾扭转系列。</w:t>
+      </w:r>
+      <w:r>
+        <w:rPr>
+          <w:rFonts w:ascii="Calibri" w:cs="Calibri" w:eastAsia="Microsoft YaHei" w:hAnsi="Calibri"/>
+          <w:b/>
+          <w:bCs/>
+        </w:rPr>
+        <w:t xml:space="preserve">索取的时间已经决定（2026 年 10 月 5 日）：到全文阶段，对所有只有汇总数据的报告一次性发出，现在不发。</w:t>
+      </w:r>
+      <w:r>
+        <w:rPr>
+          <w:rFonts w:ascii="Calibri" w:cs="Calibri" w:eastAsia="Microsoft YaHei" w:hAnsi="Calibri"/>
+        </w:rPr>
+        <w:t xml:space="preserve"> 这一篇要先在全文里核对它有没有个体表格、是不是游走脾，再决定是否索取。</w:t>
+      </w:r>
+    </w:p>
+    <w:p>
+      <w:pPr>
+        <w:spacing w:after="120"/>
+      </w:pPr>
+      <w:r>
+        <w:rPr>
+          <w:rFonts w:ascii="Calibri" w:cs="Calibri" w:eastAsia="Microsoft YaHei" w:hAnsi="Calibri"/>
+          <w:b/>
+          <w:bCs/>
+        </w:rPr>
+        <w:t xml:space="preserve">不要排除的：</w:t>
+      </w:r>
+      <w:r>
+        <w:rPr>
+          <w:rFonts w:ascii="Calibri" w:cs="Calibri" w:eastAsia="Microsoft YaHei" w:hAnsi="Calibri"/>
+        </w:rPr>
+        <w:t xml:space="preserve"> 缺少症状持续时间或脾脏存活判断的患者，仍然纳入，只是进不了主要分析，会在描述性分析里出现。</w:t>
+      </w:r>
+    </w:p>
+    <w:p>
+      <w:pPr>
+        <w:pStyle w:val="Heading2"/>
+        <w:keepNext/>
+      </w:pPr>
+      <w:r>
+        <w:rPr>
+          <w:rFonts w:ascii="Calibri" w:cs="Calibri" w:eastAsia="Microsoft YaHei" w:hAnsi="Calibri"/>
+        </w:rPr>
+        <w:t xml:space="preserve">7. 解决分歧</w:t>
+      </w:r>
+    </w:p>
+    <w:p>
+      <w:pPr>
+        <w:spacing w:after="120"/>
+      </w:pPr>
+      <w:r>
+        <w:rPr>
+          <w:rFonts w:ascii="Calibri" w:cs="Calibri" w:eastAsia="Microsoft YaHei" w:hAnsi="Calibri"/>
+          <w:b/>
+          <w:bCs/>
+        </w:rPr>
+        <w:t xml:space="preserve">分歧在 Rayyan 外面解决（舒俊 2026 年 10 月 7 日选定；杨军不需要 Rayyan 账号）。</w:t>
+      </w:r>
+      <w:r>
+        <w:rPr>
+          <w:rFonts w:ascii="Calibri" w:cs="Calibri" w:eastAsia="Microsoft YaHei" w:hAnsi="Calibri"/>
+        </w:rPr>
+        <w:t xml:space="preserve"> Rayyan 里保留两人各自独立的原始决定，不在里面改。</w:t>
+      </w:r>
+    </w:p>
+    <w:p>
+      <w:pPr>
+        <w:pStyle w:val="ListParagraph"/>
+        <w:numPr>
+          <w:ilvl w:val="0"/>
+          <w:numId w:val="6"/>
+        </w:numPr>
+        <w:spacing w:after="60"/>
+      </w:pPr>
+      <w:r>
+        <w:rPr>
+          <w:rFonts w:ascii="Calibri" w:cs="Calibri" w:eastAsia="Microsoft YaHei" w:hAnsi="Calibri"/>
+        </w:rPr>
+        <w:t xml:space="preserve">两人都筛完全部记录后，才由舒俊关闭正式项目的 Blind Mode。关闭前请先各自记下自己的数字。</w:t>
+      </w:r>
+    </w:p>
+    <w:p>
+      <w:pPr>
+        <w:pStyle w:val="ListParagraph"/>
+        <w:numPr>
+          <w:ilvl w:val="0"/>
+          <w:numId w:val="6"/>
+        </w:numPr>
+        <w:spacing w:after="60"/>
+      </w:pPr>
+      <w:r>
+        <w:rPr>
+          <w:rFonts w:ascii="Calibri" w:cs="Calibri" w:eastAsia="Microsoft YaHei" w:hAnsi="Calibri"/>
+        </w:rPr>
+        <w:t xml:space="preserve">舒俊导出：Review data → 右上 "···" → Export，范围 All references，格式 CSV，勾选 decisions、exclusion reasons、labels、user notes。导出会得到两个文件（</w:t>
       </w:r>
       <w:r>
         <w:rPr>
@@ -4366,318 +4707,13 @@
           <w:szCs w:val="19"/>
           <w:shd w:fill="EEEEEE" w:val="clear"/>
         </w:rPr>
-        <w:t xml:space="preserve">lang-other</w:t>
-      </w:r>
-    </w:p>
-    <w:p>
-      <w:pPr>
-        <w:spacing w:after="120"/>
-      </w:pPr>
-      <w:r>
-        <w:rPr>
-          <w:rFonts w:ascii="Calibri" w:cs="Calibri" w:eastAsia="Microsoft YaHei" w:hAnsi="Calibri"/>
-          <w:b/>
-          <w:bCs/>
-        </w:rPr>
-        <w:t xml:space="preserve">一条记录同时符合两条理由时</w:t>
-      </w:r>
-      <w:r>
-        <w:rPr>
-          <w:rFonts w:ascii="Calibri" w:cs="Calibri" w:eastAsia="Microsoft YaHei" w:hAnsi="Calibri"/>
-        </w:rPr>
-        <w:t xml:space="preserve">（例如成人的副脾：既是 E2 又是 E3），选任何一条适用的都可以，不用为此讨论。标题摘要阶段的理由不影响谁进入全文，只有全文阶段的理由才进入 PRISMA 图。（校准中，成人副脾那条两人选了同一条 E3，副脾患儿那条两人选了同一条 E2，没有造成分歧。）</w:t>
-      </w:r>
-    </w:p>
-    <w:p>
-      <w:pPr>
-        <w:spacing w:after="120"/>
-      </w:pPr>
-      <w:r>
-        <w:rPr>
-          <w:rFonts w:ascii="Calibri" w:cs="Calibri" w:eastAsia="Microsoft YaHei" w:hAnsi="Calibri"/>
-        </w:rPr>
-        <w:t xml:space="preserve">全文阶段另有：</w:t>
-      </w:r>
-      <w:r>
-        <w:rPr>
-          <w:rFonts w:ascii="Calibri" w:cs="Calibri" w:eastAsia="Microsoft YaHei" w:hAnsi="Calibri"/>
-          <w:b/>
-          <w:bCs/>
-        </w:rPr>
-        <w:t xml:space="preserve">L 语言</w:t>
-      </w:r>
-      <w:r>
-        <w:rPr>
-          <w:rFonts w:ascii="Calibri" w:cs="Calibri" w:eastAsia="Microsoft YaHei" w:hAnsi="Calibri"/>
-        </w:rPr>
-        <w:t xml:space="preserve">（既非英文也非中文，单独计数）、</w:t>
-      </w:r>
-      <w:r>
-        <w:rPr>
-          <w:rFonts w:ascii="Calibri" w:cs="Calibri" w:eastAsia="Microsoft YaHei" w:hAnsi="Calibri"/>
-          <w:b/>
-          <w:bCs/>
-        </w:rPr>
-        <w:t xml:space="preserve">D 无法获得全文</w:t>
-      </w:r>
-      <w:r>
-        <w:rPr>
-          <w:rFonts w:ascii="Calibri" w:cs="Calibri" w:eastAsia="Microsoft YaHei" w:hAnsi="Calibri"/>
-        </w:rPr>
-        <w:t xml:space="preserve">（记下尝试过的途径）、</w:t>
-      </w:r>
-      <w:r>
-        <w:rPr>
-          <w:rFonts w:ascii="Calibri" w:cs="Calibri" w:eastAsia="Microsoft YaHei" w:hAnsi="Calibri"/>
-          <w:b/>
-          <w:bCs/>
-        </w:rPr>
-        <w:t xml:space="preserve">A 仅有汇总数据</w:t>
-      </w:r>
-      <w:r>
-        <w:rPr>
-          <w:rFonts w:ascii="Calibri" w:cs="Calibri" w:eastAsia="Microsoft YaHei" w:hAnsi="Calibri"/>
-        </w:rPr>
-        <w:t xml:space="preserve">（见第 6 节）、</w:t>
-      </w:r>
-      <w:r>
-        <w:rPr>
-          <w:rFonts w:ascii="Calibri" w:cs="Calibri" w:eastAsia="Microsoft YaHei" w:hAnsi="Calibri"/>
-          <w:b/>
-          <w:bCs/>
-        </w:rPr>
-        <w:t xml:space="preserve">N 年龄无法确认小于 18 岁</w:t>
-      </w:r>
-      <w:r>
-        <w:rPr>
-          <w:rFonts w:ascii="Calibri" w:cs="Calibri" w:eastAsia="Microsoft YaHei" w:hAnsi="Calibri"/>
-        </w:rPr>
-        <w:t xml:space="preserve">。</w:t>
-      </w:r>
-    </w:p>
-    <w:p>
-      <w:pPr>
-        <w:pStyle w:val="Heading2"/>
-        <w:keepNext/>
-      </w:pPr>
-      <w:r>
-        <w:rPr>
-          <w:rFonts w:ascii="Calibri" w:cs="Calibri" w:eastAsia="Microsoft YaHei" w:hAnsi="Calibri"/>
-        </w:rPr>
-        <w:t xml:space="preserve">6. 全文阶段</w:t>
-      </w:r>
-    </w:p>
-    <w:p>
-      <w:pPr>
-        <w:spacing w:after="120"/>
-      </w:pPr>
-      <w:r>
-        <w:rPr>
-          <w:rFonts w:ascii="Calibri" w:cs="Calibri" w:eastAsia="Microsoft YaHei" w:hAnsi="Calibri"/>
-          <w:b/>
-          <w:bCs/>
-        </w:rPr>
-        <w:t xml:space="preserve">纳入条件（协议第 7 节）：</w:t>
-      </w:r>
-      <w:r>
-        <w:rPr>
-          <w:rFonts w:ascii="Calibri" w:cs="Calibri" w:eastAsia="Microsoft YaHei" w:hAnsi="Calibri"/>
-        </w:rPr>
-        <w:t xml:space="preserve"> 游走脾经影像和/或手术证实；手术时年龄 &lt; 18 岁（未手术者以诊断时为准）；报告了个体年龄；对主要分析而言还需报告个体的脾脏存活情况。</w:t>
-      </w:r>
-    </w:p>
-    <w:p>
-      <w:pPr>
-        <w:spacing w:after="120"/>
-      </w:pPr>
-      <w:r>
-        <w:rPr>
-          <w:rFonts w:ascii="Calibri" w:cs="Calibri" w:eastAsia="Microsoft YaHei" w:hAnsi="Calibri"/>
-          <w:b/>
-          <w:bCs/>
-        </w:rPr>
-        <w:t xml:space="preserve">每篇全文请记录：</w:t>
-      </w:r>
-    </w:p>
-    <w:p>
-      <w:pPr>
-        <w:pStyle w:val="ListParagraph"/>
-        <w:numPr>
-          <w:ilvl w:val="0"/>
-          <w:numId w:val="2"/>
-        </w:numPr>
-        <w:spacing w:after="60"/>
-      </w:pPr>
-      <w:r>
-        <w:rPr>
-          <w:rFonts w:ascii="Calibri" w:cs="Calibri" w:eastAsia="Microsoft YaHei" w:hAnsi="Calibri"/>
-        </w:rPr>
-        <w:t xml:space="preserve">报告编号（WS 编号）、第一作者、年份、语种。</w:t>
-      </w:r>
-    </w:p>
-    <w:p>
-      <w:pPr>
-        <w:pStyle w:val="ListParagraph"/>
-        <w:numPr>
-          <w:ilvl w:val="0"/>
-          <w:numId w:val="2"/>
-        </w:numPr>
-        <w:spacing w:after="60"/>
-      </w:pPr>
-      <w:r>
-        <w:rPr>
-          <w:rFonts w:ascii="Calibri" w:cs="Calibri" w:eastAsia="Microsoft YaHei" w:hAnsi="Calibri"/>
-        </w:rPr>
-        <w:t xml:space="preserve">纳入的儿童人数。</w:t>
-      </w:r>
-    </w:p>
-    <w:p>
-      <w:pPr>
-        <w:pStyle w:val="ListParagraph"/>
-        <w:numPr>
-          <w:ilvl w:val="0"/>
-          <w:numId w:val="2"/>
-        </w:numPr>
-        <w:spacing w:after="60"/>
-      </w:pPr>
-      <w:r>
-        <w:rPr>
-          <w:rFonts w:ascii="Calibri" w:cs="Calibri" w:eastAsia="Microsoft YaHei" w:hAnsi="Calibri"/>
-        </w:rPr>
-        <w:t xml:space="preserve">个体数据是否可得：个体可得 / 只有汇总。</w:t>
-      </w:r>
-    </w:p>
-    <w:p>
-      <w:pPr>
-        <w:pStyle w:val="ListParagraph"/>
-        <w:numPr>
-          <w:ilvl w:val="0"/>
-          <w:numId w:val="2"/>
-        </w:numPr>
-        <w:spacing w:after="60"/>
-      </w:pPr>
-      <w:r>
-        <w:rPr>
-          <w:rFonts w:ascii="Calibri" w:cs="Calibri" w:eastAsia="Microsoft YaHei" w:hAnsi="Calibri"/>
-        </w:rPr>
-        <w:t xml:space="preserve">是否与其他报告重复患者，重复的写明对应哪篇。</w:t>
-      </w:r>
-    </w:p>
-    <w:p>
-      <w:pPr>
-        <w:pStyle w:val="ListParagraph"/>
-        <w:numPr>
-          <w:ilvl w:val="0"/>
-          <w:numId w:val="2"/>
-        </w:numPr>
-        <w:spacing w:after="60"/>
-      </w:pPr>
-      <w:r>
-        <w:rPr>
-          <w:rFonts w:ascii="Calibri" w:cs="Calibri" w:eastAsia="Microsoft YaHei" w:hAnsi="Calibri"/>
-        </w:rPr>
-        <w:t xml:space="preserve">排除时，选固定理由。</w:t>
-      </w:r>
-    </w:p>
-    <w:p>
-      <w:pPr>
-        <w:spacing w:after="120"/>
-      </w:pPr>
-      <w:r>
-        <w:rPr>
-          <w:rFonts w:ascii="Calibri" w:cs="Calibri" w:eastAsia="Microsoft YaHei" w:hAnsi="Calibri"/>
-          <w:b/>
-          <w:bCs/>
-        </w:rPr>
-        <w:t xml:space="preserve">只有汇总数据的报告：</w:t>
-      </w:r>
-      <w:r>
-        <w:rPr>
-          <w:rFonts w:ascii="Calibri" w:cs="Calibri" w:eastAsia="Microsoft YaHei" w:hAnsi="Calibri"/>
-        </w:rPr>
-        <w:t xml:space="preserve"> 协议规定向通讯作者发邮件索取个体数据，间隔 4 周发两次；索取不到则做叙述性描述。已经发现的重点：北京儿童医院李拴玲等 2024 年 19 例脾扭转系列，建议索取。</w:t>
-      </w:r>
-    </w:p>
-    <w:p>
-      <w:pPr>
-        <w:spacing w:after="120"/>
-      </w:pPr>
-      <w:r>
-        <w:rPr>
-          <w:rFonts w:ascii="Calibri" w:cs="Calibri" w:eastAsia="Microsoft YaHei" w:hAnsi="Calibri"/>
-          <w:b/>
-          <w:bCs/>
-        </w:rPr>
-        <w:t xml:space="preserve">不要排除的：</w:t>
-      </w:r>
-      <w:r>
-        <w:rPr>
-          <w:rFonts w:ascii="Calibri" w:cs="Calibri" w:eastAsia="Microsoft YaHei" w:hAnsi="Calibri"/>
-        </w:rPr>
-        <w:t xml:space="preserve"> 缺少症状持续时间或脾脏存活判断的患者，仍然纳入，只是进不了主要分析，会在描述性分析里出现。</w:t>
-      </w:r>
-    </w:p>
-    <w:p>
-      <w:pPr>
-        <w:pStyle w:val="Heading2"/>
-        <w:keepNext/>
-      </w:pPr>
-      <w:r>
-        <w:rPr>
-          <w:rFonts w:ascii="Calibri" w:cs="Calibri" w:eastAsia="Microsoft YaHei" w:hAnsi="Calibri"/>
-        </w:rPr>
-        <w:t xml:space="preserve">7. 解决分歧</w:t>
-      </w:r>
-    </w:p>
-    <w:p>
-      <w:pPr>
-        <w:spacing w:after="120"/>
-      </w:pPr>
-      <w:r>
-        <w:rPr>
-          <w:rFonts w:ascii="Calibri" w:cs="Calibri" w:eastAsia="Microsoft YaHei" w:hAnsi="Calibri"/>
-          <w:b/>
-          <w:bCs/>
-        </w:rPr>
-        <w:t xml:space="preserve">分歧在 Rayyan 外面解决（舒俊 2026 年 10 月 7 日选定；杨军不需要 Rayyan 账号）。</w:t>
-      </w:r>
-      <w:r>
-        <w:rPr>
-          <w:rFonts w:ascii="Calibri" w:cs="Calibri" w:eastAsia="Microsoft YaHei" w:hAnsi="Calibri"/>
-        </w:rPr>
-        <w:t xml:space="preserve"> Rayyan 里保留两人各自独立的原始决定，不在里面改。</w:t>
-      </w:r>
-    </w:p>
-    <w:p>
-      <w:pPr>
-        <w:pStyle w:val="ListParagraph"/>
-        <w:numPr>
-          <w:ilvl w:val="0"/>
-          <w:numId w:val="6"/>
-        </w:numPr>
-        <w:spacing w:after="60"/>
-      </w:pPr>
-      <w:r>
-        <w:rPr>
-          <w:rFonts w:ascii="Calibri" w:cs="Calibri" w:eastAsia="Microsoft YaHei" w:hAnsi="Calibri"/>
-        </w:rPr>
-        <w:t xml:space="preserve">两人都筛完全部记录后，才由舒俊关闭正式项目的 Blind Mode。关闭前请先各自记下自己的数字。</w:t>
-      </w:r>
-    </w:p>
-    <w:p>
-      <w:pPr>
-        <w:pStyle w:val="ListParagraph"/>
-        <w:numPr>
-          <w:ilvl w:val="0"/>
-          <w:numId w:val="6"/>
-        </w:numPr>
-        <w:spacing w:after="60"/>
-      </w:pPr>
-      <w:r>
-        <w:rPr>
-          <w:rFonts w:ascii="Calibri" w:cs="Calibri" w:eastAsia="Microsoft YaHei" w:hAnsi="Calibri"/>
-        </w:rPr>
-        <w:t xml:space="preserve">舒俊导出：Review data → 右上 "···" → Export，范围 All references，格式 CSV，勾选 decisions、exclusion reasons、labels、user notes。导出会得到两个文件（</w:t>
+        <w:t xml:space="preserve">articles.csv</w:t>
+      </w:r>
+      <w:r>
+        <w:rPr>
+          <w:rFonts w:ascii="Calibri" w:cs="Calibri" w:eastAsia="Microsoft YaHei" w:hAnsi="Calibri"/>
+        </w:rPr>
+        <w:t xml:space="preserve"> 和 </w:t>
       </w:r>
       <w:r>
         <w:rPr>
@@ -4686,13 +4722,43 @@
           <w:szCs w:val="19"/>
           <w:shd w:fill="EEEEEE" w:val="clear"/>
         </w:rPr>
-        <w:t xml:space="preserve">articles.csv</w:t>
-      </w:r>
-      <w:r>
-        <w:rPr>
-          <w:rFonts w:ascii="Calibri" w:cs="Calibri" w:eastAsia="Microsoft YaHei" w:hAnsi="Calibri"/>
-        </w:rPr>
-        <w:t xml:space="preserve"> 和 </w:t>
+        <w:t xml:space="preserve">customizations_log.csv</w:t>
+      </w:r>
+      <w:r>
+        <w:rPr>
+          <w:rFonts w:ascii="Calibri" w:cs="Calibri" w:eastAsia="Microsoft YaHei" w:hAnsi="Calibri"/>
+        </w:rPr>
+        <w:t xml:space="preserve">），其中带有筛选员的邮箱，</w:t>
+      </w:r>
+      <w:r>
+        <w:rPr>
+          <w:rFonts w:ascii="Calibri" w:cs="Calibri" w:eastAsia="Microsoft YaHei" w:hAnsi="Calibri"/>
+          <w:b/>
+          <w:bCs/>
+        </w:rPr>
+        <w:t xml:space="preserve">不要提交到仓库</w:t>
+      </w:r>
+      <w:r>
+        <w:rPr>
+          <w:rFonts w:ascii="Calibri" w:cs="Calibri" w:eastAsia="Microsoft YaHei" w:hAnsi="Calibri"/>
+        </w:rPr>
+        <w:t xml:space="preserve">。</w:t>
+      </w:r>
+    </w:p>
+    <w:p>
+      <w:pPr>
+        <w:pStyle w:val="ListParagraph"/>
+        <w:numPr>
+          <w:ilvl w:val="0"/>
+          <w:numId w:val="6"/>
+        </w:numPr>
+        <w:spacing w:after="60"/>
+      </w:pPr>
+      <w:r>
+        <w:rPr>
+          <w:rFonts w:ascii="Calibri" w:cs="Calibri" w:eastAsia="Microsoft YaHei" w:hAnsi="Calibri"/>
+        </w:rPr>
+        <w:t xml:space="preserve">用 </w:t>
       </w:r>
       <w:r>
         <w:rPr>
@@ -4701,27 +4767,27 @@
           <w:szCs w:val="19"/>
           <w:shd w:fill="EEEEEE" w:val="clear"/>
         </w:rPr>
-        <w:t xml:space="preserve">customizations_log.csv</w:t>
-      </w:r>
-      <w:r>
-        <w:rPr>
-          <w:rFonts w:ascii="Calibri" w:cs="Calibri" w:eastAsia="Microsoft YaHei" w:hAnsi="Calibri"/>
-        </w:rPr>
-        <w:t xml:space="preserve">），其中带有筛选员的邮箱，</w:t>
-      </w:r>
-      <w:r>
-        <w:rPr>
-          <w:rFonts w:ascii="Calibri" w:cs="Calibri" w:eastAsia="Microsoft YaHei" w:hAnsi="Calibri"/>
-          <w:b/>
-          <w:bCs/>
-        </w:rPr>
-        <w:t xml:space="preserve">不要提交到仓库</w:t>
-      </w:r>
-      <w:r>
-        <w:rPr>
-          <w:rFonts w:ascii="Calibri" w:cs="Calibri" w:eastAsia="Microsoft YaHei" w:hAnsi="Calibri"/>
-        </w:rPr>
-        <w:t xml:space="preserve">。</w:t>
+        <w:t xml:space="preserve">tools/screening_conflicts.py</w:t>
+      </w:r>
+      <w:r>
+        <w:rPr>
+          <w:rFonts w:ascii="Calibri" w:cs="Calibri" w:eastAsia="Microsoft YaHei" w:hAnsi="Calibri"/>
+        </w:rPr>
+        <w:t xml:space="preserve"> 处理（Claude 或舒俊运行；用法见脚本开头）。它生成四个不含邮箱的文件：全部记录的两人决定表；</w:t>
+      </w:r>
+      <w:r>
+        <w:rPr>
+          <w:rFonts w:ascii="Calibri" w:cs="Calibri" w:eastAsia="Microsoft YaHei" w:hAnsi="Calibri"/>
+          <w:b/>
+          <w:bCs/>
+        </w:rPr>
+        <w:t xml:space="preserve">分歧清单</w:t>
+      </w:r>
+      <w:r>
+        <w:rPr>
+          <w:rFonts w:ascii="Calibri" w:cs="Calibri" w:eastAsia="Microsoft YaHei" w:hAnsi="Calibri"/>
+        </w:rPr>
+        <w:t xml:space="preserve">（含标题、摘要、两人的决定和理由，以及讨论和仲裁要填的列）；"纳入对 Maybe"清单；汇总（一致率、kappa、没选理由的 Exclude 数、未能对应到 WS 编号的记录数）。</w:t>
       </w:r>
     </w:p>
     <w:p>
@@ -4736,8 +4802,46 @@
       <w:r>
         <w:rPr>
           <w:rFonts w:ascii="Calibri" w:cs="Calibri" w:eastAsia="Microsoft YaHei" w:hAnsi="Calibri"/>
-        </w:rPr>
-        <w:t xml:space="preserve">用 </w:t>
+          <w:b/>
+          <w:bCs/>
+        </w:rPr>
+        <w:t xml:space="preserve">只有"一人 Exclude、另一人 Include 或 Maybe"的分歧需要解决</w:t>
+      </w:r>
+      <w:r>
+        <w:rPr>
+          <w:rFonts w:ascii="Calibri" w:cs="Calibri" w:eastAsia="Microsoft YaHei" w:hAnsi="Calibri"/>
+        </w:rPr>
+        <w:t xml:space="preserve">，因为这类记录会不会进入全文取决于它。</w:t>
+      </w:r>
+      <w:r>
+        <w:rPr>
+          <w:rFonts w:ascii="Calibri" w:cs="Calibri" w:eastAsia="Microsoft YaHei" w:hAnsi="Calibri"/>
+          <w:b/>
+          <w:bCs/>
+        </w:rPr>
+        <w:t xml:space="preserve">"Include 对 Maybe"两种都进入全文，只报告条数，不解决</w:t>
+      </w:r>
+      <w:r>
+        <w:rPr>
+          <w:rFonts w:ascii="Calibri" w:cs="Calibri" w:eastAsia="Microsoft YaHei" w:hAnsi="Calibri"/>
+        </w:rPr>
+        <w:t xml:space="preserve">（Claude 建议，舒俊 2026 年 10 月 7 日同意）。</w:t>
+      </w:r>
+    </w:p>
+    <w:p>
+      <w:pPr>
+        <w:pStyle w:val="ListParagraph"/>
+        <w:numPr>
+          <w:ilvl w:val="0"/>
+          <w:numId w:val="6"/>
+        </w:numPr>
+        <w:spacing w:after="60"/>
+      </w:pPr>
+      <w:r>
+        <w:rPr>
+          <w:rFonts w:ascii="Calibri" w:cs="Calibri" w:eastAsia="Microsoft YaHei" w:hAnsi="Calibri"/>
+        </w:rPr>
+        <w:t xml:space="preserve">解决顺序：先由舒俊和彭飞讨论，达成一致的决定填入 </w:t>
       </w:r>
       <w:r>
         <w:rPr>
@@ -4746,81 +4850,13 @@
           <w:szCs w:val="19"/>
           <w:shd w:fill="EEEEEE" w:val="clear"/>
         </w:rPr>
-        <w:t xml:space="preserve">tools/screening_conflicts.py</w:t>
-      </w:r>
-      <w:r>
-        <w:rPr>
-          <w:rFonts w:ascii="Calibri" w:cs="Calibri" w:eastAsia="Microsoft YaHei" w:hAnsi="Calibri"/>
-        </w:rPr>
-        <w:t xml:space="preserve"> 处理（Claude 或舒俊运行；用法见脚本开头）。它生成四个不含邮箱的文件：全部记录的两人决定表；</w:t>
-      </w:r>
-      <w:r>
-        <w:rPr>
-          <w:rFonts w:ascii="Calibri" w:cs="Calibri" w:eastAsia="Microsoft YaHei" w:hAnsi="Calibri"/>
-          <w:b/>
-          <w:bCs/>
-        </w:rPr>
-        <w:t xml:space="preserve">分歧清单</w:t>
-      </w:r>
-      <w:r>
-        <w:rPr>
-          <w:rFonts w:ascii="Calibri" w:cs="Calibri" w:eastAsia="Microsoft YaHei" w:hAnsi="Calibri"/>
-        </w:rPr>
-        <w:t xml:space="preserve">（含标题、摘要、两人的决定和理由，以及讨论和仲裁要填的列）；"纳入对 Maybe"清单；汇总（一致率、kappa、没选理由的 Exclude 数、未能对应到 WS 编号的记录数）。</w:t>
-      </w:r>
-    </w:p>
-    <w:p>
-      <w:pPr>
-        <w:pStyle w:val="ListParagraph"/>
-        <w:numPr>
-          <w:ilvl w:val="0"/>
-          <w:numId w:val="6"/>
-        </w:numPr>
-        <w:spacing w:after="60"/>
-      </w:pPr>
-      <w:r>
-        <w:rPr>
-          <w:rFonts w:ascii="Calibri" w:cs="Calibri" w:eastAsia="Microsoft YaHei" w:hAnsi="Calibri"/>
-          <w:b/>
-          <w:bCs/>
-        </w:rPr>
-        <w:t xml:space="preserve">只有"一人 Exclude、另一人 Include 或 Maybe"的分歧需要解决</w:t>
-      </w:r>
-      <w:r>
-        <w:rPr>
-          <w:rFonts w:ascii="Calibri" w:cs="Calibri" w:eastAsia="Microsoft YaHei" w:hAnsi="Calibri"/>
-        </w:rPr>
-        <w:t xml:space="preserve">，因为这类记录会不会进入全文取决于它。</w:t>
-      </w:r>
-      <w:r>
-        <w:rPr>
-          <w:rFonts w:ascii="Calibri" w:cs="Calibri" w:eastAsia="Microsoft YaHei" w:hAnsi="Calibri"/>
-          <w:b/>
-          <w:bCs/>
-        </w:rPr>
-        <w:t xml:space="preserve">"Include 对 Maybe"两种都进入全文，只报告条数，不解决</w:t>
-      </w:r>
-      <w:r>
-        <w:rPr>
-          <w:rFonts w:ascii="Calibri" w:cs="Calibri" w:eastAsia="Microsoft YaHei" w:hAnsi="Calibri"/>
-        </w:rPr>
-        <w:t xml:space="preserve">（Claude 建议，舒俊 2026 年 10 月 7 日同意）。</w:t>
-      </w:r>
-    </w:p>
-    <w:p>
-      <w:pPr>
-        <w:pStyle w:val="ListParagraph"/>
-        <w:numPr>
-          <w:ilvl w:val="0"/>
-          <w:numId w:val="6"/>
-        </w:numPr>
-        <w:spacing w:after="60"/>
-      </w:pPr>
-      <w:r>
-        <w:rPr>
-          <w:rFonts w:ascii="Calibri" w:cs="Calibri" w:eastAsia="Microsoft YaHei" w:hAnsi="Calibri"/>
-        </w:rPr>
-        <w:t xml:space="preserve">解决顺序：先由舒俊和彭飞讨论，达成一致的决定填入 </w:t>
+        <w:t xml:space="preserve">discussion_agreed_decision</w:t>
+      </w:r>
+      <w:r>
+        <w:rPr>
+          <w:rFonts w:ascii="Calibri" w:cs="Calibri" w:eastAsia="Microsoft YaHei" w:hAnsi="Calibri"/>
+        </w:rPr>
+        <w:t xml:space="preserve">，理由写在 </w:t>
       </w:r>
       <w:r>
         <w:rPr>
@@ -4829,13 +4865,13 @@
           <w:szCs w:val="19"/>
           <w:shd w:fill="EEEEEE" w:val="clear"/>
         </w:rPr>
-        <w:t xml:space="preserve">discussion_agreed_decision</w:t>
-      </w:r>
-      <w:r>
-        <w:rPr>
-          <w:rFonts w:ascii="Calibri" w:cs="Calibri" w:eastAsia="Microsoft YaHei" w:hAnsi="Calibri"/>
-        </w:rPr>
-        <w:t xml:space="preserve">，理由写在 </w:t>
+        <w:t xml:space="preserve">discussion_note</w:t>
+      </w:r>
+      <w:r>
+        <w:rPr>
+          <w:rFonts w:ascii="Calibri" w:cs="Calibri" w:eastAsia="Microsoft YaHei" w:hAnsi="Calibri"/>
+        </w:rPr>
+        <w:t xml:space="preserve">；讨论不一致的交杨军，杨军填 </w:t>
       </w:r>
       <w:r>
         <w:rPr>
@@ -4844,13 +4880,13 @@
           <w:szCs w:val="19"/>
           <w:shd w:fill="EEEEEE" w:val="clear"/>
         </w:rPr>
-        <w:t xml:space="preserve">discussion_note</w:t>
-      </w:r>
-      <w:r>
-        <w:rPr>
-          <w:rFonts w:ascii="Calibri" w:cs="Calibri" w:eastAsia="Microsoft YaHei" w:hAnsi="Calibri"/>
-        </w:rPr>
-        <w:t xml:space="preserve">；讨论不一致的交杨军，杨军填 </w:t>
+        <w:t xml:space="preserve">adjudicator_decision</w:t>
+      </w:r>
+      <w:r>
+        <w:rPr>
+          <w:rFonts w:ascii="Calibri" w:cs="Calibri" w:eastAsia="Microsoft YaHei" w:hAnsi="Calibri"/>
+        </w:rPr>
+        <w:t xml:space="preserve"> 和 </w:t>
       </w:r>
       <w:r>
         <w:rPr>
@@ -4859,13 +4895,13 @@
           <w:szCs w:val="19"/>
           <w:shd w:fill="EEEEEE" w:val="clear"/>
         </w:rPr>
-        <w:t xml:space="preserve">adjudicator_decision</w:t>
-      </w:r>
-      <w:r>
-        <w:rPr>
-          <w:rFonts w:ascii="Calibri" w:cs="Calibri" w:eastAsia="Microsoft YaHei" w:hAnsi="Calibri"/>
-        </w:rPr>
-        <w:t xml:space="preserve"> 和 </w:t>
+        <w:t xml:space="preserve">adjudicator_note</w:t>
+      </w:r>
+      <w:r>
+        <w:rPr>
+          <w:rFonts w:ascii="Calibri" w:cs="Calibri" w:eastAsia="Microsoft YaHei" w:hAnsi="Calibri"/>
+        </w:rPr>
+        <w:t xml:space="preserve">；最后在 </w:t>
       </w:r>
       <w:r>
         <w:rPr>
@@ -4874,13 +4910,29 @@
           <w:szCs w:val="19"/>
           <w:shd w:fill="EEEEEE" w:val="clear"/>
         </w:rPr>
-        <w:t xml:space="preserve">adjudicator_note</w:t>
-      </w:r>
-      <w:r>
-        <w:rPr>
-          <w:rFonts w:ascii="Calibri" w:cs="Calibri" w:eastAsia="Microsoft YaHei" w:hAnsi="Calibri"/>
-        </w:rPr>
-        <w:t xml:space="preserve">；最后在 </w:t>
+        <w:t xml:space="preserve">final_decision</w:t>
+      </w:r>
+      <w:r>
+        <w:rPr>
+          <w:rFonts w:ascii="Calibri" w:cs="Calibri" w:eastAsia="Microsoft YaHei" w:hAnsi="Calibri"/>
+        </w:rPr>
+        <w:t xml:space="preserve"> 填最终决定。杨军直接用 Excel 或 WPS 打开分歧清单即可，清单里有标题和摘要。</w:t>
+      </w:r>
+    </w:p>
+    <w:p>
+      <w:pPr>
+        <w:pStyle w:val="ListParagraph"/>
+        <w:numPr>
+          <w:ilvl w:val="0"/>
+          <w:numId w:val="6"/>
+        </w:numPr>
+        <w:spacing w:after="60"/>
+      </w:pPr>
+      <w:r>
+        <w:rPr>
+          <w:rFonts w:ascii="Calibri" w:cs="Calibri" w:eastAsia="Microsoft YaHei" w:hAnsi="Calibri"/>
+        </w:rPr>
+        <w:t xml:space="preserve">填好的分歧清单提交到仓库 </w:t>
       </w:r>
       <w:r>
         <w:rPr>
@@ -4889,37 +4941,6 @@
           <w:szCs w:val="19"/>
           <w:shd w:fill="EEEEEE" w:val="clear"/>
         </w:rPr>
-        <w:t xml:space="preserve">final_decision</w:t>
-      </w:r>
-      <w:r>
-        <w:rPr>
-          <w:rFonts w:ascii="Calibri" w:cs="Calibri" w:eastAsia="Microsoft YaHei" w:hAnsi="Calibri"/>
-        </w:rPr>
-        <w:t xml:space="preserve"> 填最终决定。杨军直接用 Excel 或 WPS 打开分歧清单即可，清单里有标题和摘要。</w:t>
-      </w:r>
-    </w:p>
-    <w:p>
-      <w:pPr>
-        <w:pStyle w:val="ListParagraph"/>
-        <w:numPr>
-          <w:ilvl w:val="0"/>
-          <w:numId w:val="6"/>
-        </w:numPr>
-        <w:spacing w:after="60"/>
-      </w:pPr>
-      <w:r>
-        <w:rPr>
-          <w:rFonts w:ascii="Calibri" w:cs="Calibri" w:eastAsia="Microsoft YaHei" w:hAnsi="Calibri"/>
-        </w:rPr>
-        <w:t xml:space="preserve">填好的分歧清单提交到仓库 </w:t>
-      </w:r>
-      <w:r>
-        <w:rPr>
-          <w:rFonts w:ascii="Consolas" w:cs="Consolas" w:eastAsia="Microsoft YaHei" w:hAnsi="Consolas"/>
-          <w:sz w:val="19"/>
-          <w:szCs w:val="19"/>
-          <w:shd w:fill="EEEEEE" w:val="clear"/>
-        </w:rPr>
         <w:t xml:space="preserve">search/screening/formal/</w:t>
       </w:r>
       <w:r>
@@ -5363,7 +5384,7 @@
         <w:rPr>
           <w:rFonts w:ascii="Calibri" w:cs="Calibri" w:eastAsia="Microsoft YaHei" w:hAnsi="Calibri"/>
         </w:rPr>
-        <w:t xml:space="preserve">与第一轮去重的衔接：4,906 条识别，去重后 2,548 条（EndNote 核对待做）。</w:t>
+        <w:t xml:space="preserve">与第一轮去重的衔接：4,906 条识别，去重后 2,548 条（脚本去重，已用 EndNote 查重核对）。</w:t>
       </w:r>
     </w:p>
     <w:p>
@@ -5407,7 +5428,7 @@
         <w:rPr>
           <w:rFonts w:ascii="Calibri" w:cs="Calibri" w:eastAsia="Microsoft YaHei" w:hAnsi="Calibri"/>
         </w:rPr>
-        <w:t xml:space="preserve">没有检索 Embase、没有检索 Google Scholar、引文追溯未完成，这些在协议 v1.2 的附录 A2、A8、B 里写明，论文里要写成局限。</w:t>
+        <w:t xml:space="preserve">没有检索 Embase、没有检索 Google Scholar、引文追溯未完成，这些在协议 v1.3 的附录 A2、A8、B 里写明，论文里要写成局限。</w:t>
       </w:r>
     </w:p>
     <w:p>
@@ -6543,6 +6564,25 @@
           <w:b/>
           <w:bCs/>
         </w:rPr>
+        <w:t xml:space="preserve">2026 年 10 月 10 日再补充（v2026-10-10b；只更新状态性说明和协议版本号，没有改任何判断规则、决定或理由名称）：</w:t>
+      </w:r>
+      <w:r>
+        <w:rPr>
+          <w:rFonts w:ascii="Calibri" w:cs="Calibri" w:eastAsia="Microsoft YaHei" w:hAnsi="Calibri"/>
+        </w:rPr>
+        <w:t xml:space="preserve"> ① 协议版本号 v1.2 改为 v1.3；② 协议 v1.3 已写明盲法开启、作者和期刊隐藏、不使用 Rayyan 的 AI 功能和自动查重，第 2、3 节相应改写；③ EndNote 查重核对已经完成，去掉"待做"；④ 高亮词列表已确认是项目共享，第 3 节列出正式项目里实际的 19 个绿色词和 47 个红色词；⑤ E6 的说明用 Add note，不再写"校准时确认"；⑥ 第 3 节写明建理由等于做了一次真实决定，E1–E4 已在正式项目建好；⑦ 第 6 节写明 IPD 索取的时间（全文阶段一次性）。</w:t>
+      </w:r>
+    </w:p>
+    <w:p>
+      <w:pPr>
+        <w:spacing w:after="120"/>
+      </w:pPr>
+      <w:r>
+        <w:rPr>
+          <w:rFonts w:ascii="Calibri" w:cs="Calibri" w:eastAsia="Microsoft YaHei" w:hAnsi="Calibri"/>
+          <w:b/>
+          <w:bCs/>
+        </w:rPr>
         <w:t xml:space="preserve">局限：</w:t>
       </w:r>
       <w:r>
@@ -6617,7 +6657,7 @@
         <w:sz w:val="17"/>
         <w:szCs w:val="17"/>
       </w:rPr>
-      <w:t xml:space="preserve">筛选指南 v2026-10-10a   |   第 </w:t>
+      <w:t xml:space="preserve">筛选指南 v2026-10-10b   |   第 </w:t>
     </w:r>
     <w:r>
       <w:rPr>

</xml_diff>

<commit_message>
Screening guide v2026-10-17a: status corrections and re-screen rules (section 12)
Co-Authored-By: Claude Sonnet 5.5 <noreply@anthropic.com>
Claude-Session: https://claude.ai/code/session_01FRD7etKqYN8v2bbXeLMRW
</commit_message>
<xml_diff>
--- a/Screening guide - title and abstract (draft).docx
+++ b/Screening guide - title and abstract (draft).docx
@@ -11,7 +11,7 @@
         <w:rPr>
           <w:rFonts w:ascii="Calibri" w:cs="Calibri" w:eastAsia="Microsoft YaHei" w:hAnsi="Calibri"/>
         </w:rPr>
-        <w:t xml:space="preserve">筛选指南（草稿）— 儿童游走脾系统综述（PROSPERO CRD420261520329，协议 v1.3）</w:t>
+        <w:t xml:space="preserve">筛选指南（草稿）— 儿童游走脾系统综述（PROSPERO CRD420261520329，协议 v1.4）</w:t>
       </w:r>
     </w:p>
     <w:p>
@@ -51,6 +51,20 @@
           <w:rFonts w:ascii="Calibri" w:cs="Calibri" w:eastAsia="Microsoft YaHei" w:hAnsi="Calibri"/>
         </w:rPr>
         <w:t xml:space="preserve">（见第 11 节）。</w:t>
+      </w:r>
+      <w:r>
+        <w:rPr>
+          <w:rFonts w:ascii="Calibri" w:cs="Calibri" w:eastAsia="Microsoft YaHei" w:hAnsi="Calibri"/>
+          <w:b/>
+          <w:bCs/>
+        </w:rPr>
+        <w:t xml:space="preserve">2026 年 10 月 17 日（v2026-10-17a）：因为第二位筛选员要在新的 Rayyan 项目里重新独立筛选全部记录，更新了第 3、7 节的状态性说明，新增第 12 节"重筛的规则"；纳入排除标准、4.3 速查表和 E1–E6 理由一字未改（见第 11 节）。</w:t>
+      </w:r>
+      <w:r>
+        <w:rPr>
+          <w:rFonts w:ascii="Calibri" w:cs="Calibri" w:eastAsia="Microsoft YaHei" w:hAnsi="Calibri"/>
+        </w:rPr>
+        <w:t xml:space="preserve"> </w:t>
       </w:r>
       <w:r>
         <w:rPr>
@@ -554,15 +568,15 @@
         <w:rPr>
           <w:rFonts w:ascii="Calibri" w:cs="Calibri" w:eastAsia="Microsoft YaHei" w:hAnsi="Calibri"/>
         </w:rPr>
-        <w:t xml:space="preserve">，在 "Add exclusion reasons" 框里输入名称并应用，之后就保存在项目的列表里（校准项目和正式项目里都是这样建的；正式项目里 E1–E4 已于 2026 年 10 月 7 日建好，彭飞的列表里能看到）。</w:t>
-      </w:r>
-      <w:r>
-        <w:rPr>
-          <w:rFonts w:ascii="Calibri" w:cs="Calibri" w:eastAsia="Microsoft YaHei" w:hAnsi="Calibri"/>
-          <w:b/>
-          <w:bCs/>
-        </w:rPr>
-        <w:t xml:space="preserve">创建理由等于对那条记录做了一次真实的 Exclude 决定，所以要用确实适用的记录来建。第一个创建的人按下面的名称一字不差地输入，另一位从列表里选，不要自己再打一遍。</w:t>
+        <w:t xml:space="preserve">，在 "Add exclusion reasons" 框里输入名称并应用，之后就保存在项目的列表里（校准项目和旧的正式项目里都是这样建的）。</w:t>
+      </w:r>
+      <w:r>
+        <w:rPr>
+          <w:rFonts w:ascii="Calibri" w:cs="Calibri" w:eastAsia="Microsoft YaHei" w:hAnsi="Calibri"/>
+          <w:b/>
+          <w:bCs/>
+        </w:rPr>
+        <w:t xml:space="preserve">重筛项目（2026 年 10 月 17 日新建，见第 12 节）里还没有任何理由或标签，由彭飞在遇到确实适用的记录时创建。创建理由等于对那条记录做了一次真实的 Exclude 决定，所以要用确实适用的记录来建；名称按下面一字不差地输入，建好以后从列表里选，不要再打一遍。</w:t>
       </w:r>
     </w:p>
     <w:p>
@@ -819,7 +833,7 @@
           <w:b/>
           <w:bCs/>
         </w:rPr>
-        <w:t xml:space="preserve">Rayyan 的默认高亮关键词已经清理过（正式项目里 2026 年 10 月 7 日完成并核对）。</w:t>
+        <w:t xml:space="preserve">Rayyan 的默认高亮关键词已经清理过（旧的正式项目 2026 年 10 月 7 日完成并核对；重筛项目 2026 年 10 月 17 日设置：include 19 个词、exclude 47 个词，由舒俊报告，页面上可见的部分与旧项目一致）。</w:t>
       </w:r>
       <w:r>
         <w:rPr>
@@ -956,13 +970,13 @@
           <w:b/>
           <w:bCs/>
         </w:rPr>
-        <w:t xml:space="preserve">不使用 Rayyan 的 AI 功能来做决定</w:t>
-      </w:r>
-      <w:r>
-        <w:rPr>
-          <w:rFonts w:ascii="Calibri" w:cs="Calibri" w:eastAsia="Microsoft YaHei" w:hAnsi="Calibri"/>
-        </w:rPr>
-        <w:t xml:space="preserve">（AI Reviewer、Analyze、ResearchPilot 聊天等）：协议 v1.3 写明不使用 Rayyan 的人工智能功能，也不使用它的自动查重和自动处理重复。如果以后要用，先修改协议，并在方法部分说明。</w:t>
+        <w:t xml:space="preserve">不使用任何 AI 来做决定或录入决定。</w:t>
+      </w:r>
+      <w:r>
+        <w:rPr>
+          <w:rFonts w:ascii="Calibri" w:cs="Calibri" w:eastAsia="Microsoft YaHei" w:hAnsi="Calibri"/>
+        </w:rPr>
+        <w:t xml:space="preserve"> 包括 Rayyan 自己的 AI 功能（AI Reviewer、Analyze、ResearchPilot 聊天等），也包括外部的 AI 工具（Codex、ChatGPT 等：让它读标题摘要给出判断，或让它代替人在 Rayyan 里点击）。协议 v1.4 写明不使用 Rayyan 的人工智能功能，也不使用它的自动查重和自动处理重复。如果以后要用，先修改协议，并在方法部分说明。</w:t>
       </w:r>
     </w:p>
     <w:p>
@@ -1064,7 +1078,21 @@
         <w:rPr>
           <w:rFonts w:ascii="Calibri" w:cs="Calibri" w:eastAsia="Microsoft YaHei" w:hAnsi="Calibri"/>
         </w:rPr>
-        <w:t xml:space="preserve">：Review data 标签 → 右上角 "···" → Review settings 面板 → Export；范围选 All references，格式 CSV，勾选 decisions、exclusion reasons、labels、user notes。</w:t>
+        <w:t xml:space="preserve">：Review data 标签 → 右上角 "···" → Export（2026 年 10 月 12 日导出时的路径；Review settings 里没有导出）；范围选 All references，</w:t>
+      </w:r>
+      <w:r>
+        <w:rPr>
+          <w:rFonts w:ascii="Calibri" w:cs="Calibri" w:eastAsia="Microsoft YaHei" w:hAnsi="Calibri"/>
+          <w:b/>
+          <w:bCs/>
+        </w:rPr>
+        <w:t xml:space="preserve">文件格式默认是 Refman，要改成 CSV</w:t>
+      </w:r>
+      <w:r>
+        <w:rPr>
+          <w:rFonts w:ascii="Calibri" w:cs="Calibri" w:eastAsia="Microsoft YaHei" w:hAnsi="Calibri"/>
+        </w:rPr>
+        <w:t xml:space="preserve">，勾选 abstracts、decisions、exclusion reasons、labels、user notes。</w:t>
       </w:r>
     </w:p>
     <w:p>
@@ -1104,7 +1132,7 @@
         <w:rPr>
           <w:rFonts w:ascii="Calibri" w:cs="Calibri" w:eastAsia="Microsoft YaHei" w:hAnsi="Calibri"/>
         </w:rPr>
-        <w:t xml:space="preserve">高亮词（正式项目里已按下面的词设置）：</w:t>
+        <w:t xml:space="preserve">高亮词（旧的正式项目和重筛项目里都已按下面的词设置）：</w:t>
       </w:r>
     </w:p>
     <w:p>
@@ -4660,6 +4688,39 @@
           <w:b/>
           <w:bCs/>
         </w:rPr>
+        <w:t xml:space="preserve">重筛的更新（2026 年 10 月 17 日）：</w:t>
+      </w:r>
+      <w:r>
+        <w:rPr>
+          <w:rFonts w:ascii="Calibri" w:cs="Calibri" w:eastAsia="Microsoft YaHei" w:hAnsi="Calibri"/>
+        </w:rPr>
+        <w:t xml:space="preserve"> 下面第 1–7 条写于 10 月 7 日，针对的是第一轮两人的独立决定。</w:t>
+      </w:r>
+      <w:r>
+        <w:rPr>
+          <w:rFonts w:ascii="Calibri" w:cs="Calibri" w:eastAsia="Microsoft YaHei" w:hAnsi="Calibri"/>
+          <w:b/>
+          <w:bCs/>
+        </w:rPr>
+        <w:t xml:space="preserve">对重筛，凡与第 12 节不同的地方，以第 12 节为准</w:t>
+      </w:r>
+      <w:r>
+        <w:rPr>
+          <w:rFonts w:ascii="Calibri" w:cs="Calibri" w:eastAsia="Microsoft YaHei" w:hAnsi="Calibri"/>
+        </w:rPr>
+        <w:t xml:space="preserve">，主要是：分歧不先由两人讨论，而由杨军在不知道两人决定的情况下盲评；比较的对象是舒俊在旧项目里的决定和彭飞在重筛项目里的决定。</w:t>
+      </w:r>
+    </w:p>
+    <w:p>
+      <w:pPr>
+        <w:spacing w:after="120"/>
+      </w:pPr>
+      <w:r>
+        <w:rPr>
+          <w:rFonts w:ascii="Calibri" w:cs="Calibri" w:eastAsia="Microsoft YaHei" w:hAnsi="Calibri"/>
+          <w:b/>
+          <w:bCs/>
+        </w:rPr>
         <w:t xml:space="preserve">分歧在 Rayyan 外面解决（舒俊 2026 年 10 月 7 日选定；杨军不需要 Rayyan 账号）。</w:t>
       </w:r>
       <w:r>
@@ -4698,7 +4759,7 @@
         <w:rPr>
           <w:rFonts w:ascii="Calibri" w:cs="Calibri" w:eastAsia="Microsoft YaHei" w:hAnsi="Calibri"/>
         </w:rPr>
-        <w:t xml:space="preserve">舒俊导出：Review data → 右上 "···" → Export，范围 All references，格式 CSV，勾选 decisions、exclusion reasons、labels、user notes。导出会得到两个文件（</w:t>
+        <w:t xml:space="preserve">舒俊导出：Review data → 右上 "···" → Export，范围 All references，文件格式改成 CSV（默认是 Refman），勾选 abstracts、decisions、exclusion reasons、labels、user notes。导出会得到两个文件（</w:t>
       </w:r>
       <w:r>
         <w:rPr>
@@ -5428,7 +5489,7 @@
         <w:rPr>
           <w:rFonts w:ascii="Calibri" w:cs="Calibri" w:eastAsia="Microsoft YaHei" w:hAnsi="Calibri"/>
         </w:rPr>
-        <w:t xml:space="preserve">没有检索 Embase、没有检索 Google Scholar、引文追溯未完成，这些在协议 v1.3 的附录 A2、A8、B 里写明，论文里要写成局限。</w:t>
+        <w:t xml:space="preserve">没有检索 Embase、没有检索 Google Scholar、引文追溯未完成，这些在协议 v1.4 的附录 A2、A8、B 里写明，论文里要写成局限。</w:t>
       </w:r>
     </w:p>
     <w:p>
@@ -6583,6 +6644,25 @@
           <w:b/>
           <w:bCs/>
         </w:rPr>
+        <w:t xml:space="preserve">2026 年 10 月 17 日再补充（v2026-10-17a；状态性更新和重筛的操作规则，没有改任何纳入排除标准、4.3 速查表、E1–E6 的名称和含义）：</w:t>
+      </w:r>
+      <w:r>
+        <w:rPr>
+          <w:rFonts w:ascii="Calibri" w:cs="Calibri" w:eastAsia="Microsoft YaHei" w:hAnsi="Calibri"/>
+        </w:rPr>
+        <w:t xml:space="preserve"> ① 协议版本号 v1.3 改为 v1.4（v1.4 只改了审查阶段的说明，盲法和 AI 的表述不变）；② 第 3 节：创建理由和标签的说明改为重筛项目的情形，删去"旧项目 E1–E4 已建好"的说明；关键词列表的状态更新；③ 第 3 节"不使用 AI"一条扩展到外部 AI 工具（来自 10 月 15–17 日的决定，是操作规则，不是纳入排除标准）；④ 导出路径改为 Review data → "···" → Export，并写明文件格式要从默认的 Refman 改成 CSV（之前写的 Review settings 路径不对）；⑤ 第 7 节加了一条说明；⑥ 新增第 12 节。</w:t>
+      </w:r>
+    </w:p>
+    <w:p>
+      <w:pPr>
+        <w:spacing w:after="120"/>
+      </w:pPr>
+      <w:r>
+        <w:rPr>
+          <w:rFonts w:ascii="Calibri" w:cs="Calibri" w:eastAsia="Microsoft YaHei" w:hAnsi="Calibri"/>
+          <w:b/>
+          <w:bCs/>
+        </w:rPr>
         <w:t xml:space="preserve">局限：</w:t>
       </w:r>
       <w:r>
@@ -6590,6 +6670,1056 @@
           <w:rFonts w:ascii="Calibri" w:cs="Calibri" w:eastAsia="Microsoft YaHei" w:hAnsi="Calibri"/>
         </w:rPr>
         <w:t xml:space="preserve"> n = 50，kappa 的区间较宽；校准里没有摘要的记录只有 11 条，这一类的结论是初步的，正式筛选时要继续观察。校准期间作者和期刊信息对两位筛选员都曾可见（至少部分时间），这对一致率有没有影响无法判断；写方法时要如实说明。</w:t>
+      </w:r>
+    </w:p>
+    <w:p>
+      <w:pPr>
+        <w:pStyle w:val="Heading2"/>
+        <w:keepNext/>
+      </w:pPr>
+      <w:r>
+        <w:rPr>
+          <w:rFonts w:ascii="Calibri" w:cs="Calibri" w:eastAsia="Microsoft YaHei" w:hAnsi="Calibri"/>
+        </w:rPr>
+        <w:t xml:space="preserve">12. 重筛的规则（2026 年 10 月 17 日）</w:t>
+      </w:r>
+    </w:p>
+    <w:p>
+      <w:pPr>
+        <w:spacing w:after="120"/>
+      </w:pPr>
+      <w:r>
+        <w:rPr>
+          <w:rFonts w:ascii="Calibri" w:cs="Calibri" w:eastAsia="Microsoft YaHei" w:hAnsi="Calibri"/>
+          <w:b/>
+          <w:bCs/>
+        </w:rPr>
+        <w:t xml:space="preserve">背景：</w:t>
+      </w:r>
+      <w:r>
+        <w:rPr>
+          <w:rFonts w:ascii="Calibri" w:cs="Calibri" w:eastAsia="Microsoft YaHei" w:hAnsi="Calibri"/>
+        </w:rPr>
+        <w:t xml:space="preserve"> 第一轮正式筛选里，第二位筛选员（彭飞）账号上的大部分决定是借助 AI 工具（Codex）做出的，不符合本指南第 3 节（舒俊 2026 年 10 月 17 日向 Claude 确认；给 Codex 的具体指令和输入还没有收到）。那批决定单独保存，不用于最终名单。因此彭飞在新项目里</w:t>
+      </w:r>
+      <w:r>
+        <w:rPr>
+          <w:rFonts w:ascii="Calibri" w:cs="Calibri" w:eastAsia="Microsoft YaHei" w:hAnsi="Calibri"/>
+          <w:b/>
+          <w:bCs/>
+        </w:rPr>
+        <w:t xml:space="preserve">重新独立筛选全部 2,548 条</w:t>
+      </w:r>
+      <w:r>
+        <w:rPr>
+          <w:rFonts w:ascii="Calibri" w:cs="Calibri" w:eastAsia="Microsoft YaHei" w:hAnsi="Calibri"/>
+        </w:rPr>
+        <w:t xml:space="preserve">。舒俊的第一轮决定是他自己逐条点击完成的（舒俊确认没有使用 AI），保持原样，不重做，也不修改。</w:t>
+      </w:r>
+    </w:p>
+    <w:p>
+      <w:pPr>
+        <w:spacing w:after="120"/>
+      </w:pPr>
+      <w:r>
+        <w:rPr>
+          <w:rFonts w:ascii="Calibri" w:cs="Calibri" w:eastAsia="Microsoft YaHei" w:hAnsi="Calibri"/>
+          <w:b/>
+          <w:bCs/>
+        </w:rPr>
+        <w:t xml:space="preserve">新项目：</w:t>
+      </w:r>
+      <w:r>
+        <w:rPr>
+          <w:rFonts w:ascii="Calibri" w:cs="Calibri" w:eastAsia="Microsoft YaHei" w:hAnsi="Calibri"/>
+        </w:rPr>
+        <w:t xml:space="preserve"> </w:t>
+      </w:r>
+      <w:r>
+        <w:rPr>
+          <w:rFonts w:ascii="Consolas" w:cs="Consolas" w:eastAsia="Microsoft YaHei" w:hAnsi="Consolas"/>
+          <w:sz w:val="19"/>
+          <w:szCs w:val="19"/>
+          <w:shd w:fill="EEEEEE" w:val="clear"/>
+        </w:rPr>
+        <w:t xml:space="preserve">Wandering spleen SR - re-screen 2548 (CRD420261520329)</w:t>
+      </w:r>
+      <w:r>
+        <w:rPr>
+          <w:rFonts w:ascii="Calibri" w:cs="Calibri" w:eastAsia="Microsoft YaHei" w:hAnsi="Calibri"/>
+        </w:rPr>
+        <w:t xml:space="preserve">，2026 年 10 月 17 日由舒俊（所有者）建立，导入的是同一个 </w:t>
+      </w:r>
+      <w:r>
+        <w:rPr>
+          <w:rFonts w:ascii="Consolas" w:cs="Consolas" w:eastAsia="Microsoft YaHei" w:hAnsi="Consolas"/>
+          <w:sz w:val="19"/>
+          <w:szCs w:val="19"/>
+          <w:shd w:fill="EEEEEE" w:val="clear"/>
+        </w:rPr>
+        <w:t xml:space="preserve">records_deduplicated.ris</w:t>
+      </w:r>
+      <w:r>
+        <w:rPr>
+          <w:rFonts w:ascii="Calibri" w:cs="Calibri" w:eastAsia="Microsoft YaHei" w:hAnsi="Calibri"/>
+        </w:rPr>
+        <w:t xml:space="preserve">（2,548 条），Blind Mode 开启，作者和期刊隐藏。舒俊在这个项目里</w:t>
+      </w:r>
+      <w:r>
+        <w:rPr>
+          <w:rFonts w:ascii="Calibri" w:cs="Calibri" w:eastAsia="Microsoft YaHei" w:hAnsi="Calibri"/>
+          <w:b/>
+          <w:bCs/>
+        </w:rPr>
+        <w:t xml:space="preserve">不做任何决定、不关闭 Blind Mode</w:t>
+      </w:r>
+      <w:r>
+        <w:rPr>
+          <w:rFonts w:ascii="Calibri" w:cs="Calibri" w:eastAsia="Microsoft YaHei" w:hAnsi="Calibri"/>
+        </w:rPr>
+        <w:t xml:space="preserve">，只负责导出。</w:t>
+      </w:r>
+      <w:r>
+        <w:rPr>
+          <w:rFonts w:ascii="Calibri" w:cs="Calibri" w:eastAsia="Microsoft YaHei" w:hAnsi="Calibri"/>
+          <w:b/>
+          <w:bCs/>
+        </w:rPr>
+        <w:t xml:space="preserve">不要打开另外两个旧项目</w:t>
+      </w:r>
+      <w:r>
+        <w:rPr>
+          <w:rFonts w:ascii="Calibri" w:cs="Calibri" w:eastAsia="Microsoft YaHei" w:hAnsi="Calibri"/>
+        </w:rPr>
+        <w:t xml:space="preserve">：旧的正式项目已经揭盲，里面能看到舒俊的决定。</w:t>
+      </w:r>
+    </w:p>
+    <w:p>
+      <w:pPr>
+        <w:spacing w:after="120"/>
+      </w:pPr>
+      <w:r>
+        <w:rPr>
+          <w:rFonts w:ascii="Calibri" w:cs="Calibri" w:eastAsia="Microsoft YaHei" w:hAnsi="Calibri"/>
+          <w:b/>
+          <w:bCs/>
+        </w:rPr>
+        <w:t xml:space="preserve">彭飞筛选时的规则：</w:t>
+      </w:r>
+    </w:p>
+    <w:p>
+      <w:pPr>
+        <w:pStyle w:val="ListParagraph"/>
+        <w:numPr>
+          <w:ilvl w:val="0"/>
+          <w:numId w:val="8"/>
+        </w:numPr>
+        <w:spacing w:after="60"/>
+      </w:pPr>
+      <w:r>
+        <w:rPr>
+          <w:rFonts w:ascii="Calibri" w:cs="Calibri" w:eastAsia="Microsoft YaHei" w:hAnsi="Calibri"/>
+        </w:rPr>
+        <w:t xml:space="preserve">2,548 条全部由彭飞</w:t>
+      </w:r>
+      <w:r>
+        <w:rPr>
+          <w:rFonts w:ascii="Calibri" w:cs="Calibri" w:eastAsia="Microsoft YaHei" w:hAnsi="Calibri"/>
+          <w:b/>
+          <w:bCs/>
+        </w:rPr>
+        <w:t xml:space="preserve">自己读标题和摘要</w:t>
+      </w:r>
+      <w:r>
+        <w:rPr>
+          <w:rFonts w:ascii="Calibri" w:cs="Calibri" w:eastAsia="Microsoft YaHei" w:hAnsi="Calibri"/>
+        </w:rPr>
+        <w:t xml:space="preserve">后决定。不使用任何 AI（第 3 节），也不让别人或别的程序代为点击。</w:t>
+      </w:r>
+    </w:p>
+    <w:p>
+      <w:pPr>
+        <w:pStyle w:val="ListParagraph"/>
+        <w:numPr>
+          <w:ilvl w:val="0"/>
+          <w:numId w:val="8"/>
+        </w:numPr>
+        <w:spacing w:after="60"/>
+      </w:pPr>
+      <w:r>
+        <w:rPr>
+          <w:rFonts w:ascii="Calibri" w:cs="Calibri" w:eastAsia="Microsoft YaHei" w:hAnsi="Calibri"/>
+          <w:b/>
+          <w:bCs/>
+        </w:rPr>
+        <w:t xml:space="preserve">不批量操作</w:t>
+      </w:r>
+      <w:r>
+        <w:rPr>
+          <w:rFonts w:ascii="Calibri" w:cs="Calibri" w:eastAsia="Microsoft YaHei" w:hAnsi="Calibri"/>
+        </w:rPr>
+        <w:t xml:space="preserve">：不全选，不多选后一次性 Exclude 或打标签；每条记录单独决定。</w:t>
+      </w:r>
+    </w:p>
+    <w:p>
+      <w:pPr>
+        <w:pStyle w:val="ListParagraph"/>
+        <w:numPr>
+          <w:ilvl w:val="0"/>
+          <w:numId w:val="8"/>
+        </w:numPr>
+        <w:spacing w:after="60"/>
+      </w:pPr>
+      <w:r>
+        <w:rPr>
+          <w:rFonts w:ascii="Calibri" w:cs="Calibri" w:eastAsia="Microsoft YaHei" w:hAnsi="Calibri"/>
+        </w:rPr>
+        <w:t xml:space="preserve">每个 Exclude 都选 E1–E6 里适用的一条；说不出是哪一条就选 Maybe。</w:t>
+      </w:r>
+      <w:r>
+        <w:rPr>
+          <w:rFonts w:ascii="Calibri" w:cs="Calibri" w:eastAsia="Microsoft YaHei" w:hAnsi="Calibri"/>
+          <w:b/>
+          <w:bCs/>
+        </w:rPr>
+        <w:t xml:space="preserve">不用 Rayyan 自带的默认理由。</w:t>
+      </w:r>
+      <w:r>
+        <w:rPr>
+          <w:rFonts w:ascii="Calibri" w:cs="Calibri" w:eastAsia="Microsoft YaHei" w:hAnsi="Calibri"/>
+        </w:rPr>
+        <w:t xml:space="preserve"> 重筛项目里这些理由还不存在，遇到确实适用的记录时再建，名称一字不差（第 3、5 节）。</w:t>
+      </w:r>
+    </w:p>
+    <w:p>
+      <w:pPr>
+        <w:pStyle w:val="ListParagraph"/>
+        <w:numPr>
+          <w:ilvl w:val="0"/>
+          <w:numId w:val="8"/>
+        </w:numPr>
+        <w:spacing w:after="60"/>
+      </w:pPr>
+      <w:r>
+        <w:rPr>
+          <w:rFonts w:ascii="Calibri" w:cs="Calibri" w:eastAsia="Microsoft YaHei" w:hAnsi="Calibri"/>
+        </w:rPr>
+        <w:t xml:space="preserve">标签只用 </w:t>
+      </w:r>
+      <w:r>
+        <w:rPr>
+          <w:rFonts w:ascii="Consolas" w:cs="Consolas" w:eastAsia="Microsoft YaHei" w:hAnsi="Consolas"/>
+          <w:sz w:val="19"/>
+          <w:szCs w:val="19"/>
+          <w:shd w:fill="EEEEEE" w:val="clear"/>
+        </w:rPr>
+        <w:t xml:space="preserve">review-for-refs</w:t>
+      </w:r>
+      <w:r>
+        <w:rPr>
+          <w:rFonts w:ascii="Calibri" w:cs="Calibri" w:eastAsia="Microsoft YaHei" w:hAnsi="Calibri"/>
+        </w:rPr>
+        <w:t xml:space="preserve"> 和 </w:t>
+      </w:r>
+      <w:r>
+        <w:rPr>
+          <w:rFonts w:ascii="Consolas" w:cs="Consolas" w:eastAsia="Microsoft YaHei" w:hAnsi="Consolas"/>
+          <w:sz w:val="19"/>
+          <w:szCs w:val="19"/>
+          <w:shd w:fill="EEEEEE" w:val="clear"/>
+        </w:rPr>
+        <w:t xml:space="preserve">lang-other</w:t>
+      </w:r>
+      <w:r>
+        <w:rPr>
+          <w:rFonts w:ascii="Calibri" w:cs="Calibri" w:eastAsia="Microsoft YaHei" w:hAnsi="Calibri"/>
+        </w:rPr>
+        <w:t xml:space="preserve">，不自己新建别的标签。</w:t>
+      </w:r>
+    </w:p>
+    <w:p>
+      <w:pPr>
+        <w:pStyle w:val="ListParagraph"/>
+        <w:numPr>
+          <w:ilvl w:val="0"/>
+          <w:numId w:val="8"/>
+        </w:numPr>
+        <w:spacing w:after="60"/>
+      </w:pPr>
+      <w:r>
+        <w:rPr>
+          <w:rFonts w:ascii="Calibri" w:cs="Calibri" w:eastAsia="Microsoft YaHei" w:hAnsi="Calibri"/>
+        </w:rPr>
+        <w:t xml:space="preserve">判断规则就是第 4 节，没有改动。</w:t>
+      </w:r>
+    </w:p>
+    <w:p>
+      <w:pPr>
+        <w:pStyle w:val="ListParagraph"/>
+        <w:numPr>
+          <w:ilvl w:val="0"/>
+          <w:numId w:val="8"/>
+        </w:numPr>
+        <w:spacing w:after="60"/>
+      </w:pPr>
+      <w:r>
+        <w:rPr>
+          <w:rFonts w:ascii="Calibri" w:cs="Calibri" w:eastAsia="Microsoft YaHei" w:hAnsi="Calibri"/>
+        </w:rPr>
+        <w:t xml:space="preserve">每次开始之前确认三件事：Blind Mode 是 ON；作者和期刊处于隐藏状态；浏览器翻译已关闭。筛选时只用 Screening 标签。</w:t>
+      </w:r>
+    </w:p>
+    <w:p>
+      <w:pPr>
+        <w:pStyle w:val="ListParagraph"/>
+        <w:numPr>
+          <w:ilvl w:val="0"/>
+          <w:numId w:val="8"/>
+        </w:numPr>
+        <w:spacing w:after="60"/>
+      </w:pPr>
+      <w:r>
+        <w:rPr>
+          <w:rFonts w:ascii="Calibri" w:cs="Calibri" w:eastAsia="Microsoft YaHei" w:hAnsi="Calibri"/>
+          <w:b/>
+          <w:bCs/>
+        </w:rPr>
+        <w:t xml:space="preserve">记时间日志</w:t>
+      </w:r>
+      <w:r>
+        <w:rPr>
+          <w:rFonts w:ascii="Calibri" w:cs="Calibri" w:eastAsia="Microsoft YaHei" w:hAnsi="Calibri"/>
+        </w:rPr>
+        <w:t xml:space="preserve">：每次开始和结束的日期时间，以及这一次筛了第几条到第几条（下表）。</w:t>
+      </w:r>
+    </w:p>
+    <w:p>
+      <w:pPr>
+        <w:pStyle w:val="ListParagraph"/>
+        <w:numPr>
+          <w:ilvl w:val="0"/>
+          <w:numId w:val="8"/>
+        </w:numPr>
+        <w:spacing w:after="60"/>
+      </w:pPr>
+      <w:r>
+        <w:rPr>
+          <w:rFonts w:ascii="Calibri" w:cs="Calibri" w:eastAsia="Microsoft YaHei" w:hAnsi="Calibri"/>
+        </w:rPr>
+        <w:t xml:space="preserve">筛完</w:t>
+      </w:r>
+      <w:r>
+        <w:rPr>
+          <w:rFonts w:ascii="Calibri" w:cs="Calibri" w:eastAsia="Microsoft YaHei" w:hAnsi="Calibri"/>
+          <w:b/>
+          <w:bCs/>
+        </w:rPr>
+        <w:t xml:space="preserve">前 100 条</w:t>
+      </w:r>
+      <w:r>
+        <w:rPr>
+          <w:rFonts w:ascii="Calibri" w:cs="Calibri" w:eastAsia="Microsoft YaHei" w:hAnsi="Calibri"/>
+        </w:rPr>
+        <w:t xml:space="preserve">先停下，通知舒俊导出（第 3 节的方法）。Claude 检查速度、批量操作和标签使用情况，没有问题再继续。这只是过程检查：不看和舒俊的逐条一致性，也不会把逐条一致性反馈给彭飞。</w:t>
+      </w:r>
+    </w:p>
+    <w:p>
+      <w:pPr>
+        <w:pStyle w:val="ListParagraph"/>
+        <w:numPr>
+          <w:ilvl w:val="0"/>
+          <w:numId w:val="8"/>
+        </w:numPr>
+        <w:spacing w:after="60"/>
+      </w:pPr>
+      <w:r>
+        <w:rPr>
+          <w:rFonts w:ascii="Calibri" w:cs="Calibri" w:eastAsia="Microsoft YaHei" w:hAnsi="Calibri"/>
+        </w:rPr>
+        <w:t xml:space="preserve">全部筛完之前，</w:t>
+      </w:r>
+      <w:r>
+        <w:rPr>
+          <w:rFonts w:ascii="Calibri" w:cs="Calibri" w:eastAsia="Microsoft YaHei" w:hAnsi="Calibri"/>
+          <w:b/>
+          <w:bCs/>
+        </w:rPr>
+        <w:t xml:space="preserve">不要和舒俊讨论具体记录的决定，也不要去看舒俊的决定。</w:t>
+      </w:r>
+    </w:p>
+    <w:tbl>
+      <w:tblPr>
+        <w:tblW w:type="dxa" w:w="9026"/>
+        <w:tblBorders>
+          <w:top w:val="single" w:color="auto" w:sz="4"/>
+          <w:left w:val="single" w:color="auto" w:sz="4"/>
+          <w:bottom w:val="single" w:color="auto" w:sz="4"/>
+          <w:right w:val="single" w:color="auto" w:sz="4"/>
+          <w:insideH w:val="single" w:color="auto" w:sz="4"/>
+          <w:insideV w:val="single" w:color="auto" w:sz="4"/>
+        </w:tblBorders>
+      </w:tblPr>
+      <w:tblGrid>
+        <w:gridCol w:w="1504"/>
+        <w:gridCol w:w="1504"/>
+        <w:gridCol w:w="1504"/>
+        <w:gridCol w:w="1504"/>
+        <w:gridCol w:w="1504"/>
+        <w:gridCol w:w="1506"/>
+      </w:tblGrid>
+      <w:tr>
+        <w:trPr>
+          <w:cantSplit/>
+          <w:tblHeader/>
+        </w:trPr>
+        <w:tc>
+          <w:tcPr>
+            <w:tcW w:type="dxa" w:w="1504"/>
+            <w:tcBorders>
+              <w:top w:val="single" w:color="BBBBBB" w:sz="4"/>
+              <w:left w:val="single" w:color="BBBBBB" w:sz="4"/>
+              <w:bottom w:val="single" w:color="BBBBBB" w:sz="4"/>
+              <w:right w:val="single" w:color="BBBBBB" w:sz="4"/>
+            </w:tcBorders>
+            <w:shd w:fill="E8EEF4" w:val="clear"/>
+            <w:tcMar>
+              <w:top w:type="dxa" w:w="60"/>
+              <w:left w:type="dxa" w:w="100"/>
+              <w:bottom w:type="dxa" w:w="60"/>
+              <w:right w:type="dxa" w:w="100"/>
+            </w:tcMar>
+          </w:tcPr>
+          <w:p>
+            <w:r>
+              <w:rPr>
+                <w:rFonts w:ascii="Calibri" w:cs="Calibri" w:eastAsia="Microsoft YaHei" w:hAnsi="Calibri"/>
+                <w:b/>
+                <w:bCs/>
+                <w:sz w:val="20"/>
+                <w:szCs w:val="20"/>
+              </w:rPr>
+              <w:t xml:space="preserve">日期</w:t>
+            </w:r>
+          </w:p>
+        </w:tc>
+        <w:tc>
+          <w:tcPr>
+            <w:tcW w:type="dxa" w:w="1504"/>
+            <w:tcBorders>
+              <w:top w:val="single" w:color="BBBBBB" w:sz="4"/>
+              <w:left w:val="single" w:color="BBBBBB" w:sz="4"/>
+              <w:bottom w:val="single" w:color="BBBBBB" w:sz="4"/>
+              <w:right w:val="single" w:color="BBBBBB" w:sz="4"/>
+            </w:tcBorders>
+            <w:shd w:fill="E8EEF4" w:val="clear"/>
+            <w:tcMar>
+              <w:top w:type="dxa" w:w="60"/>
+              <w:left w:type="dxa" w:w="100"/>
+              <w:bottom w:type="dxa" w:w="60"/>
+              <w:right w:type="dxa" w:w="100"/>
+            </w:tcMar>
+          </w:tcPr>
+          <w:p>
+            <w:r>
+              <w:rPr>
+                <w:rFonts w:ascii="Calibri" w:cs="Calibri" w:eastAsia="Microsoft YaHei" w:hAnsi="Calibri"/>
+                <w:b/>
+                <w:bCs/>
+                <w:sz w:val="20"/>
+                <w:szCs w:val="20"/>
+              </w:rPr>
+              <w:t xml:space="preserve">开始时间</w:t>
+            </w:r>
+          </w:p>
+        </w:tc>
+        <w:tc>
+          <w:tcPr>
+            <w:tcW w:type="dxa" w:w="1504"/>
+            <w:tcBorders>
+              <w:top w:val="single" w:color="BBBBBB" w:sz="4"/>
+              <w:left w:val="single" w:color="BBBBBB" w:sz="4"/>
+              <w:bottom w:val="single" w:color="BBBBBB" w:sz="4"/>
+              <w:right w:val="single" w:color="BBBBBB" w:sz="4"/>
+            </w:tcBorders>
+            <w:shd w:fill="E8EEF4" w:val="clear"/>
+            <w:tcMar>
+              <w:top w:type="dxa" w:w="60"/>
+              <w:left w:type="dxa" w:w="100"/>
+              <w:bottom w:type="dxa" w:w="60"/>
+              <w:right w:type="dxa" w:w="100"/>
+            </w:tcMar>
+          </w:tcPr>
+          <w:p>
+            <w:r>
+              <w:rPr>
+                <w:rFonts w:ascii="Calibri" w:cs="Calibri" w:eastAsia="Microsoft YaHei" w:hAnsi="Calibri"/>
+                <w:b/>
+                <w:bCs/>
+                <w:sz w:val="20"/>
+                <w:szCs w:val="20"/>
+              </w:rPr>
+              <w:t xml:space="preserve">结束时间</w:t>
+            </w:r>
+          </w:p>
+        </w:tc>
+        <w:tc>
+          <w:tcPr>
+            <w:tcW w:type="dxa" w:w="1504"/>
+            <w:tcBorders>
+              <w:top w:val="single" w:color="BBBBBB" w:sz="4"/>
+              <w:left w:val="single" w:color="BBBBBB" w:sz="4"/>
+              <w:bottom w:val="single" w:color="BBBBBB" w:sz="4"/>
+              <w:right w:val="single" w:color="BBBBBB" w:sz="4"/>
+            </w:tcBorders>
+            <w:shd w:fill="E8EEF4" w:val="clear"/>
+            <w:tcMar>
+              <w:top w:type="dxa" w:w="60"/>
+              <w:left w:type="dxa" w:w="100"/>
+              <w:bottom w:type="dxa" w:w="60"/>
+              <w:right w:type="dxa" w:w="100"/>
+            </w:tcMar>
+          </w:tcPr>
+          <w:p>
+            <w:r>
+              <w:rPr>
+                <w:rFonts w:ascii="Calibri" w:cs="Calibri" w:eastAsia="Microsoft YaHei" w:hAnsi="Calibri"/>
+                <w:b/>
+                <w:bCs/>
+                <w:sz w:val="20"/>
+                <w:szCs w:val="20"/>
+              </w:rPr>
+              <w:t xml:space="preserve">从第几条</w:t>
+            </w:r>
+          </w:p>
+        </w:tc>
+        <w:tc>
+          <w:tcPr>
+            <w:tcW w:type="dxa" w:w="1504"/>
+            <w:tcBorders>
+              <w:top w:val="single" w:color="BBBBBB" w:sz="4"/>
+              <w:left w:val="single" w:color="BBBBBB" w:sz="4"/>
+              <w:bottom w:val="single" w:color="BBBBBB" w:sz="4"/>
+              <w:right w:val="single" w:color="BBBBBB" w:sz="4"/>
+            </w:tcBorders>
+            <w:shd w:fill="E8EEF4" w:val="clear"/>
+            <w:tcMar>
+              <w:top w:type="dxa" w:w="60"/>
+              <w:left w:type="dxa" w:w="100"/>
+              <w:bottom w:type="dxa" w:w="60"/>
+              <w:right w:type="dxa" w:w="100"/>
+            </w:tcMar>
+          </w:tcPr>
+          <w:p>
+            <w:r>
+              <w:rPr>
+                <w:rFonts w:ascii="Calibri" w:cs="Calibri" w:eastAsia="Microsoft YaHei" w:hAnsi="Calibri"/>
+                <w:b/>
+                <w:bCs/>
+                <w:sz w:val="20"/>
+                <w:szCs w:val="20"/>
+              </w:rPr>
+              <w:t xml:space="preserve">到第几条</w:t>
+            </w:r>
+          </w:p>
+        </w:tc>
+        <w:tc>
+          <w:tcPr>
+            <w:tcW w:type="dxa" w:w="1506"/>
+            <w:tcBorders>
+              <w:top w:val="single" w:color="BBBBBB" w:sz="4"/>
+              <w:left w:val="single" w:color="BBBBBB" w:sz="4"/>
+              <w:bottom w:val="single" w:color="BBBBBB" w:sz="4"/>
+              <w:right w:val="single" w:color="BBBBBB" w:sz="4"/>
+            </w:tcBorders>
+            <w:shd w:fill="E8EEF4" w:val="clear"/>
+            <w:tcMar>
+              <w:top w:type="dxa" w:w="60"/>
+              <w:left w:type="dxa" w:w="100"/>
+              <w:bottom w:type="dxa" w:w="60"/>
+              <w:right w:type="dxa" w:w="100"/>
+            </w:tcMar>
+          </w:tcPr>
+          <w:p>
+            <w:r>
+              <w:rPr>
+                <w:rFonts w:ascii="Calibri" w:cs="Calibri" w:eastAsia="Microsoft YaHei" w:hAnsi="Calibri"/>
+                <w:b/>
+                <w:bCs/>
+                <w:sz w:val="20"/>
+                <w:szCs w:val="20"/>
+              </w:rPr>
+              <w:t xml:space="preserve">备注</w:t>
+            </w:r>
+          </w:p>
+        </w:tc>
+      </w:tr>
+      <w:tr>
+        <w:trPr>
+          <w:cantSplit/>
+          <w:tblHeader w:val="false"/>
+        </w:trPr>
+        <w:tc>
+          <w:tcPr>
+            <w:tcW w:type="dxa" w:w="1504"/>
+            <w:tcBorders>
+              <w:top w:val="single" w:color="BBBBBB" w:sz="4"/>
+              <w:left w:val="single" w:color="BBBBBB" w:sz="4"/>
+              <w:bottom w:val="single" w:color="BBBBBB" w:sz="4"/>
+              <w:right w:val="single" w:color="BBBBBB" w:sz="4"/>
+            </w:tcBorders>
+            <w:tcMar>
+              <w:top w:type="dxa" w:w="60"/>
+              <w:left w:type="dxa" w:w="100"/>
+              <w:bottom w:type="dxa" w:w="60"/>
+              <w:right w:type="dxa" w:w="100"/>
+            </w:tcMar>
+          </w:tcPr>
+          <w:p/>
+        </w:tc>
+        <w:tc>
+          <w:tcPr>
+            <w:tcW w:type="dxa" w:w="1504"/>
+            <w:tcBorders>
+              <w:top w:val="single" w:color="BBBBBB" w:sz="4"/>
+              <w:left w:val="single" w:color="BBBBBB" w:sz="4"/>
+              <w:bottom w:val="single" w:color="BBBBBB" w:sz="4"/>
+              <w:right w:val="single" w:color="BBBBBB" w:sz="4"/>
+            </w:tcBorders>
+            <w:tcMar>
+              <w:top w:type="dxa" w:w="60"/>
+              <w:left w:type="dxa" w:w="100"/>
+              <w:bottom w:type="dxa" w:w="60"/>
+              <w:right w:type="dxa" w:w="100"/>
+            </w:tcMar>
+          </w:tcPr>
+          <w:p/>
+        </w:tc>
+        <w:tc>
+          <w:tcPr>
+            <w:tcW w:type="dxa" w:w="1504"/>
+            <w:tcBorders>
+              <w:top w:val="single" w:color="BBBBBB" w:sz="4"/>
+              <w:left w:val="single" w:color="BBBBBB" w:sz="4"/>
+              <w:bottom w:val="single" w:color="BBBBBB" w:sz="4"/>
+              <w:right w:val="single" w:color="BBBBBB" w:sz="4"/>
+            </w:tcBorders>
+            <w:tcMar>
+              <w:top w:type="dxa" w:w="60"/>
+              <w:left w:type="dxa" w:w="100"/>
+              <w:bottom w:type="dxa" w:w="60"/>
+              <w:right w:type="dxa" w:w="100"/>
+            </w:tcMar>
+          </w:tcPr>
+          <w:p/>
+        </w:tc>
+        <w:tc>
+          <w:tcPr>
+            <w:tcW w:type="dxa" w:w="1504"/>
+            <w:tcBorders>
+              <w:top w:val="single" w:color="BBBBBB" w:sz="4"/>
+              <w:left w:val="single" w:color="BBBBBB" w:sz="4"/>
+              <w:bottom w:val="single" w:color="BBBBBB" w:sz="4"/>
+              <w:right w:val="single" w:color="BBBBBB" w:sz="4"/>
+            </w:tcBorders>
+            <w:tcMar>
+              <w:top w:type="dxa" w:w="60"/>
+              <w:left w:type="dxa" w:w="100"/>
+              <w:bottom w:type="dxa" w:w="60"/>
+              <w:right w:type="dxa" w:w="100"/>
+            </w:tcMar>
+          </w:tcPr>
+          <w:p/>
+        </w:tc>
+        <w:tc>
+          <w:tcPr>
+            <w:tcW w:type="dxa" w:w="1504"/>
+            <w:tcBorders>
+              <w:top w:val="single" w:color="BBBBBB" w:sz="4"/>
+              <w:left w:val="single" w:color="BBBBBB" w:sz="4"/>
+              <w:bottom w:val="single" w:color="BBBBBB" w:sz="4"/>
+              <w:right w:val="single" w:color="BBBBBB" w:sz="4"/>
+            </w:tcBorders>
+            <w:tcMar>
+              <w:top w:type="dxa" w:w="60"/>
+              <w:left w:type="dxa" w:w="100"/>
+              <w:bottom w:type="dxa" w:w="60"/>
+              <w:right w:type="dxa" w:w="100"/>
+            </w:tcMar>
+          </w:tcPr>
+          <w:p/>
+        </w:tc>
+        <w:tc>
+          <w:tcPr>
+            <w:tcW w:type="dxa" w:w="1506"/>
+            <w:tcBorders>
+              <w:top w:val="single" w:color="BBBBBB" w:sz="4"/>
+              <w:left w:val="single" w:color="BBBBBB" w:sz="4"/>
+              <w:bottom w:val="single" w:color="BBBBBB" w:sz="4"/>
+              <w:right w:val="single" w:color="BBBBBB" w:sz="4"/>
+            </w:tcBorders>
+            <w:tcMar>
+              <w:top w:type="dxa" w:w="60"/>
+              <w:left w:type="dxa" w:w="100"/>
+              <w:bottom w:type="dxa" w:w="60"/>
+              <w:right w:type="dxa" w:w="100"/>
+            </w:tcMar>
+          </w:tcPr>
+          <w:p/>
+        </w:tc>
+      </w:tr>
+      <w:tr>
+        <w:trPr>
+          <w:cantSplit/>
+          <w:tblHeader w:val="false"/>
+        </w:trPr>
+        <w:tc>
+          <w:tcPr>
+            <w:tcW w:type="dxa" w:w="1504"/>
+            <w:tcBorders>
+              <w:top w:val="single" w:color="BBBBBB" w:sz="4"/>
+              <w:left w:val="single" w:color="BBBBBB" w:sz="4"/>
+              <w:bottom w:val="single" w:color="BBBBBB" w:sz="4"/>
+              <w:right w:val="single" w:color="BBBBBB" w:sz="4"/>
+            </w:tcBorders>
+            <w:tcMar>
+              <w:top w:type="dxa" w:w="60"/>
+              <w:left w:type="dxa" w:w="100"/>
+              <w:bottom w:type="dxa" w:w="60"/>
+              <w:right w:type="dxa" w:w="100"/>
+            </w:tcMar>
+          </w:tcPr>
+          <w:p/>
+        </w:tc>
+        <w:tc>
+          <w:tcPr>
+            <w:tcW w:type="dxa" w:w="1504"/>
+            <w:tcBorders>
+              <w:top w:val="single" w:color="BBBBBB" w:sz="4"/>
+              <w:left w:val="single" w:color="BBBBBB" w:sz="4"/>
+              <w:bottom w:val="single" w:color="BBBBBB" w:sz="4"/>
+              <w:right w:val="single" w:color="BBBBBB" w:sz="4"/>
+            </w:tcBorders>
+            <w:tcMar>
+              <w:top w:type="dxa" w:w="60"/>
+              <w:left w:type="dxa" w:w="100"/>
+              <w:bottom w:type="dxa" w:w="60"/>
+              <w:right w:type="dxa" w:w="100"/>
+            </w:tcMar>
+          </w:tcPr>
+          <w:p/>
+        </w:tc>
+        <w:tc>
+          <w:tcPr>
+            <w:tcW w:type="dxa" w:w="1504"/>
+            <w:tcBorders>
+              <w:top w:val="single" w:color="BBBBBB" w:sz="4"/>
+              <w:left w:val="single" w:color="BBBBBB" w:sz="4"/>
+              <w:bottom w:val="single" w:color="BBBBBB" w:sz="4"/>
+              <w:right w:val="single" w:color="BBBBBB" w:sz="4"/>
+            </w:tcBorders>
+            <w:tcMar>
+              <w:top w:type="dxa" w:w="60"/>
+              <w:left w:type="dxa" w:w="100"/>
+              <w:bottom w:type="dxa" w:w="60"/>
+              <w:right w:type="dxa" w:w="100"/>
+            </w:tcMar>
+          </w:tcPr>
+          <w:p/>
+        </w:tc>
+        <w:tc>
+          <w:tcPr>
+            <w:tcW w:type="dxa" w:w="1504"/>
+            <w:tcBorders>
+              <w:top w:val="single" w:color="BBBBBB" w:sz="4"/>
+              <w:left w:val="single" w:color="BBBBBB" w:sz="4"/>
+              <w:bottom w:val="single" w:color="BBBBBB" w:sz="4"/>
+              <w:right w:val="single" w:color="BBBBBB" w:sz="4"/>
+            </w:tcBorders>
+            <w:tcMar>
+              <w:top w:type="dxa" w:w="60"/>
+              <w:left w:type="dxa" w:w="100"/>
+              <w:bottom w:type="dxa" w:w="60"/>
+              <w:right w:type="dxa" w:w="100"/>
+            </w:tcMar>
+          </w:tcPr>
+          <w:p/>
+        </w:tc>
+        <w:tc>
+          <w:tcPr>
+            <w:tcW w:type="dxa" w:w="1504"/>
+            <w:tcBorders>
+              <w:top w:val="single" w:color="BBBBBB" w:sz="4"/>
+              <w:left w:val="single" w:color="BBBBBB" w:sz="4"/>
+              <w:bottom w:val="single" w:color="BBBBBB" w:sz="4"/>
+              <w:right w:val="single" w:color="BBBBBB" w:sz="4"/>
+            </w:tcBorders>
+            <w:tcMar>
+              <w:top w:type="dxa" w:w="60"/>
+              <w:left w:type="dxa" w:w="100"/>
+              <w:bottom w:type="dxa" w:w="60"/>
+              <w:right w:type="dxa" w:w="100"/>
+            </w:tcMar>
+          </w:tcPr>
+          <w:p/>
+        </w:tc>
+        <w:tc>
+          <w:tcPr>
+            <w:tcW w:type="dxa" w:w="1506"/>
+            <w:tcBorders>
+              <w:top w:val="single" w:color="BBBBBB" w:sz="4"/>
+              <w:left w:val="single" w:color="BBBBBB" w:sz="4"/>
+              <w:bottom w:val="single" w:color="BBBBBB" w:sz="4"/>
+              <w:right w:val="single" w:color="BBBBBB" w:sz="4"/>
+            </w:tcBorders>
+            <w:tcMar>
+              <w:top w:type="dxa" w:w="60"/>
+              <w:left w:type="dxa" w:w="100"/>
+              <w:bottom w:type="dxa" w:w="60"/>
+              <w:right w:type="dxa" w:w="100"/>
+            </w:tcMar>
+          </w:tcPr>
+          <w:p/>
+        </w:tc>
+      </w:tr>
+      <w:tr>
+        <w:trPr>
+          <w:cantSplit/>
+          <w:tblHeader w:val="false"/>
+        </w:trPr>
+        <w:tc>
+          <w:tcPr>
+            <w:tcW w:type="dxa" w:w="1504"/>
+            <w:tcBorders>
+              <w:top w:val="single" w:color="BBBBBB" w:sz="4"/>
+              <w:left w:val="single" w:color="BBBBBB" w:sz="4"/>
+              <w:bottom w:val="single" w:color="BBBBBB" w:sz="4"/>
+              <w:right w:val="single" w:color="BBBBBB" w:sz="4"/>
+            </w:tcBorders>
+            <w:tcMar>
+              <w:top w:type="dxa" w:w="60"/>
+              <w:left w:type="dxa" w:w="100"/>
+              <w:bottom w:type="dxa" w:w="60"/>
+              <w:right w:type="dxa" w:w="100"/>
+            </w:tcMar>
+          </w:tcPr>
+          <w:p/>
+        </w:tc>
+        <w:tc>
+          <w:tcPr>
+            <w:tcW w:type="dxa" w:w="1504"/>
+            <w:tcBorders>
+              <w:top w:val="single" w:color="BBBBBB" w:sz="4"/>
+              <w:left w:val="single" w:color="BBBBBB" w:sz="4"/>
+              <w:bottom w:val="single" w:color="BBBBBB" w:sz="4"/>
+              <w:right w:val="single" w:color="BBBBBB" w:sz="4"/>
+            </w:tcBorders>
+            <w:tcMar>
+              <w:top w:type="dxa" w:w="60"/>
+              <w:left w:type="dxa" w:w="100"/>
+              <w:bottom w:type="dxa" w:w="60"/>
+              <w:right w:type="dxa" w:w="100"/>
+            </w:tcMar>
+          </w:tcPr>
+          <w:p/>
+        </w:tc>
+        <w:tc>
+          <w:tcPr>
+            <w:tcW w:type="dxa" w:w="1504"/>
+            <w:tcBorders>
+              <w:top w:val="single" w:color="BBBBBB" w:sz="4"/>
+              <w:left w:val="single" w:color="BBBBBB" w:sz="4"/>
+              <w:bottom w:val="single" w:color="BBBBBB" w:sz="4"/>
+              <w:right w:val="single" w:color="BBBBBB" w:sz="4"/>
+            </w:tcBorders>
+            <w:tcMar>
+              <w:top w:type="dxa" w:w="60"/>
+              <w:left w:type="dxa" w:w="100"/>
+              <w:bottom w:type="dxa" w:w="60"/>
+              <w:right w:type="dxa" w:w="100"/>
+            </w:tcMar>
+          </w:tcPr>
+          <w:p/>
+        </w:tc>
+        <w:tc>
+          <w:tcPr>
+            <w:tcW w:type="dxa" w:w="1504"/>
+            <w:tcBorders>
+              <w:top w:val="single" w:color="BBBBBB" w:sz="4"/>
+              <w:left w:val="single" w:color="BBBBBB" w:sz="4"/>
+              <w:bottom w:val="single" w:color="BBBBBB" w:sz="4"/>
+              <w:right w:val="single" w:color="BBBBBB" w:sz="4"/>
+            </w:tcBorders>
+            <w:tcMar>
+              <w:top w:type="dxa" w:w="60"/>
+              <w:left w:type="dxa" w:w="100"/>
+              <w:bottom w:type="dxa" w:w="60"/>
+              <w:right w:type="dxa" w:w="100"/>
+            </w:tcMar>
+          </w:tcPr>
+          <w:p/>
+        </w:tc>
+        <w:tc>
+          <w:tcPr>
+            <w:tcW w:type="dxa" w:w="1504"/>
+            <w:tcBorders>
+              <w:top w:val="single" w:color="BBBBBB" w:sz="4"/>
+              <w:left w:val="single" w:color="BBBBBB" w:sz="4"/>
+              <w:bottom w:val="single" w:color="BBBBBB" w:sz="4"/>
+              <w:right w:val="single" w:color="BBBBBB" w:sz="4"/>
+            </w:tcBorders>
+            <w:tcMar>
+              <w:top w:type="dxa" w:w="60"/>
+              <w:left w:type="dxa" w:w="100"/>
+              <w:bottom w:type="dxa" w:w="60"/>
+              <w:right w:type="dxa" w:w="100"/>
+            </w:tcMar>
+          </w:tcPr>
+          <w:p/>
+        </w:tc>
+        <w:tc>
+          <w:tcPr>
+            <w:tcW w:type="dxa" w:w="1506"/>
+            <w:tcBorders>
+              <w:top w:val="single" w:color="BBBBBB" w:sz="4"/>
+              <w:left w:val="single" w:color="BBBBBB" w:sz="4"/>
+              <w:bottom w:val="single" w:color="BBBBBB" w:sz="4"/>
+              <w:right w:val="single" w:color="BBBBBB" w:sz="4"/>
+            </w:tcBorders>
+            <w:tcMar>
+              <w:top w:type="dxa" w:w="60"/>
+              <w:left w:type="dxa" w:w="100"/>
+              <w:bottom w:type="dxa" w:w="60"/>
+              <w:right w:type="dxa" w:w="100"/>
+            </w:tcMar>
+          </w:tcPr>
+          <w:p/>
+        </w:tc>
+      </w:tr>
+    </w:tbl>
+    <w:p>
+      <w:pPr>
+        <w:spacing w:after="120"/>
+      </w:pPr>
+    </w:p>
+    <w:p>
+      <w:pPr>
+        <w:spacing w:after="120"/>
+      </w:pPr>
+      <w:r>
+        <w:rPr>
+          <w:rFonts w:ascii="Calibri" w:cs="Calibri" w:eastAsia="Microsoft YaHei" w:hAnsi="Calibri"/>
+          <w:b/>
+          <w:bCs/>
+        </w:rPr>
+        <w:t xml:space="preserve">第一轮结果和重筛结果怎么比较（以下规则在任何重筛决定出现之前就已确定）：</w:t>
+      </w:r>
+    </w:p>
+    <w:p>
+      <w:pPr>
+        <w:pStyle w:val="ListParagraph"/>
+        <w:numPr>
+          <w:ilvl w:val="0"/>
+          <w:numId w:val="2"/>
+        </w:numPr>
+        <w:spacing w:after="60"/>
+      </w:pPr>
+      <w:r>
+        <w:rPr>
+          <w:rFonts w:ascii="Calibri" w:cs="Calibri" w:eastAsia="Microsoft YaHei" w:hAnsi="Calibri"/>
+        </w:rPr>
+        <w:t xml:space="preserve">比较舒俊在旧的正式项目里的决定（已锁定，不改）和彭飞在重筛项目里的决定，按 WS 编号对应，由脚本完成（</w:t>
+      </w:r>
+      <w:r>
+        <w:rPr>
+          <w:rFonts w:ascii="Consolas" w:cs="Consolas" w:eastAsia="Microsoft YaHei" w:hAnsi="Consolas"/>
+          <w:sz w:val="19"/>
+          <w:szCs w:val="19"/>
+          <w:shd w:fill="EEEEEE" w:val="clear"/>
+        </w:rPr>
+        <w:t xml:space="preserve">tools/compare_rescreen.py</w:t>
+      </w:r>
+      <w:r>
+        <w:rPr>
+          <w:rFonts w:ascii="Calibri" w:cs="Calibri" w:eastAsia="Microsoft YaHei" w:hAnsi="Calibri"/>
+        </w:rPr>
+        <w:t xml:space="preserve">）。</w:t>
+      </w:r>
+    </w:p>
+    <w:p>
+      <w:pPr>
+        <w:pStyle w:val="ListParagraph"/>
+        <w:numPr>
+          <w:ilvl w:val="0"/>
+          <w:numId w:val="2"/>
+        </w:numPr>
+        <w:spacing w:after="60"/>
+      </w:pPr>
+      <w:r>
+        <w:rPr>
+          <w:rFonts w:ascii="Calibri" w:cs="Calibri" w:eastAsia="Microsoft YaHei" w:hAnsi="Calibri"/>
+        </w:rPr>
+        <w:t xml:space="preserve">舒俊原来没有选任何排除理由的 310 条 Exclude，按第 3 节的规则（Exclude 必须有理由，否则选 Maybe）在比较中当作 Maybe 处理；他原来的记录本身不改，同时并列报告按原记录比较的结果。</w:t>
+      </w:r>
+    </w:p>
+    <w:p>
+      <w:pPr>
+        <w:pStyle w:val="ListParagraph"/>
+        <w:numPr>
+          <w:ilvl w:val="0"/>
+          <w:numId w:val="2"/>
+        </w:numPr>
+        <w:spacing w:after="60"/>
+      </w:pPr>
+      <w:r>
+        <w:rPr>
+          <w:rFonts w:ascii="Calibri" w:cs="Calibri" w:eastAsia="Microsoft YaHei" w:hAnsi="Calibri"/>
+        </w:rPr>
+        <w:t xml:space="preserve">一人 Exclude、另一人 Include 或 Maybe 的分歧，不先讨论，由杨军在</w:t>
+      </w:r>
+      <w:r>
+        <w:rPr>
+          <w:rFonts w:ascii="Calibri" w:cs="Calibri" w:eastAsia="Microsoft YaHei" w:hAnsi="Calibri"/>
+          <w:b/>
+          <w:bCs/>
+        </w:rPr>
+        <w:t xml:space="preserve">不知道两人决定</w:t>
+      </w:r>
+      <w:r>
+        <w:rPr>
+          <w:rFonts w:ascii="Calibri" w:cs="Calibri" w:eastAsia="Microsoft YaHei" w:hAnsi="Calibri"/>
+        </w:rPr>
+        <w:t xml:space="preserve">的情况下盲评。盲评清单还会加入看起来相关但两人都排除的记录，以及一个随机质控样本（设计见 </w:t>
+      </w:r>
+      <w:r>
+        <w:rPr>
+          <w:rFonts w:ascii="Consolas" w:cs="Consolas" w:eastAsia="Microsoft YaHei" w:hAnsi="Consolas"/>
+          <w:sz w:val="19"/>
+          <w:szCs w:val="19"/>
+          <w:shd w:fill="EEEEEE" w:val="clear"/>
+        </w:rPr>
+        <w:t xml:space="preserve">search/screening/formal/blind_adjudication_design.txt</w:t>
+      </w:r>
+      <w:r>
+        <w:rPr>
+          <w:rFonts w:ascii="Calibri" w:cs="Calibri" w:eastAsia="Microsoft YaHei" w:hAnsi="Calibri"/>
+        </w:rPr>
+        <w:t xml:space="preserve">；重筛完成后按新的比较结果重新生成）。</w:t>
+      </w:r>
+    </w:p>
+    <w:p>
+      <w:pPr>
+        <w:pStyle w:val="ListParagraph"/>
+        <w:numPr>
+          <w:ilvl w:val="0"/>
+          <w:numId w:val="2"/>
+        </w:numPr>
+        <w:spacing w:after="60"/>
+      </w:pPr>
+      <w:r>
+        <w:rPr>
+          <w:rFonts w:ascii="Calibri" w:cs="Calibri" w:eastAsia="Microsoft YaHei" w:hAnsi="Calibri"/>
+        </w:rPr>
+        <w:t xml:space="preserve">彭飞第一轮借助 AI 做出的决定单独保存，不用于最终名单。过程事实（速度、批量操作、标签、日期）会写进方法部分和 PROSPERO 修订。</w:t>
       </w:r>
     </w:p>
     <w:sectPr>
@@ -6657,7 +7787,7 @@
         <w:sz w:val="17"/>
         <w:szCs w:val="17"/>
       </w:rPr>
-      <w:t xml:space="preserve">筛选指南 v2026-10-10b   |   第 </w:t>
+      <w:t xml:space="preserve">筛选指南 v2026-10-17a   |   第 </w:t>
     </w:r>
     <w:r>
       <w:rPr>
@@ -6886,6 +8016,12 @@
     </w:lvlOverride>
   </w:num>
   <w:num w:numId="7">
+    <w:abstractNumId w:val="3"/>
+    <w:lvlOverride w:ilvl="0">
+      <w:startOverride w:val="1"/>
+    </w:lvlOverride>
+  </w:num>
+  <w:num w:numId="8">
     <w:abstractNumId w:val="3"/>
     <w:lvlOverride w:ilvl="0">
       <w:startOverride w:val="1"/>

</xml_diff>

<commit_message>
Second reviewer Lei Haiyan: guide v2026-10-17b, 50-record calibration sheet and comparison script
Co-Authored-By: Claude Sonnet 5.5 <noreply@anthropic.com>
Claude-Session: https://claude.ai/code/session_01FRD7etKqYN8v2bbXeLMRW
</commit_message>
<xml_diff>
--- a/Screening guide - title and abstract (draft).docx
+++ b/Screening guide - title and abstract (draft).docx
@@ -22,7 +22,7 @@
         <w:rPr>
           <w:rFonts w:ascii="Calibri" w:cs="Calibri" w:eastAsia="Microsoft YaHei" w:hAnsi="Calibri"/>
         </w:rPr>
-        <w:t xml:space="preserve">适用对象：舒俊（筛选员 1）、彭飞（筛选员 2）、杨军（仲裁）。草稿日期：2026 年 10 月 4 日；</w:t>
+        <w:t xml:space="preserve">适用对象：舒俊（筛选员 1）、雷海燕（筛选员 2，自 2026 年 10 月 17 日）、杨军（仲裁）。草稿日期：2026 年 10 月 4 日；</w:t>
       </w:r>
       <w:r>
         <w:rPr>
@@ -59,6 +59,20 @@
           <w:bCs/>
         </w:rPr>
         <w:t xml:space="preserve">2026 年 10 月 17 日（v2026-10-17a）：因为第二位筛选员要在新的 Rayyan 项目里重新独立筛选全部记录，更新了第 3、7 节的状态性说明，新增第 12 节"重筛的规则"；纳入排除标准、4.3 速查表和 E1–E6 理由一字未改（见第 11 节）。</w:t>
+      </w:r>
+      <w:r>
+        <w:rPr>
+          <w:rFonts w:ascii="Calibri" w:cs="Calibri" w:eastAsia="Microsoft YaHei" w:hAnsi="Calibri"/>
+        </w:rPr>
+        <w:t xml:space="preserve"> </w:t>
+      </w:r>
+      <w:r>
+        <w:rPr>
+          <w:rFonts w:ascii="Calibri" w:cs="Calibri" w:eastAsia="Microsoft YaHei" w:hAnsi="Calibri"/>
+          <w:b/>
+          <w:bCs/>
+        </w:rPr>
+        <w:t xml:space="preserve">2026 年 10 月 17 日（v2026-10-17b）：第二位筛选员改为雷海燕，在新的盲法项目里独立筛选；第 12 节改写为适用于她的版本，并加了开始前的校准练习；判断规则一字未改（见第 11 节）。</w:t>
       </w:r>
       <w:r>
         <w:rPr>
@@ -576,7 +590,7 @@
           <w:b/>
           <w:bCs/>
         </w:rPr>
-        <w:t xml:space="preserve">重筛项目（2026 年 10 月 17 日新建，见第 12 节）里还没有任何理由或标签，由彭飞在遇到确实适用的记录时创建。创建理由等于对那条记录做了一次真实的 Exclude 决定，所以要用确实适用的记录来建；名称按下面一字不差地输入，建好以后从列表里选，不要再打一遍。</w:t>
+        <w:t xml:space="preserve">第二位筛选员的新项目（见第 12 节）里还没有任何理由或标签，由雷海燕在遇到确实适用的记录时创建。创建理由等于对那条记录做了一次真实的 Exclude 决定，所以要用确实适用的记录来建；名称按下面一字不差地输入，建好以后从列表里选，不要再打一遍。</w:t>
       </w:r>
     </w:p>
     <w:p>
@@ -833,7 +847,7 @@
           <w:b/>
           <w:bCs/>
         </w:rPr>
-        <w:t xml:space="preserve">Rayyan 的默认高亮关键词已经清理过（旧的正式项目 2026 年 10 月 7 日完成并核对；重筛项目 2026 年 10 月 17 日设置：include 19 个词、exclude 47 个词，由舒俊报告，页面上可见的部分与旧项目一致）。</w:t>
+        <w:t xml:space="preserve">Rayyan 的默认高亮关键词已经清理过（旧的正式项目 2026 年 10 月 7 日完成并核对；雷海燕的新项目由舒俊按下面的词设置，开始前核对）。</w:t>
       </w:r>
       <w:r>
         <w:rPr>
@@ -1132,7 +1146,7 @@
         <w:rPr>
           <w:rFonts w:ascii="Calibri" w:cs="Calibri" w:eastAsia="Microsoft YaHei" w:hAnsi="Calibri"/>
         </w:rPr>
-        <w:t xml:space="preserve">高亮词（旧的正式项目和重筛项目里都已按下面的词设置）：</w:t>
+        <w:t xml:space="preserve">高亮词（旧的正式项目里已按下面的词设置；雷海燕的新项目按同样的词设置）：</w:t>
       </w:r>
     </w:p>
     <w:p>
@@ -4708,7 +4722,7 @@
         <w:rPr>
           <w:rFonts w:ascii="Calibri" w:cs="Calibri" w:eastAsia="Microsoft YaHei" w:hAnsi="Calibri"/>
         </w:rPr>
-        <w:t xml:space="preserve">，主要是：分歧不先由两人讨论，而由杨军在不知道两人决定的情况下盲评；比较的对象是舒俊在旧项目里的决定和彭飞在重筛项目里的决定。</w:t>
+        <w:t xml:space="preserve">，主要是：分歧不先由两人讨论，而由杨军在不知道两人决定的情况下盲评；比较的对象是舒俊在旧项目里的决定和第二位筛选员（雷海燕）在新项目里的决定。</w:t>
       </w:r>
     </w:p>
     <w:p>
@@ -6663,6 +6677,25 @@
           <w:b/>
           <w:bCs/>
         </w:rPr>
+        <w:t xml:space="preserve">2026 年 10 月 17 日再补充（v2026-10-17b；没有改任何纳入排除标准、4.3 速查表、E1–E6 的名称和含义）：</w:t>
+      </w:r>
+      <w:r>
+        <w:rPr>
+          <w:rFonts w:ascii="Calibri" w:cs="Calibri" w:eastAsia="Microsoft YaHei" w:hAnsi="Calibri"/>
+        </w:rPr>
+        <w:t xml:space="preserve"> ① 第二位筛选员改为雷海燕（舒俊决定）；② 第 12 节改写：新的盲法项目；规则里明确不使用宏、脚本、自动点击或浏览器插件；增加开始前的 50 条校准练习；此前第二位筛选员的决定产生方式还在核实，不用于最终名单；③ 适用对象、第 3 节、第 7 节的相应更新。</w:t>
+      </w:r>
+    </w:p>
+    <w:p>
+      <w:pPr>
+        <w:spacing w:after="120"/>
+      </w:pPr>
+      <w:r>
+        <w:rPr>
+          <w:rFonts w:ascii="Calibri" w:cs="Calibri" w:eastAsia="Microsoft YaHei" w:hAnsi="Calibri"/>
+          <w:b/>
+          <w:bCs/>
+        </w:rPr>
         <w:t xml:space="preserve">局限：</w:t>
       </w:r>
       <w:r>
@@ -6681,7 +6714,7 @@
         <w:rPr>
           <w:rFonts w:ascii="Calibri" w:cs="Calibri" w:eastAsia="Microsoft YaHei" w:hAnsi="Calibri"/>
         </w:rPr>
-        <w:t xml:space="preserve">12. 重筛的规则（2026 年 10 月 17 日）</w:t>
+        <w:t xml:space="preserve">12. 第二位筛选员的规则（2026 年 10 月 17 日起）</w:t>
       </w:r>
     </w:p>
     <w:p>
@@ -6700,21 +6733,21 @@
         <w:rPr>
           <w:rFonts w:ascii="Calibri" w:cs="Calibri" w:eastAsia="Microsoft YaHei" w:hAnsi="Calibri"/>
         </w:rPr>
-        <w:t xml:space="preserve"> 第一轮正式筛选里，第二位筛选员（彭飞）账号上的大部分决定是借助 AI 工具（Codex）做出的，不符合本指南第 3 节（舒俊 2026 年 10 月 17 日向 Claude 确认；给 Codex 的具体指令和输入还没有收到）。那批决定单独保存，不用于最终名单。因此彭飞在新项目里</w:t>
-      </w:r>
-      <w:r>
-        <w:rPr>
-          <w:rFonts w:ascii="Calibri" w:cs="Calibri" w:eastAsia="Microsoft YaHei" w:hAnsi="Calibri"/>
-          <w:b/>
-          <w:bCs/>
-        </w:rPr>
-        <w:t xml:space="preserve">重新独立筛选全部 2,548 条</w:t>
-      </w:r>
-      <w:r>
-        <w:rPr>
-          <w:rFonts w:ascii="Calibri" w:cs="Calibri" w:eastAsia="Microsoft YaHei" w:hAnsi="Calibri"/>
-        </w:rPr>
-        <w:t xml:space="preserve">。舒俊的第一轮决定是他自己逐条点击完成的（舒俊确认没有使用 AI），保持原样，不重做，也不修改。</w:t>
+        <w:t xml:space="preserve"> 此前第二位筛选员的决定的产生方式还在核实，暂不用于最终名单，已单独保存。因此由雷海燕作为第二位筛选员，在新的盲法 Rayyan 项目里</w:t>
+      </w:r>
+      <w:r>
+        <w:rPr>
+          <w:rFonts w:ascii="Calibri" w:cs="Calibri" w:eastAsia="Microsoft YaHei" w:hAnsi="Calibri"/>
+          <w:b/>
+          <w:bCs/>
+        </w:rPr>
+        <w:t xml:space="preserve">独立筛选全部 2,548 条</w:t>
+      </w:r>
+      <w:r>
+        <w:rPr>
+          <w:rFonts w:ascii="Calibri" w:cs="Calibri" w:eastAsia="Microsoft YaHei" w:hAnsi="Calibri"/>
+        </w:rPr>
+        <w:t xml:space="preserve">。舒俊的第一轮决定是他自己逐条点击完成的，保持原样，不重做，也不修改。</w:t>
       </w:r>
     </w:p>
     <w:p>
@@ -6733,7 +6766,7 @@
         <w:rPr>
           <w:rFonts w:ascii="Calibri" w:cs="Calibri" w:eastAsia="Microsoft YaHei" w:hAnsi="Calibri"/>
         </w:rPr>
-        <w:t xml:space="preserve"> </w:t>
+        <w:t xml:space="preserve"> 名称建议 </w:t>
       </w:r>
       <w:r>
         <w:rPr>
@@ -6742,13 +6775,13 @@
           <w:szCs w:val="19"/>
           <w:shd w:fill="EEEEEE" w:val="clear"/>
         </w:rPr>
-        <w:t xml:space="preserve">Wandering spleen SR - re-screen 2548 (CRD420261520329)</w:t>
-      </w:r>
-      <w:r>
-        <w:rPr>
-          <w:rFonts w:ascii="Calibri" w:cs="Calibri" w:eastAsia="Microsoft YaHei" w:hAnsi="Calibri"/>
-        </w:rPr>
-        <w:t xml:space="preserve">，2026 年 10 月 17 日由舒俊（所有者）建立，导入的是同一个 </w:t>
+        <w:t xml:space="preserve">Wandering spleen SR - second reviewer 2548 (CRD420261520329)</w:t>
+      </w:r>
+      <w:r>
+        <w:rPr>
+          <w:rFonts w:ascii="Calibri" w:cs="Calibri" w:eastAsia="Microsoft YaHei" w:hAnsi="Calibri"/>
+        </w:rPr>
+        <w:t xml:space="preserve">（建好后以实际名称为准），由舒俊（所有者）用自己的账号建立，导入同一个 </w:t>
       </w:r>
       <w:r>
         <w:rPr>
@@ -6763,7 +6796,7 @@
         <w:rPr>
           <w:rFonts w:ascii="Calibri" w:cs="Calibri" w:eastAsia="Microsoft YaHei" w:hAnsi="Calibri"/>
         </w:rPr>
-        <w:t xml:space="preserve">（2,548 条），Blind Mode 开启，作者和期刊隐藏。舒俊在这个项目里</w:t>
+        <w:t xml:space="preserve">（2,548 条），Blind Mode 开启，作者和期刊隐藏，高亮词按第 3 节设置。舒俊在这个项目里</w:t>
       </w:r>
       <w:r>
         <w:rPr>
@@ -6777,21 +6810,35 @@
         <w:rPr>
           <w:rFonts w:ascii="Calibri" w:cs="Calibri" w:eastAsia="Microsoft YaHei" w:hAnsi="Calibri"/>
         </w:rPr>
-        <w:t xml:space="preserve">，只负责导出。</w:t>
-      </w:r>
-      <w:r>
-        <w:rPr>
-          <w:rFonts w:ascii="Calibri" w:cs="Calibri" w:eastAsia="Microsoft YaHei" w:hAnsi="Calibri"/>
-          <w:b/>
-          <w:bCs/>
-        </w:rPr>
-        <w:t xml:space="preserve">不要打开另外两个旧项目</w:t>
-      </w:r>
-      <w:r>
-        <w:rPr>
-          <w:rFonts w:ascii="Calibri" w:cs="Calibri" w:eastAsia="Microsoft YaHei" w:hAnsi="Calibri"/>
-        </w:rPr>
-        <w:t xml:space="preserve">：旧的正式项目已经揭盲，里面能看到舒俊的决定。</w:t>
+        <w:t xml:space="preserve">，只负责导出。雷海燕用</w:t>
+      </w:r>
+      <w:r>
+        <w:rPr>
+          <w:rFonts w:ascii="Calibri" w:cs="Calibri" w:eastAsia="Microsoft YaHei" w:hAnsi="Calibri"/>
+          <w:b/>
+          <w:bCs/>
+        </w:rPr>
+        <w:t xml:space="preserve">自己的邮箱</w:t>
+      </w:r>
+      <w:r>
+        <w:rPr>
+          <w:rFonts w:ascii="Calibri" w:cs="Calibri" w:eastAsia="Microsoft YaHei" w:hAnsi="Calibri"/>
+        </w:rPr>
+        <w:t xml:space="preserve">注册 Rayyan，以 Reviewer 身份加入。</w:t>
+      </w:r>
+      <w:r>
+        <w:rPr>
+          <w:rFonts w:ascii="Calibri" w:cs="Calibri" w:eastAsia="Microsoft YaHei" w:hAnsi="Calibri"/>
+          <w:b/>
+          <w:bCs/>
+        </w:rPr>
+        <w:t xml:space="preserve">不要打开其他 Rayyan 项目</w:t>
+      </w:r>
+      <w:r>
+        <w:rPr>
+          <w:rFonts w:ascii="Calibri" w:cs="Calibri" w:eastAsia="Microsoft YaHei" w:hAnsi="Calibri"/>
+        </w:rPr>
+        <w:t xml:space="preserve">：别的项目里有其他人的决定。</w:t>
       </w:r>
     </w:p>
     <w:p>
@@ -6804,7 +6851,7 @@
           <w:b/>
           <w:bCs/>
         </w:rPr>
-        <w:t xml:space="preserve">彭飞筛选时的规则：</w:t>
+        <w:t xml:space="preserve">开始前（一次性）：</w:t>
       </w:r>
     </w:p>
     <w:p>
@@ -6820,7 +6867,68 @@
         <w:rPr>
           <w:rFonts w:ascii="Calibri" w:cs="Calibri" w:eastAsia="Microsoft YaHei" w:hAnsi="Calibri"/>
         </w:rPr>
-        <w:t xml:space="preserve">2,548 条全部由彭飞</w:t>
+        <w:t xml:space="preserve">通读本指南第 3、4、5 节和本节。</w:t>
+      </w:r>
+    </w:p>
+    <w:p>
+      <w:pPr>
+        <w:pStyle w:val="ListParagraph"/>
+        <w:numPr>
+          <w:ilvl w:val="0"/>
+          <w:numId w:val="8"/>
+        </w:numPr>
+        <w:spacing w:after="60"/>
+      </w:pPr>
+      <w:r>
+        <w:rPr>
+          <w:rFonts w:ascii="Calibri" w:cs="Calibri" w:eastAsia="Microsoft YaHei" w:hAnsi="Calibri"/>
+        </w:rPr>
+        <w:t xml:space="preserve">做 50 条校准练习：用 Excel 或 WPS 打开练习表，独立完成，每条选 Include / Maybe / Exclude，Exclude 要选 E1–E6 里的一条。做完把文件交给舒俊，由 Claude 对照第一轮校准的结果，列出不一致的记录，再一起讨论指南哪里没写清楚。协议没有规定一致率阈值，只报告数字。这 50 条在正式筛选里照样要筛一遍。</w:t>
+      </w:r>
+    </w:p>
+    <w:p>
+      <w:pPr>
+        <w:pStyle w:val="ListParagraph"/>
+        <w:numPr>
+          <w:ilvl w:val="0"/>
+          <w:numId w:val="8"/>
+        </w:numPr>
+        <w:spacing w:after="60"/>
+      </w:pPr>
+      <w:r>
+        <w:rPr>
+          <w:rFonts w:ascii="Calibri" w:cs="Calibri" w:eastAsia="Microsoft YaHei" w:hAnsi="Calibri"/>
+        </w:rPr>
+        <w:t xml:space="preserve">第一次登录新项目后确认：Blind Mode 是 ON；作者和期刊隐藏；浏览器翻译关闭；页面是英文。</w:t>
+      </w:r>
+    </w:p>
+    <w:p>
+      <w:pPr>
+        <w:spacing w:after="120"/>
+      </w:pPr>
+      <w:r>
+        <w:rPr>
+          <w:rFonts w:ascii="Calibri" w:cs="Calibri" w:eastAsia="Microsoft YaHei" w:hAnsi="Calibri"/>
+          <w:b/>
+          <w:bCs/>
+        </w:rPr>
+        <w:t xml:space="preserve">筛选时的规则（对所有筛选员相同）：</w:t>
+      </w:r>
+    </w:p>
+    <w:p>
+      <w:pPr>
+        <w:pStyle w:val="ListParagraph"/>
+        <w:numPr>
+          <w:ilvl w:val="0"/>
+          <w:numId w:val="9"/>
+        </w:numPr>
+        <w:spacing w:after="60"/>
+      </w:pPr>
+      <w:r>
+        <w:rPr>
+          <w:rFonts w:ascii="Calibri" w:cs="Calibri" w:eastAsia="Microsoft YaHei" w:hAnsi="Calibri"/>
+        </w:rPr>
+        <w:t xml:space="preserve">2,548 条全部</w:t>
       </w:r>
       <w:r>
         <w:rPr>
@@ -6834,15 +6942,15 @@
         <w:rPr>
           <w:rFonts w:ascii="Calibri" w:cs="Calibri" w:eastAsia="Microsoft YaHei" w:hAnsi="Calibri"/>
         </w:rPr>
-        <w:t xml:space="preserve">后决定。不使用任何 AI（第 3 节），也不让别人或别的程序代为点击。</w:t>
-      </w:r>
-    </w:p>
-    <w:p>
-      <w:pPr>
-        <w:pStyle w:val="ListParagraph"/>
-        <w:numPr>
-          <w:ilvl w:val="0"/>
-          <w:numId w:val="8"/>
+        <w:t xml:space="preserve">后决定，每条单独点击。不使用任何 AI（第 3 节），不使用宏、脚本、自动点击或浏览器插件，也不让别人代为点击。</w:t>
+      </w:r>
+    </w:p>
+    <w:p>
+      <w:pPr>
+        <w:pStyle w:val="ListParagraph"/>
+        <w:numPr>
+          <w:ilvl w:val="0"/>
+          <w:numId w:val="9"/>
         </w:numPr>
         <w:spacing w:after="60"/>
       </w:pPr>
@@ -6858,23 +6966,23 @@
         <w:rPr>
           <w:rFonts w:ascii="Calibri" w:cs="Calibri" w:eastAsia="Microsoft YaHei" w:hAnsi="Calibri"/>
         </w:rPr>
-        <w:t xml:space="preserve">：不全选，不多选后一次性 Exclude 或打标签；每条记录单独决定。</w:t>
-      </w:r>
-    </w:p>
-    <w:p>
-      <w:pPr>
-        <w:pStyle w:val="ListParagraph"/>
-        <w:numPr>
-          <w:ilvl w:val="0"/>
-          <w:numId w:val="8"/>
-        </w:numPr>
-        <w:spacing w:after="60"/>
-      </w:pPr>
-      <w:r>
-        <w:rPr>
-          <w:rFonts w:ascii="Calibri" w:cs="Calibri" w:eastAsia="Microsoft YaHei" w:hAnsi="Calibri"/>
-        </w:rPr>
-        <w:t xml:space="preserve">每个 Exclude 都选 E1–E6 里适用的一条；说不出是哪一条就选 Maybe。</w:t>
+        <w:t xml:space="preserve">：不全选，不多选后一次性 Exclude 或打标签。</w:t>
+      </w:r>
+    </w:p>
+    <w:p>
+      <w:pPr>
+        <w:pStyle w:val="ListParagraph"/>
+        <w:numPr>
+          <w:ilvl w:val="0"/>
+          <w:numId w:val="9"/>
+        </w:numPr>
+        <w:spacing w:after="60"/>
+      </w:pPr>
+      <w:r>
+        <w:rPr>
+          <w:rFonts w:ascii="Calibri" w:cs="Calibri" w:eastAsia="Microsoft YaHei" w:hAnsi="Calibri"/>
+        </w:rPr>
+        <w:t xml:space="preserve">每个 Exclude 都选 E1–E6 里适用的一条；说不出就选 Maybe。</w:t>
       </w:r>
       <w:r>
         <w:rPr>
@@ -6888,15 +6996,15 @@
         <w:rPr>
           <w:rFonts w:ascii="Calibri" w:cs="Calibri" w:eastAsia="Microsoft YaHei" w:hAnsi="Calibri"/>
         </w:rPr>
-        <w:t xml:space="preserve"> 重筛项目里这些理由还不存在，遇到确实适用的记录时再建，名称一字不差（第 3、5 节）。</w:t>
-      </w:r>
-    </w:p>
-    <w:p>
-      <w:pPr>
-        <w:pStyle w:val="ListParagraph"/>
-        <w:numPr>
-          <w:ilvl w:val="0"/>
-          <w:numId w:val="8"/>
+        <w:t xml:space="preserve"> 新项目里这些理由还不存在，遇到确实适用的记录时再建，名称一字不差（第 3、5 节）。</w:t>
+      </w:r>
+    </w:p>
+    <w:p>
+      <w:pPr>
+        <w:pStyle w:val="ListParagraph"/>
+        <w:numPr>
+          <w:ilvl w:val="0"/>
+          <w:numId w:val="9"/>
         </w:numPr>
         <w:spacing w:after="60"/>
       </w:pPr>
@@ -6942,23 +7050,23 @@
         <w:pStyle w:val="ListParagraph"/>
         <w:numPr>
           <w:ilvl w:val="0"/>
-          <w:numId w:val="8"/>
-        </w:numPr>
-        <w:spacing w:after="60"/>
-      </w:pPr>
-      <w:r>
-        <w:rPr>
-          <w:rFonts w:ascii="Calibri" w:cs="Calibri" w:eastAsia="Microsoft YaHei" w:hAnsi="Calibri"/>
-        </w:rPr>
-        <w:t xml:space="preserve">判断规则就是第 4 节，没有改动。</w:t>
-      </w:r>
-    </w:p>
-    <w:p>
-      <w:pPr>
-        <w:pStyle w:val="ListParagraph"/>
-        <w:numPr>
-          <w:ilvl w:val="0"/>
-          <w:numId w:val="8"/>
+          <w:numId w:val="9"/>
+        </w:numPr>
+        <w:spacing w:after="60"/>
+      </w:pPr>
+      <w:r>
+        <w:rPr>
+          <w:rFonts w:ascii="Calibri" w:cs="Calibri" w:eastAsia="Microsoft YaHei" w:hAnsi="Calibri"/>
+        </w:rPr>
+        <w:t xml:space="preserve">判断规则就是第 4 节。</w:t>
+      </w:r>
+    </w:p>
+    <w:p>
+      <w:pPr>
+        <w:pStyle w:val="ListParagraph"/>
+        <w:numPr>
+          <w:ilvl w:val="0"/>
+          <w:numId w:val="9"/>
         </w:numPr>
         <w:spacing w:after="60"/>
       </w:pPr>
@@ -6974,7 +7082,7 @@
         <w:pStyle w:val="ListParagraph"/>
         <w:numPr>
           <w:ilvl w:val="0"/>
-          <w:numId w:val="8"/>
+          <w:numId w:val="9"/>
         </w:numPr>
         <w:spacing w:after="60"/>
       </w:pPr>
@@ -6990,15 +7098,15 @@
         <w:rPr>
           <w:rFonts w:ascii="Calibri" w:cs="Calibri" w:eastAsia="Microsoft YaHei" w:hAnsi="Calibri"/>
         </w:rPr>
-        <w:t xml:space="preserve">：每次开始和结束的日期时间，以及这一次筛了第几条到第几条（下表）。</w:t>
-      </w:r>
-    </w:p>
-    <w:p>
-      <w:pPr>
-        <w:pStyle w:val="ListParagraph"/>
-        <w:numPr>
-          <w:ilvl w:val="0"/>
-          <w:numId w:val="8"/>
+        <w:t xml:space="preserve">：每次开始和结束的日期时间，以及这一次筛了第几条到第几条（下表）。按每条 10–15 秒估计，全部约 7–10 小时，可以分多天做，累了就停。</w:t>
+      </w:r>
+    </w:p>
+    <w:p>
+      <w:pPr>
+        <w:pStyle w:val="ListParagraph"/>
+        <w:numPr>
+          <w:ilvl w:val="0"/>
+          <w:numId w:val="9"/>
         </w:numPr>
         <w:spacing w:after="60"/>
       </w:pPr>
@@ -7020,15 +7128,15 @@
         <w:rPr>
           <w:rFonts w:ascii="Calibri" w:cs="Calibri" w:eastAsia="Microsoft YaHei" w:hAnsi="Calibri"/>
         </w:rPr>
-        <w:t xml:space="preserve">先停下，通知舒俊导出（第 3 节的方法）。Claude 检查速度、批量操作和标签使用情况，没有问题再继续。这只是过程检查：不看和舒俊的逐条一致性，也不会把逐条一致性反馈给彭飞。</w:t>
-      </w:r>
-    </w:p>
-    <w:p>
-      <w:pPr>
-        <w:pStyle w:val="ListParagraph"/>
-        <w:numPr>
-          <w:ilvl w:val="0"/>
-          <w:numId w:val="8"/>
+        <w:t xml:space="preserve">先停下，通知舒俊导出（第 3 节的方法）。Claude 检查速度、批量操作和标签使用情况，没有问题再继续。这个检查对所有筛选员都做，舒俊的数据同样检查过。它不看和别人的逐条一致性，也不会把逐条一致性反馈给筛选员。</w:t>
+      </w:r>
+    </w:p>
+    <w:p>
+      <w:pPr>
+        <w:pStyle w:val="ListParagraph"/>
+        <w:numPr>
+          <w:ilvl w:val="0"/>
+          <w:numId w:val="9"/>
         </w:numPr>
         <w:spacing w:after="60"/>
       </w:pPr>
@@ -7044,7 +7152,7 @@
           <w:b/>
           <w:bCs/>
         </w:rPr>
-        <w:t xml:space="preserve">不要和舒俊讨论具体记录的决定，也不要去看舒俊的决定。</w:t>
+        <w:t xml:space="preserve">不要和舒俊或其他人讨论具体记录的决定，也不要去看别人的决定。</w:t>
       </w:r>
     </w:p>
     <w:tbl>
@@ -7611,7 +7719,7 @@
           <w:b/>
           <w:bCs/>
         </w:rPr>
-        <w:t xml:space="preserve">第一轮结果和重筛结果怎么比较（以下规则在任何重筛决定出现之前就已确定）：</w:t>
+        <w:t xml:space="preserve">两位筛选员的结果怎么比较（以下规则在雷海燕的任何决定出现之前就已确定）：</w:t>
       </w:r>
     </w:p>
     <w:p>
@@ -7627,7 +7735,7 @@
         <w:rPr>
           <w:rFonts w:ascii="Calibri" w:cs="Calibri" w:eastAsia="Microsoft YaHei" w:hAnsi="Calibri"/>
         </w:rPr>
-        <w:t xml:space="preserve">比较舒俊在旧的正式项目里的决定（已锁定，不改）和彭飞在重筛项目里的决定，按 WS 编号对应，由脚本完成（</w:t>
+        <w:t xml:space="preserve">比较舒俊在旧的正式项目里的决定（已锁定，不改）和雷海燕在新项目里的决定，按 WS 编号对应，由脚本完成（</w:t>
       </w:r>
       <w:r>
         <w:rPr>
@@ -7642,53 +7750,7 @@
         <w:rPr>
           <w:rFonts w:ascii="Calibri" w:cs="Calibri" w:eastAsia="Microsoft YaHei" w:hAnsi="Calibri"/>
         </w:rPr>
-        <w:t xml:space="preserve">）。</w:t>
-      </w:r>
-    </w:p>
-    <w:p>
-      <w:pPr>
-        <w:pStyle w:val="ListParagraph"/>
-        <w:numPr>
-          <w:ilvl w:val="0"/>
-          <w:numId w:val="2"/>
-        </w:numPr>
-        <w:spacing w:after="60"/>
-      </w:pPr>
-      <w:r>
-        <w:rPr>
-          <w:rFonts w:ascii="Calibri" w:cs="Calibri" w:eastAsia="Microsoft YaHei" w:hAnsi="Calibri"/>
-        </w:rPr>
-        <w:t xml:space="preserve">舒俊原来没有选任何排除理由的 310 条 Exclude，按第 3 节的规则（Exclude 必须有理由，否则选 Maybe）在比较中当作 Maybe 处理；他原来的记录本身不改，同时并列报告按原记录比较的结果。</w:t>
-      </w:r>
-    </w:p>
-    <w:p>
-      <w:pPr>
-        <w:pStyle w:val="ListParagraph"/>
-        <w:numPr>
-          <w:ilvl w:val="0"/>
-          <w:numId w:val="2"/>
-        </w:numPr>
-        <w:spacing w:after="60"/>
-      </w:pPr>
-      <w:r>
-        <w:rPr>
-          <w:rFonts w:ascii="Calibri" w:cs="Calibri" w:eastAsia="Microsoft YaHei" w:hAnsi="Calibri"/>
-        </w:rPr>
-        <w:t xml:space="preserve">一人 Exclude、另一人 Include 或 Maybe 的分歧，不先讨论，由杨军在</w:t>
-      </w:r>
-      <w:r>
-        <w:rPr>
-          <w:rFonts w:ascii="Calibri" w:cs="Calibri" w:eastAsia="Microsoft YaHei" w:hAnsi="Calibri"/>
-          <w:b/>
-          <w:bCs/>
-        </w:rPr>
-        <w:t xml:space="preserve">不知道两人决定</w:t>
-      </w:r>
-      <w:r>
-        <w:rPr>
-          <w:rFonts w:ascii="Calibri" w:cs="Calibri" w:eastAsia="Microsoft YaHei" w:hAnsi="Calibri"/>
-        </w:rPr>
-        <w:t xml:space="preserve">的情况下盲评。盲评清单还会加入看起来相关但两人都排除的记录，以及一个随机质控样本（设计见 </w:t>
+        <w:t xml:space="preserve">，用 </w:t>
       </w:r>
       <w:r>
         <w:rPr>
@@ -7697,13 +7759,74 @@
           <w:szCs w:val="19"/>
           <w:shd w:fill="EEEEEE" w:val="clear"/>
         </w:rPr>
+        <w:t xml:space="preserve">--name</w:t>
+      </w:r>
+      <w:r>
+        <w:rPr>
+          <w:rFonts w:ascii="Calibri" w:cs="Calibri" w:eastAsia="Microsoft YaHei" w:hAnsi="Calibri"/>
+        </w:rPr>
+        <w:t xml:space="preserve"> 给出她在 Rayyan 里显示的名字）。</w:t>
+      </w:r>
+    </w:p>
+    <w:p>
+      <w:pPr>
+        <w:pStyle w:val="ListParagraph"/>
+        <w:numPr>
+          <w:ilvl w:val="0"/>
+          <w:numId w:val="2"/>
+        </w:numPr>
+        <w:spacing w:after="60"/>
+      </w:pPr>
+      <w:r>
+        <w:rPr>
+          <w:rFonts w:ascii="Calibri" w:cs="Calibri" w:eastAsia="Microsoft YaHei" w:hAnsi="Calibri"/>
+        </w:rPr>
+        <w:t xml:space="preserve">舒俊原来没有选任何排除理由的 310 条 Exclude，按第 3 节的规则（Exclude 必须有理由，否则选 Maybe）在比较中当作 Maybe 处理，这是舒俊 2026 年 10 月 16 日批准的规则；他原来的记录本身不改，同时并列报告按原记录比较的结果。</w:t>
+      </w:r>
+    </w:p>
+    <w:p>
+      <w:pPr>
+        <w:pStyle w:val="ListParagraph"/>
+        <w:numPr>
+          <w:ilvl w:val="0"/>
+          <w:numId w:val="2"/>
+        </w:numPr>
+        <w:spacing w:after="60"/>
+      </w:pPr>
+      <w:r>
+        <w:rPr>
+          <w:rFonts w:ascii="Calibri" w:cs="Calibri" w:eastAsia="Microsoft YaHei" w:hAnsi="Calibri"/>
+        </w:rPr>
+        <w:t xml:space="preserve">一人 Exclude、另一人 Include 或 Maybe 的分歧，不先讨论，由杨军在</w:t>
+      </w:r>
+      <w:r>
+        <w:rPr>
+          <w:rFonts w:ascii="Calibri" w:cs="Calibri" w:eastAsia="Microsoft YaHei" w:hAnsi="Calibri"/>
+          <w:b/>
+          <w:bCs/>
+        </w:rPr>
+        <w:t xml:space="preserve">不知道两人决定</w:t>
+      </w:r>
+      <w:r>
+        <w:rPr>
+          <w:rFonts w:ascii="Calibri" w:cs="Calibri" w:eastAsia="Microsoft YaHei" w:hAnsi="Calibri"/>
+        </w:rPr>
+        <w:t xml:space="preserve">的情况下盲评。盲评清单还会加入看起来相关但两人都排除的记录，以及一个随机质控样本（设计见 </w:t>
+      </w:r>
+      <w:r>
+        <w:rPr>
+          <w:rFonts w:ascii="Consolas" w:cs="Consolas" w:eastAsia="Microsoft YaHei" w:hAnsi="Consolas"/>
+          <w:sz w:val="19"/>
+          <w:szCs w:val="19"/>
+          <w:shd w:fill="EEEEEE" w:val="clear"/>
+        </w:rPr>
         <w:t xml:space="preserve">search/screening/formal/blind_adjudication_design.txt</w:t>
       </w:r>
       <w:r>
         <w:rPr>
           <w:rFonts w:ascii="Calibri" w:cs="Calibri" w:eastAsia="Microsoft YaHei" w:hAnsi="Calibri"/>
         </w:rPr>
-        <w:t xml:space="preserve">；重筛完成后按新的比较结果重新生成）。</w:t>
+        <w:t xml:space="preserve">；两人都筛完后按新的比较结果重新生成）。</w:t>
       </w:r>
     </w:p>
     <w:p>
@@ -7719,7 +7842,7 @@
         <w:rPr>
           <w:rFonts w:ascii="Calibri" w:cs="Calibri" w:eastAsia="Microsoft YaHei" w:hAnsi="Calibri"/>
         </w:rPr>
-        <w:t xml:space="preserve">彭飞第一轮借助 AI 做出的决定单独保存，不用于最终名单。过程事实（速度、批量操作、标签、日期）会写进方法部分和 PROSPERO 修订。</w:t>
+        <w:t xml:space="preserve">此前第二位筛选员的决定单独保存，不用于最终名单。过程事实（速度、批量操作、标签、日期）会写进方法部分和 PROSPERO 修订。</w:t>
       </w:r>
     </w:p>
     <w:sectPr>
@@ -7787,7 +7910,7 @@
         <w:sz w:val="17"/>
         <w:szCs w:val="17"/>
       </w:rPr>
-      <w:t xml:space="preserve">筛选指南 v2026-10-17a   |   第 </w:t>
+      <w:t xml:space="preserve">筛选指南 v2026-10-17b   |   第 </w:t>
     </w:r>
     <w:r>
       <w:rPr>
@@ -8022,6 +8145,12 @@
     </w:lvlOverride>
   </w:num>
   <w:num w:numId="8">
+    <w:abstractNumId w:val="3"/>
+    <w:lvlOverride w:ilvl="0">
+      <w:startOverride w:val="1"/>
+    </w:lvlOverride>
+  </w:num>
+  <w:num w:numId="9">
     <w:abstractNumId w:val="3"/>
     <w:lvlOverride w:ilvl="0">
       <w:startOverride w:val="1"/>

</xml_diff>